<commit_message>
Lots of minor changes... User guides updates
</commit_message>
<xml_diff>
--- a/Hot Pursuit/Docs/Hot Pursuit Description.docx
+++ b/Hot Pursuit/Docs/Hot Pursuit Description.docx
@@ -1,6 +1,6 @@
 
 <file path=word/document.xml><?xml version="1.0" encoding="utf-8"?>
-<w:document xmlns:wpc="http://schemas.microsoft.com/office/word/2010/wordprocessingCanvas" xmlns:cx="http://schemas.microsoft.com/office/drawing/2014/chartex" xmlns:cx1="http://schemas.microsoft.com/office/drawing/2015/9/8/chartex" xmlns:cx2="http://schemas.microsoft.com/office/drawing/2015/10/21/chartex" xmlns:cx3="http://schemas.microsoft.com/office/drawing/2016/5/9/chartex" xmlns:cx4="http://schemas.microsoft.com/office/drawing/2016/5/10/chartex" xmlns:cx5="http://schemas.microsoft.com/office/drawing/2016/5/11/chartex" xmlns:cx6="http://schemas.microsoft.com/office/drawing/2016/5/12/chartex" xmlns:cx7="http://schemas.microsoft.com/office/drawing/2016/5/13/chartex" xmlns:cx8="http://schemas.microsoft.com/office/drawing/2016/5/14/chartex" xmlns:mc="http://schemas.openxmlformats.org/markup-compatibility/2006" xmlns:aink="http://schemas.microsoft.com/office/drawing/2016/ink" xmlns:am3d="http://schemas.microsoft.com/office/drawing/2017/model3d" xmlns:o="urn:schemas-microsoft-com:office:office" xmlns:r="http://schemas.openxmlformats.org/officeDocument/2006/relationships" xmlns:m="http://schemas.openxmlformats.org/officeDocument/2006/math" xmlns:v="urn:schemas-microsoft-com:vml" xmlns:wp14="http://schemas.microsoft.com/office/word/2010/wordprocessingDrawing" xmlns:wp="http://schemas.openxmlformats.org/drawingml/2006/wordprocessingDrawing" xmlns:w10="urn:schemas-microsoft-com:office:word" xmlns:w="http://schemas.openxmlformats.org/wordprocessingml/2006/main" xmlns:w14="http://schemas.microsoft.com/office/word/2010/wordml" xmlns:w15="http://schemas.microsoft.com/office/word/2012/wordml" xmlns:w16cex="http://schemas.microsoft.com/office/word/2018/wordml/cex" xmlns:w16cid="http://schemas.microsoft.com/office/word/2016/wordml/cid" xmlns:w16="http://schemas.microsoft.com/office/word/2018/wordml" xmlns:w16sdtdh="http://schemas.microsoft.com/office/word/2020/wordml/sdtdatahash" xmlns:w16se="http://schemas.microsoft.com/office/word/2015/wordml/symex" xmlns:wpg="http://schemas.microsoft.com/office/word/2010/wordprocessingGroup" xmlns:wpi="http://schemas.microsoft.com/office/word/2010/wordprocessingInk" xmlns:wne="http://schemas.microsoft.com/office/word/2006/wordml" xmlns:wps="http://schemas.microsoft.com/office/word/2010/wordprocessingShape" mc:Ignorable="w14 w15 w16se w16cid w16 w16cex w16sdtdh wp14">
+<w:document xmlns:wpc="http://schemas.microsoft.com/office/word/2010/wordprocessingCanvas" xmlns:cx="http://schemas.microsoft.com/office/drawing/2014/chartex" xmlns:cx1="http://schemas.microsoft.com/office/drawing/2015/9/8/chartex" xmlns:cx2="http://schemas.microsoft.com/office/drawing/2015/10/21/chartex" xmlns:cx3="http://schemas.microsoft.com/office/drawing/2016/5/9/chartex" xmlns:cx4="http://schemas.microsoft.com/office/drawing/2016/5/10/chartex" xmlns:cx5="http://schemas.microsoft.com/office/drawing/2016/5/11/chartex" xmlns:cx6="http://schemas.microsoft.com/office/drawing/2016/5/12/chartex" xmlns:cx7="http://schemas.microsoft.com/office/drawing/2016/5/13/chartex" xmlns:cx8="http://schemas.microsoft.com/office/drawing/2016/5/14/chartex" xmlns:mc="http://schemas.openxmlformats.org/markup-compatibility/2006" xmlns:aink="http://schemas.microsoft.com/office/drawing/2016/ink" xmlns:am3d="http://schemas.microsoft.com/office/drawing/2017/model3d" xmlns:o="urn:schemas-microsoft-com:office:office" xmlns:oel="http://schemas.microsoft.com/office/2019/extlst" xmlns:r="http://schemas.openxmlformats.org/officeDocument/2006/relationships" xmlns:m="http://schemas.openxmlformats.org/officeDocument/2006/math" xmlns:v="urn:schemas-microsoft-com:vml" xmlns:wp14="http://schemas.microsoft.com/office/word/2010/wordprocessingDrawing" xmlns:wp="http://schemas.openxmlformats.org/drawingml/2006/wordprocessingDrawing" xmlns:w10="urn:schemas-microsoft-com:office:word" xmlns:w="http://schemas.openxmlformats.org/wordprocessingml/2006/main" xmlns:w14="http://schemas.microsoft.com/office/word/2010/wordml" xmlns:w15="http://schemas.microsoft.com/office/word/2012/wordml" xmlns:w16cex="http://schemas.microsoft.com/office/word/2018/wordml/cex" xmlns:w16cid="http://schemas.microsoft.com/office/word/2016/wordml/cid" xmlns:w16="http://schemas.microsoft.com/office/word/2018/wordml" xmlns:w16du="http://schemas.microsoft.com/office/word/2023/wordml/word16du" xmlns:w16sdtdh="http://schemas.microsoft.com/office/word/2020/wordml/sdtdatahash" xmlns:w16sdtfl="http://schemas.microsoft.com/office/word/2024/wordml/sdtformatlock" xmlns:w16se="http://schemas.microsoft.com/office/word/2015/wordml/symex" xmlns:wpg="http://schemas.microsoft.com/office/word/2010/wordprocessingGroup" xmlns:wpi="http://schemas.microsoft.com/office/word/2010/wordprocessingInk" xmlns:wne="http://schemas.microsoft.com/office/word/2006/wordml" xmlns:wps="http://schemas.microsoft.com/office/word/2010/wordprocessingShape" mc:Ignorable="w14 w15 w16se w16cid w16 w16cex w16sdtdh w16sdtfl w16du wp14">
   <w:body>
     <w:p>
       <w:pPr>
@@ -100,7 +100,7 @@
           <w:sz w:val="20"/>
           <w:szCs w:val="20"/>
         </w:rPr>
-        <w:t xml:space="preserve">I’m thinking we should have a category called “101 Fun Things </w:t>
+        <w:t xml:space="preserve">Today, </w:t>
       </w:r>
       <w:proofErr w:type="gramStart"/>
       <w:r>
@@ -110,7 +110,7 @@
           <w:sz w:val="20"/>
           <w:szCs w:val="20"/>
         </w:rPr>
-        <w:t>To</w:t>
+        <w:t>most of</w:t>
       </w:r>
       <w:proofErr w:type="gramEnd"/>
       <w:r>
@@ -120,27 +120,7 @@
           <w:sz w:val="20"/>
           <w:szCs w:val="20"/>
         </w:rPr>
-        <w:t xml:space="preserve"> Do With </w:t>
-      </w:r>
-      <w:proofErr w:type="spellStart"/>
-      <w:r>
-        <w:rPr>
-          <w:rFonts w:ascii="Arial" w:hAnsi="Arial" w:cs="Arial"/>
-          <w:bCs/>
-          <w:sz w:val="20"/>
-          <w:szCs w:val="20"/>
-        </w:rPr>
-        <w:t>TheSky</w:t>
-      </w:r>
-      <w:proofErr w:type="spellEnd"/>
-      <w:r>
-        <w:rPr>
-          <w:rFonts w:ascii="Arial" w:hAnsi="Arial" w:cs="Arial"/>
-          <w:bCs/>
-          <w:sz w:val="20"/>
-          <w:szCs w:val="20"/>
-        </w:rPr>
-        <w:t xml:space="preserve">.  This little application mostly falls under that moniker.  As most of us know, a couple of hundred good sized rocks are discovered whizzing by the earth every year.  Today, most of these </w:t>
+        <w:t xml:space="preserve"> </w:t>
       </w:r>
       <w:proofErr w:type="gramStart"/>
       <w:r>
@@ -160,7 +140,7 @@
           <w:sz w:val="20"/>
           <w:szCs w:val="20"/>
         </w:rPr>
-        <w:t xml:space="preserve"> Objects (NEO’s) are identified by well-funded, organized projects, but a few are still by amateurs, here and there.  However once spotted, each reported fly-by goes through a phase where it must be </w:t>
+        <w:t xml:space="preserve"> Objects (NEO’s) are identified by well-funded, organized projects, but a few are still by amateurs, here and there.  </w:t>
       </w:r>
       <w:proofErr w:type="gramStart"/>
       <w:r>
@@ -170,6 +150,26 @@
           <w:sz w:val="20"/>
           <w:szCs w:val="20"/>
         </w:rPr>
+        <w:t>However</w:t>
+      </w:r>
+      <w:proofErr w:type="gramEnd"/>
+      <w:r>
+        <w:rPr>
+          <w:rFonts w:ascii="Arial" w:hAnsi="Arial" w:cs="Arial"/>
+          <w:bCs/>
+          <w:sz w:val="20"/>
+          <w:szCs w:val="20"/>
+        </w:rPr>
+        <w:t xml:space="preserve"> once spotted, each reported fly-by goes through a phase where it must be </w:t>
+      </w:r>
+      <w:proofErr w:type="gramStart"/>
+      <w:r>
+        <w:rPr>
+          <w:rFonts w:ascii="Arial" w:hAnsi="Arial" w:cs="Arial"/>
+          <w:bCs/>
+          <w:sz w:val="20"/>
+          <w:szCs w:val="20"/>
+        </w:rPr>
         <w:t>confirmed</w:t>
       </w:r>
       <w:proofErr w:type="gramEnd"/>
@@ -180,7 +180,25 @@
           <w:sz w:val="20"/>
           <w:szCs w:val="20"/>
         </w:rPr>
-        <w:t xml:space="preserve"> and a precise orbit determined through multiple, independent measurements.  During its time in purgatory, a NEO is listed on a NASA website called “Scout”.  Once confirmed (by somebody, at some point, I guess) the object moves </w:t>
+        <w:t xml:space="preserve"> and a precise orbit determined through multiple, independent measurements.  </w:t>
+      </w:r>
+      <w:r>
+        <w:rPr>
+          <w:rFonts w:ascii="Arial" w:hAnsi="Arial" w:cs="Arial"/>
+          <w:bCs/>
+          <w:sz w:val="20"/>
+          <w:szCs w:val="20"/>
+        </w:rPr>
+        <w:t>Prior to confirmation</w:t>
+      </w:r>
+      <w:r>
+        <w:rPr>
+          <w:rFonts w:ascii="Arial" w:hAnsi="Arial" w:cs="Arial"/>
+          <w:bCs/>
+          <w:sz w:val="20"/>
+          <w:szCs w:val="20"/>
+        </w:rPr>
+        <w:t xml:space="preserve">, a NEO is listed on a NASA website called “Scout”.  Once confirmed the object moves </w:t>
       </w:r>
       <w:proofErr w:type="gramStart"/>
       <w:r>
@@ -200,7 +218,47 @@
           <w:sz w:val="20"/>
           <w:szCs w:val="20"/>
         </w:rPr>
-        <w:t xml:space="preserve"> Scout and into the IAU Minor Planet Center database.  But, for a time, one has a chance for a look at the equivalent of an astronomical UFO.  That’s where this little app comes in.</w:t>
+        <w:t xml:space="preserve"> Scout and into the IAU Minor Planet Center database.  But, for a time, one has a chance </w:t>
+      </w:r>
+      <w:proofErr w:type="gramStart"/>
+      <w:r>
+        <w:rPr>
+          <w:rFonts w:ascii="Arial" w:hAnsi="Arial" w:cs="Arial"/>
+          <w:bCs/>
+          <w:sz w:val="20"/>
+          <w:szCs w:val="20"/>
+        </w:rPr>
+        <w:t>for</w:t>
+      </w:r>
+      <w:proofErr w:type="gramEnd"/>
+      <w:r>
+        <w:rPr>
+          <w:rFonts w:ascii="Arial" w:hAnsi="Arial" w:cs="Arial"/>
+          <w:bCs/>
+          <w:sz w:val="20"/>
+          <w:szCs w:val="20"/>
+        </w:rPr>
+        <w:t xml:space="preserve"> </w:t>
+      </w:r>
+      <w:proofErr w:type="gramStart"/>
+      <w:r>
+        <w:rPr>
+          <w:rFonts w:ascii="Arial" w:hAnsi="Arial" w:cs="Arial"/>
+          <w:bCs/>
+          <w:sz w:val="20"/>
+          <w:szCs w:val="20"/>
+        </w:rPr>
+        <w:t>a look</w:t>
+      </w:r>
+      <w:proofErr w:type="gramEnd"/>
+      <w:r>
+        <w:rPr>
+          <w:rFonts w:ascii="Arial" w:hAnsi="Arial" w:cs="Arial"/>
+          <w:bCs/>
+          <w:sz w:val="20"/>
+          <w:szCs w:val="20"/>
+        </w:rPr>
+        <w:t xml:space="preserve"> at the equivalent of an astronomical UFO.  That’s where this little app comes in.</w:t>
       </w:r>
     </w:p>
     <w:p>
@@ -257,7 +315,7 @@
           <w:sz w:val="20"/>
           <w:szCs w:val="20"/>
         </w:rPr>
-        <w:t xml:space="preserve"> app called Transient Search.  Transient Search enables a user to load the current Scout unconfirmed object list into TSX as a SDB catalog in about three clicks.  (This too falls under the category of “101 Fun Things...”).  Once loaded a user can pick a target and run Hot Pursuit whose sole job is to keep the mount pointed at that target.  The reason it’s tricky is that these NEO’s move across the sky at a pace and direction somewhere between a satellite and a planet.  At any given time, their apparent movement is anywhere between less than one to over a couple of </w:t>
+        <w:t xml:space="preserve"> app called Transient Search.  Transient Search enables a user to load the current Scout unconfirmed object list into TSX as a SDB Once loaded a user can pick a target and run Hot Pursuit whose sole job is to keep the mount pointed at that target.  The reason it’s tricky is that NEO’s move across the sky at a pace and direction somewhere between a satellite and a planet.  At any given time, their apparent movement is anywhere between less than one to over a couple of </w:t>
       </w:r>
       <w:r>
         <w:rPr>
@@ -536,25 +594,16 @@
           <w:sz w:val="20"/>
           <w:szCs w:val="20"/>
         </w:rPr>
-        <w:t>controller just</w:t>
-      </w:r>
-      <w:r>
-        <w:rPr>
-          <w:rFonts w:ascii="Arial" w:hAnsi="Arial" w:cs="Arial"/>
-          <w:bCs/>
-          <w:sz w:val="20"/>
-          <w:szCs w:val="20"/>
-        </w:rPr>
-        <w:t xml:space="preserve"> for </w:t>
-      </w:r>
-      <w:r>
-        <w:rPr>
-          <w:rFonts w:ascii="Arial" w:hAnsi="Arial" w:cs="Arial"/>
-          <w:bCs/>
-          <w:sz w:val="20"/>
-          <w:szCs w:val="20"/>
-        </w:rPr>
-        <w:t>the inherently lazy like myself.</w:t>
+        <w:t>controller</w:t>
+      </w:r>
+      <w:r>
+        <w:rPr>
+          <w:rFonts w:ascii="Arial" w:hAnsi="Arial" w:cs="Arial"/>
+          <w:bCs/>
+          <w:sz w:val="20"/>
+          <w:szCs w:val="20"/>
+        </w:rPr>
+        <w:t>.</w:t>
       </w:r>
     </w:p>
     <w:p>
@@ -855,7 +904,27 @@
           <w:sz w:val="20"/>
           <w:szCs w:val="20"/>
         </w:rPr>
-        <w:t xml:space="preserve">Small Solar System Body database, or </w:t>
+        <w:t xml:space="preserve">Small Solar System Body </w:t>
+      </w:r>
+      <w:proofErr w:type="gramStart"/>
+      <w:r>
+        <w:rPr>
+          <w:rFonts w:ascii="Arial" w:hAnsi="Arial" w:cs="Arial"/>
+          <w:bCs/>
+          <w:sz w:val="20"/>
+          <w:szCs w:val="20"/>
+        </w:rPr>
+        <w:t>database, or</w:t>
+      </w:r>
+      <w:proofErr w:type="gramEnd"/>
+      <w:r>
+        <w:rPr>
+          <w:rFonts w:ascii="Arial" w:hAnsi="Arial" w:cs="Arial"/>
+          <w:bCs/>
+          <w:sz w:val="20"/>
+          <w:szCs w:val="20"/>
+        </w:rPr>
+        <w:t xml:space="preserve"> </w:t>
       </w:r>
       <w:r>
         <w:rPr>
@@ -1033,6 +1102,140 @@
           <w:szCs w:val="20"/>
         </w:rPr>
       </w:pPr>
+      <w:r>
+        <w:rPr>
+          <w:rFonts w:ascii="Arial" w:hAnsi="Arial" w:cs="Arial"/>
+          <w:bCs/>
+          <w:sz w:val="20"/>
+          <w:szCs w:val="20"/>
+        </w:rPr>
+        <w:t xml:space="preserve">Of recent vintage </w:t>
+      </w:r>
+      <w:proofErr w:type="gramStart"/>
+      <w:r>
+        <w:rPr>
+          <w:rFonts w:ascii="Arial" w:hAnsi="Arial" w:cs="Arial"/>
+          <w:bCs/>
+          <w:sz w:val="20"/>
+          <w:szCs w:val="20"/>
+        </w:rPr>
+        <w:t>is</w:t>
+      </w:r>
+      <w:proofErr w:type="gramEnd"/>
+      <w:r>
+        <w:rPr>
+          <w:rFonts w:ascii="Arial" w:hAnsi="Arial" w:cs="Arial"/>
+          <w:bCs/>
+          <w:sz w:val="20"/>
+          <w:szCs w:val="20"/>
+        </w:rPr>
+        <w:t xml:space="preserve"> the </w:t>
+      </w:r>
+      <w:proofErr w:type="gramStart"/>
+      <w:r>
+        <w:rPr>
+          <w:rFonts w:ascii="Arial" w:hAnsi="Arial" w:cs="Arial"/>
+          <w:bCs/>
+          <w:sz w:val="20"/>
+          <w:szCs w:val="20"/>
+        </w:rPr>
+        <w:t xml:space="preserve">Plot </w:t>
+      </w:r>
+      <w:r>
+        <w:rPr>
+          <w:rFonts w:ascii="Arial" w:hAnsi="Arial" w:cs="Arial"/>
+          <w:bCs/>
+          <w:sz w:val="20"/>
+          <w:szCs w:val="20"/>
+        </w:rPr>
+        <w:t>feature</w:t>
+      </w:r>
+      <w:proofErr w:type="gramEnd"/>
+      <w:r>
+        <w:rPr>
+          <w:rFonts w:ascii="Arial" w:hAnsi="Arial" w:cs="Arial"/>
+          <w:bCs/>
+          <w:sz w:val="20"/>
+          <w:szCs w:val="20"/>
+        </w:rPr>
+        <w:t xml:space="preserve">.  Using Plot creates a </w:t>
+      </w:r>
+      <w:r>
+        <w:rPr>
+          <w:rFonts w:ascii="Arial" w:hAnsi="Arial" w:cs="Arial"/>
+          <w:bCs/>
+          <w:sz w:val="20"/>
+          <w:szCs w:val="20"/>
+        </w:rPr>
+        <w:t xml:space="preserve">dataset that is loaded to the clipboard for input to TSX.  This dataset </w:t>
+      </w:r>
+      <w:r>
+        <w:rPr>
+          <w:rFonts w:ascii="Arial" w:hAnsi="Arial" w:cs="Arial"/>
+          <w:bCs/>
+          <w:sz w:val="20"/>
+          <w:szCs w:val="20"/>
+        </w:rPr>
+        <w:t xml:space="preserve">tells TSX to plot the position of the selected target </w:t>
+      </w:r>
+      <w:r>
+        <w:rPr>
+          <w:rFonts w:ascii="Arial" w:hAnsi="Arial" w:cs="Arial"/>
+          <w:bCs/>
+          <w:sz w:val="20"/>
+          <w:szCs w:val="20"/>
+        </w:rPr>
+        <w:t xml:space="preserve">on </w:t>
+      </w:r>
+      <w:proofErr w:type="gramStart"/>
+      <w:r>
+        <w:rPr>
+          <w:rFonts w:ascii="Arial" w:hAnsi="Arial" w:cs="Arial"/>
+          <w:bCs/>
+          <w:sz w:val="20"/>
+          <w:szCs w:val="20"/>
+        </w:rPr>
+        <w:t xml:space="preserve">the </w:t>
+      </w:r>
+      <w:proofErr w:type="spellStart"/>
+      <w:r>
+        <w:rPr>
+          <w:rFonts w:ascii="Arial" w:hAnsi="Arial" w:cs="Arial"/>
+          <w:bCs/>
+          <w:sz w:val="20"/>
+          <w:szCs w:val="20"/>
+        </w:rPr>
+        <w:t>StarChart</w:t>
+      </w:r>
+      <w:proofErr w:type="spellEnd"/>
+      <w:proofErr w:type="gramEnd"/>
+      <w:r>
+        <w:rPr>
+          <w:rFonts w:ascii="Arial" w:hAnsi="Arial" w:cs="Arial"/>
+          <w:bCs/>
+          <w:sz w:val="20"/>
+          <w:szCs w:val="20"/>
+        </w:rPr>
+        <w:t xml:space="preserve"> </w:t>
+      </w:r>
+      <w:r>
+        <w:rPr>
+          <w:rFonts w:ascii="Arial" w:hAnsi="Arial" w:cs="Arial"/>
+          <w:bCs/>
+          <w:sz w:val="20"/>
+          <w:szCs w:val="20"/>
+        </w:rPr>
+        <w:t>over a span of day</w:t>
+      </w:r>
+      <w:r>
+        <w:rPr>
+          <w:rFonts w:ascii="Arial" w:hAnsi="Arial" w:cs="Arial"/>
+          <w:bCs/>
+          <w:sz w:val="20"/>
+          <w:szCs w:val="20"/>
+        </w:rPr>
+        <w:t>(s).</w:t>
+      </w:r>
     </w:p>
     <w:p>
       <w:pPr>
@@ -1044,6 +1247,219 @@
           <w:u w:val="single"/>
         </w:rPr>
       </w:pPr>
+    </w:p>
+    <w:p>
+      <w:pPr>
+        <w:rPr>
+          <w:rFonts w:ascii="Arial" w:hAnsi="Arial" w:cs="Arial"/>
+          <w:b/>
+          <w:sz w:val="24"/>
+          <w:szCs w:val="24"/>
+          <w:u w:val="single"/>
+        </w:rPr>
+      </w:pPr>
+      <w:r>
+        <w:rPr>
+          <w:rFonts w:ascii="Arial" w:hAnsi="Arial" w:cs="Arial"/>
+          <w:b/>
+          <w:sz w:val="24"/>
+          <w:szCs w:val="24"/>
+          <w:u w:val="single"/>
+        </w:rPr>
+        <w:t>Example Workflow</w:t>
+      </w:r>
+    </w:p>
+    <w:p>
+      <w:pPr>
+        <w:ind w:left="720"/>
+        <w:rPr>
+          <w:rFonts w:ascii="Arial" w:hAnsi="Arial" w:cs="Arial"/>
+          <w:bCs/>
+          <w:sz w:val="20"/>
+          <w:szCs w:val="20"/>
+        </w:rPr>
+      </w:pPr>
+      <w:r>
+        <w:rPr>
+          <w:rFonts w:ascii="Arial" w:hAnsi="Arial" w:cs="Arial"/>
+          <w:bCs/>
+          <w:sz w:val="20"/>
+          <w:szCs w:val="20"/>
+        </w:rPr>
+        <w:t>1, Launch TSX.  Optionally clear all the displayed objects to make the NEOs more visible on the star chart.</w:t>
+      </w:r>
+    </w:p>
+    <w:p>
+      <w:pPr>
+        <w:ind w:left="720"/>
+        <w:rPr>
+          <w:rFonts w:ascii="Arial" w:hAnsi="Arial" w:cs="Arial"/>
+          <w:bCs/>
+          <w:sz w:val="20"/>
+          <w:szCs w:val="20"/>
+        </w:rPr>
+      </w:pPr>
+      <w:r>
+        <w:rPr>
+          <w:rFonts w:ascii="Arial" w:hAnsi="Arial" w:cs="Arial"/>
+          <w:bCs/>
+          <w:sz w:val="20"/>
+          <w:szCs w:val="20"/>
+        </w:rPr>
+        <w:t>2. Launch Transient Search.  In the MPC NEO box, select "Scout" and click on "NEO".</w:t>
+      </w:r>
+    </w:p>
+    <w:p>
+      <w:pPr>
+        <w:ind w:left="720"/>
+        <w:rPr>
+          <w:rFonts w:ascii="Arial" w:hAnsi="Arial" w:cs="Arial"/>
+          <w:bCs/>
+          <w:sz w:val="20"/>
+          <w:szCs w:val="20"/>
+        </w:rPr>
+      </w:pPr>
+      <w:r>
+        <w:rPr>
+          <w:rFonts w:ascii="Arial" w:hAnsi="Arial" w:cs="Arial"/>
+          <w:bCs/>
+          <w:sz w:val="20"/>
+          <w:szCs w:val="20"/>
+        </w:rPr>
+        <w:t>3. In TSX, "Edit-&gt;Paste Photo" to create working My Sky Database.</w:t>
+      </w:r>
+    </w:p>
+    <w:p>
+      <w:pPr>
+        <w:ind w:left="720"/>
+        <w:rPr>
+          <w:rFonts w:ascii="Arial" w:hAnsi="Arial" w:cs="Arial"/>
+          <w:bCs/>
+          <w:sz w:val="20"/>
+          <w:szCs w:val="20"/>
+        </w:rPr>
+      </w:pPr>
+      <w:r>
+        <w:rPr>
+          <w:rFonts w:ascii="Arial" w:hAnsi="Arial" w:cs="Arial"/>
+          <w:bCs/>
+          <w:sz w:val="20"/>
+          <w:szCs w:val="20"/>
+        </w:rPr>
+        <w:t>4. In TSX star chart, click on a target NEO.  In Find tab, copy object name.</w:t>
+      </w:r>
+    </w:p>
+    <w:p>
+      <w:pPr>
+        <w:ind w:left="720"/>
+        <w:rPr>
+          <w:rFonts w:ascii="Arial" w:hAnsi="Arial" w:cs="Arial"/>
+          <w:bCs/>
+          <w:sz w:val="20"/>
+          <w:szCs w:val="20"/>
+        </w:rPr>
+      </w:pPr>
+      <w:r>
+        <w:rPr>
+          <w:rFonts w:ascii="Arial" w:hAnsi="Arial" w:cs="Arial"/>
+          <w:bCs/>
+          <w:sz w:val="20"/>
+          <w:szCs w:val="20"/>
+        </w:rPr>
+        <w:t xml:space="preserve">5. Launch Hot Pursuit.  Copy target name into Target box.  Select "Scout" (either bullet or dropdown). </w:t>
+      </w:r>
+    </w:p>
+    <w:p>
+      <w:pPr>
+        <w:ind w:left="720"/>
+        <w:rPr>
+          <w:rFonts w:ascii="Arial" w:hAnsi="Arial" w:cs="Arial"/>
+          <w:bCs/>
+          <w:sz w:val="20"/>
+          <w:szCs w:val="20"/>
+        </w:rPr>
+      </w:pPr>
+      <w:r>
+        <w:rPr>
+          <w:rFonts w:ascii="Arial" w:hAnsi="Arial" w:cs="Arial"/>
+          <w:bCs/>
+          <w:sz w:val="20"/>
+          <w:szCs w:val="20"/>
+        </w:rPr>
+        <w:t>6. Optionally, in Hot Pursuit "Plot" box, click on "Generate SDB", then in TSX "Edit-&gt;Paste Photo" to load track of NEO on start chart.</w:t>
+      </w:r>
+    </w:p>
+    <w:p>
+      <w:pPr>
+        <w:ind w:left="720"/>
+        <w:rPr>
+          <w:rFonts w:ascii="Arial" w:hAnsi="Arial" w:cs="Arial"/>
+          <w:bCs/>
+          <w:sz w:val="20"/>
+          <w:szCs w:val="20"/>
+        </w:rPr>
+      </w:pPr>
+      <w:r>
+        <w:rPr>
+          <w:rFonts w:ascii="Arial" w:hAnsi="Arial" w:cs="Arial"/>
+          <w:bCs/>
+          <w:sz w:val="20"/>
+          <w:szCs w:val="20"/>
+        </w:rPr>
+        <w:t>7. In Hot Pursuit Track box, fill in options and click on "Track" to initiate target tracking.</w:t>
+      </w:r>
+    </w:p>
+    <w:p>
+      <w:pPr>
+        <w:ind w:left="720"/>
+        <w:rPr>
+          <w:rFonts w:ascii="Arial" w:hAnsi="Arial" w:cs="Arial"/>
+          <w:bCs/>
+          <w:sz w:val="20"/>
+          <w:szCs w:val="20"/>
+        </w:rPr>
+      </w:pPr>
+      <w:r>
+        <w:rPr>
+          <w:rFonts w:ascii="Arial" w:hAnsi="Arial" w:cs="Arial"/>
+          <w:bCs/>
+          <w:sz w:val="20"/>
+          <w:szCs w:val="20"/>
+        </w:rPr>
+        <w:t>8. In Hot Pursuit QAD imaging box, configure options and click on "Image" to begin sequencing.</w:t>
+      </w:r>
+    </w:p>
+    <w:p>
+      <w:pPr>
+        <w:ind w:left="720"/>
+        <w:rPr>
+          <w:rFonts w:ascii="Arial" w:hAnsi="Arial" w:cs="Arial"/>
+          <w:bCs/>
+          <w:sz w:val="20"/>
+          <w:szCs w:val="20"/>
+        </w:rPr>
+      </w:pPr>
+    </w:p>
+    <w:p>
+      <w:pPr>
+        <w:rPr>
+          <w:rFonts w:ascii="Arial" w:hAnsi="Arial" w:cs="Arial"/>
+          <w:b/>
+          <w:sz w:val="24"/>
+          <w:szCs w:val="24"/>
+          <w:u w:val="single"/>
+        </w:rPr>
+      </w:pPr>
+      <w:r>
+        <w:rPr>
+          <w:rFonts w:ascii="Arial" w:hAnsi="Arial" w:cs="Arial"/>
+          <w:b/>
+          <w:sz w:val="24"/>
+          <w:szCs w:val="24"/>
+          <w:u w:val="single"/>
+        </w:rPr>
+        <w:t xml:space="preserve">Application </w:t>
+      </w:r>
       <w:r>
         <w:rPr>
           <w:rFonts w:ascii="Arial" w:hAnsi="Arial" w:cs="Arial"/>
@@ -1189,7 +1605,29 @@
           <w:sz w:val="20"/>
           <w:szCs w:val="20"/>
         </w:rPr>
-        <w:t>TransientSearch.zip</w:t>
+        <w:t>TransientSearch</w:t>
+      </w:r>
+      <w:r>
+        <w:rPr>
+          <w:rFonts w:ascii="Arial" w:hAnsi="Arial" w:cs="Arial"/>
+          <w:bCs/>
+          <w:i/>
+          <w:iCs/>
+          <w:sz w:val="20"/>
+          <w:szCs w:val="20"/>
+        </w:rPr>
+        <w:t>Buildxxx</w:t>
+      </w:r>
+      <w:r>
+        <w:rPr>
+          <w:rFonts w:ascii="Arial" w:hAnsi="Arial" w:cs="Arial"/>
+          <w:bCs/>
+          <w:i/>
+          <w:iCs/>
+          <w:sz w:val="20"/>
+          <w:szCs w:val="20"/>
+        </w:rPr>
+        <w:t>.zip</w:t>
       </w:r>
       <w:r>
         <w:rPr>
@@ -1294,6 +1732,17 @@
           <w:sz w:val="20"/>
           <w:szCs w:val="20"/>
         </w:rPr>
+        <w:t>Buildxxx</w:t>
+      </w:r>
+      <w:r>
+        <w:rPr>
+          <w:rFonts w:ascii="Arial" w:hAnsi="Arial" w:cs="Arial"/>
+          <w:bCs/>
+          <w:i/>
+          <w:iCs/>
+          <w:sz w:val="20"/>
+          <w:szCs w:val="20"/>
+        </w:rPr>
         <w:t>.zip</w:t>
       </w:r>
       <w:r>
@@ -1588,7 +2037,6 @@
           <w:sz w:val="20"/>
           <w:szCs w:val="20"/>
         </w:rPr>
-        <w:lastRenderedPageBreak/>
         <w:t xml:space="preserve">Launch </w:t>
       </w:r>
       <w:r>
@@ -1865,7 +2313,6 @@
           <w:bCs/>
           <w:sz w:val="20"/>
           <w:szCs w:val="20"/>
-          <w:highlight w:val="yellow"/>
         </w:rPr>
         <w:t xml:space="preserve">Launch </w:t>
       </w:r>
@@ -1877,7 +2324,6 @@
           <w:iCs/>
           <w:sz w:val="20"/>
           <w:szCs w:val="20"/>
-          <w:highlight w:val="yellow"/>
         </w:rPr>
         <w:t>Hot Pursuit</w:t>
       </w:r>
@@ -1887,7 +2333,6 @@
           <w:bCs/>
           <w:sz w:val="20"/>
           <w:szCs w:val="20"/>
-          <w:highlight w:val="yellow"/>
         </w:rPr>
         <w:t>.</w:t>
       </w:r>
@@ -2132,7 +2577,15 @@
           <w:sz w:val="20"/>
           <w:szCs w:val="20"/>
         </w:rPr>
-        <w:t xml:space="preserve"> 10</w:t>
+        <w:t xml:space="preserve"> 1</w:t>
+      </w:r>
+      <w:r>
+        <w:rPr>
+          <w:rFonts w:ascii="Arial" w:hAnsi="Arial" w:cs="Arial"/>
+          <w:sz w:val="20"/>
+          <w:szCs w:val="20"/>
+        </w:rPr>
+        <w:t>1</w:t>
       </w:r>
       <w:r>
         <w:rPr>
@@ -2311,25 +2764,7 @@
           <w:sz w:val="20"/>
           <w:szCs w:val="20"/>
         </w:rPr>
-        <w:t xml:space="preserve">any small body, </w:t>
-      </w:r>
-      <w:proofErr w:type="gramStart"/>
-      <w:r>
-        <w:rPr>
-          <w:rFonts w:ascii="Arial" w:hAnsi="Arial" w:cs="Arial"/>
-          <w:sz w:val="20"/>
-          <w:szCs w:val="20"/>
-        </w:rPr>
-        <w:t>asteroid</w:t>
-      </w:r>
-      <w:proofErr w:type="gramEnd"/>
-      <w:r>
-        <w:rPr>
-          <w:rFonts w:ascii="Arial" w:hAnsi="Arial" w:cs="Arial"/>
-          <w:sz w:val="20"/>
-          <w:szCs w:val="20"/>
-        </w:rPr>
-        <w:t xml:space="preserve"> or comet, can be </w:t>
+        <w:t xml:space="preserve">any small body, asteroid or comet, can be </w:t>
       </w:r>
       <w:r>
         <w:rPr>
@@ -2608,9 +3043,8 @@
           <w:szCs w:val="24"/>
           <w:u w:val="single"/>
         </w:rPr>
-        <w:t xml:space="preserve">, </w:t>
-      </w:r>
-      <w:proofErr w:type="gramStart"/>
+        <w:t>, Fields</w:t>
+      </w:r>
       <w:r>
         <w:rPr>
           <w:rFonts w:ascii="Arial" w:hAnsi="Arial" w:cs="Arial"/>
@@ -2619,10 +3053,12 @@
           <w:szCs w:val="24"/>
           <w:u w:val="single"/>
         </w:rPr>
-        <w:t>Fields</w:t>
-      </w:r>
-      <w:proofErr w:type="gramEnd"/>
-      <w:r>
+        <w:t xml:space="preserve"> and Commands</w:t>
+      </w:r>
+    </w:p>
+    <w:p>
+      <w:pPr>
+        <w:keepNext/>
         <w:rPr>
           <w:rFonts w:ascii="Arial" w:hAnsi="Arial" w:cs="Arial"/>
           <w:b/>
@@ -2630,24 +3066,11 @@
           <w:szCs w:val="24"/>
           <w:u w:val="single"/>
         </w:rPr>
-        <w:t xml:space="preserve"> and Commands</w:t>
-      </w:r>
+      </w:pPr>
     </w:p>
     <w:p>
       <w:pPr>
         <w:keepNext/>
-        <w:rPr>
-          <w:rFonts w:ascii="Arial" w:hAnsi="Arial" w:cs="Arial"/>
-          <w:b/>
-          <w:sz w:val="24"/>
-          <w:szCs w:val="24"/>
-          <w:u w:val="single"/>
-        </w:rPr>
-      </w:pPr>
-    </w:p>
-    <w:p>
-      <w:pPr>
-        <w:keepNext/>
         <w:jc w:val="center"/>
         <w:rPr>
           <w:rFonts w:ascii="Arial" w:hAnsi="Arial" w:cs="Arial"/>
@@ -2659,13 +3082,17 @@
       </w:pPr>
       <w:r>
         <w:rPr>
+          <w:rFonts w:ascii="Arial" w:hAnsi="Arial" w:cs="Arial"/>
+          <w:bCs/>
           <w:noProof/>
+          <w:sz w:val="20"/>
+          <w:szCs w:val="20"/>
         </w:rPr>
         <w:drawing>
-          <wp:inline distT="0" distB="0" distL="0" distR="0" wp14:anchorId="771790FC" wp14:editId="52F659BD">
-            <wp:extent cx="5629275" cy="2352675"/>
-            <wp:effectExtent l="0" t="0" r="9525" b="9525"/>
-            <wp:docPr id="4" name="Picture 4" descr="Graphical user interface, application&#10;&#10;Description automatically generated"/>
+          <wp:inline distT="0" distB="0" distL="0" distR="0" wp14:anchorId="2BD51C6B" wp14:editId="29B0100F">
+            <wp:extent cx="7211431" cy="2019582"/>
+            <wp:effectExtent l="0" t="0" r="0" b="0"/>
+            <wp:docPr id="830100622" name="Picture 1"/>
             <wp:cNvGraphicFramePr>
               <a:graphicFrameLocks xmlns:a="http://schemas.openxmlformats.org/drawingml/2006/main" noChangeAspect="1"/>
             </wp:cNvGraphicFramePr>
@@ -2673,36 +3100,23 @@
               <a:graphicData uri="http://schemas.openxmlformats.org/drawingml/2006/picture">
                 <pic:pic xmlns:pic="http://schemas.openxmlformats.org/drawingml/2006/picture">
                   <pic:nvPicPr>
-                    <pic:cNvPr id="4" name="Picture 4" descr="Graphical user interface, application&#10;&#10;Description automatically generated"/>
-                    <pic:cNvPicPr>
-                      <a:picLocks noChangeAspect="1" noChangeArrowheads="1"/>
-                    </pic:cNvPicPr>
+                    <pic:cNvPr id="830100622" name=""/>
+                    <pic:cNvPicPr/>
                   </pic:nvPicPr>
                   <pic:blipFill>
-                    <a:blip r:embed="rId9" r:link="rId10">
-                      <a:extLst>
-                        <a:ext uri="{28A0092B-C50C-407E-A947-70E740481C1C}">
-                          <a14:useLocalDpi xmlns:a14="http://schemas.microsoft.com/office/drawing/2010/main" val="0"/>
-                        </a:ext>
-                      </a:extLst>
-                    </a:blip>
-                    <a:srcRect/>
+                    <a:blip r:embed="rId9"/>
                     <a:stretch>
                       <a:fillRect/>
                     </a:stretch>
                   </pic:blipFill>
-                  <pic:spPr bwMode="auto">
+                  <pic:spPr>
                     <a:xfrm>
                       <a:off x="0" y="0"/>
-                      <a:ext cx="5629275" cy="2352675"/>
+                      <a:ext cx="7211431" cy="2019582"/>
                     </a:xfrm>
                     <a:prstGeom prst="rect">
                       <a:avLst/>
                     </a:prstGeom>
-                    <a:noFill/>
-                    <a:ln>
-                      <a:noFill/>
-                    </a:ln>
                   </pic:spPr>
                 </pic:pic>
               </a:graphicData>
@@ -2960,91 +3374,146 @@
         <w:rPr>
           <w:rFonts w:ascii="Arial" w:hAnsi="Arial" w:cs="Arial"/>
           <w:bCs/>
-          <w:noProof/>
           <w:sz w:val="20"/>
           <w:szCs w:val="20"/>
           <w:u w:val="single"/>
         </w:rPr>
-        <w:t>RA Rate</w:t>
-      </w:r>
-      <w:r>
-        <w:rPr>
-          <w:rFonts w:ascii="Arial" w:hAnsi="Arial" w:cs="Arial"/>
-          <w:bCs/>
-          <w:noProof/>
-          <w:sz w:val="20"/>
-          <w:szCs w:val="20"/>
-          <w:u w:val="single"/>
+        <w:t xml:space="preserve">Source: </w:t>
+      </w:r>
+      <w:proofErr w:type="gramStart"/>
+      <w:r>
+        <w:rPr>
+          <w:rFonts w:ascii="Arial" w:hAnsi="Arial" w:cs="Arial"/>
+          <w:bCs/>
+          <w:sz w:val="20"/>
+          <w:szCs w:val="20"/>
+        </w:rPr>
+        <w:t xml:space="preserve">  </w:t>
+      </w:r>
+      <w:r>
+        <w:rPr>
+          <w:rFonts w:ascii="Arial" w:hAnsi="Arial" w:cs="Arial"/>
+          <w:bCs/>
+          <w:sz w:val="20"/>
+          <w:szCs w:val="20"/>
+        </w:rPr>
+        <w:t>Drop</w:t>
+      </w:r>
+      <w:proofErr w:type="gramEnd"/>
+      <w:r>
+        <w:rPr>
+          <w:rFonts w:ascii="Arial" w:hAnsi="Arial" w:cs="Arial"/>
+          <w:bCs/>
+          <w:sz w:val="20"/>
+          <w:szCs w:val="20"/>
+        </w:rPr>
+        <w:t xml:space="preserve"> down menu for i</w:t>
+      </w:r>
+      <w:r>
+        <w:rPr>
+          <w:rFonts w:ascii="Arial" w:hAnsi="Arial" w:cs="Arial"/>
+          <w:bCs/>
+          <w:sz w:val="20"/>
+          <w:szCs w:val="20"/>
+        </w:rPr>
+        <w:t>nternet database to query</w:t>
+      </w:r>
+      <w:r>
+        <w:rPr>
+          <w:rFonts w:ascii="Arial" w:hAnsi="Arial" w:cs="Arial"/>
+          <w:bCs/>
+          <w:sz w:val="20"/>
+          <w:szCs w:val="20"/>
         </w:rPr>
         <w:t>:</w:t>
-      </w:r>
-      <w:r>
-        <w:rPr>
-          <w:rFonts w:ascii="Arial" w:hAnsi="Arial" w:cs="Arial"/>
-          <w:bCs/>
-          <w:noProof/>
-          <w:sz w:val="20"/>
-          <w:szCs w:val="20"/>
-        </w:rPr>
-        <w:t xml:space="preserve">  </w:t>
-      </w:r>
-      <w:r>
-        <w:rPr>
-          <w:rFonts w:ascii="Arial" w:hAnsi="Arial" w:cs="Arial"/>
-          <w:bCs/>
-          <w:noProof/>
-          <w:sz w:val="20"/>
-          <w:szCs w:val="20"/>
-        </w:rPr>
-        <w:t>Rate of change in arcsec per minute of RA, corrected for the observer’s location.</w:t>
       </w:r>
     </w:p>
     <w:p>
       <w:pPr>
-        <w:rPr>
-          <w:rFonts w:ascii="Arial" w:hAnsi="Arial" w:cs="Arial"/>
-          <w:bCs/>
-          <w:noProof/>
-          <w:sz w:val="20"/>
-          <w:szCs w:val="20"/>
-        </w:rPr>
-      </w:pPr>
-      <w:r>
-        <w:rPr>
-          <w:rFonts w:ascii="Arial" w:hAnsi="Arial" w:cs="Arial"/>
-          <w:bCs/>
-          <w:noProof/>
+        <w:ind w:left="720"/>
+        <w:rPr>
+          <w:rFonts w:ascii="Arial" w:hAnsi="Arial" w:cs="Arial"/>
+          <w:bCs/>
+          <w:sz w:val="20"/>
+          <w:szCs w:val="20"/>
+        </w:rPr>
+      </w:pPr>
+      <w:r>
+        <w:rPr>
+          <w:rFonts w:ascii="Arial" w:hAnsi="Arial" w:cs="Arial"/>
+          <w:bCs/>
           <w:sz w:val="20"/>
           <w:szCs w:val="20"/>
           <w:u w:val="single"/>
         </w:rPr>
-        <w:lastRenderedPageBreak/>
-        <w:t>Dec Rate</w:t>
-      </w:r>
-      <w:r>
-        <w:rPr>
-          <w:rFonts w:ascii="Arial" w:hAnsi="Arial" w:cs="Arial"/>
-          <w:bCs/>
-          <w:noProof/>
-          <w:sz w:val="20"/>
-          <w:szCs w:val="20"/>
-          <w:u w:val="single"/>
-        </w:rPr>
-        <w:t>:</w:t>
-      </w:r>
-      <w:r>
-        <w:rPr>
-          <w:rFonts w:ascii="Arial" w:hAnsi="Arial" w:cs="Arial"/>
-          <w:bCs/>
-          <w:noProof/>
-          <w:sz w:val="20"/>
-          <w:szCs w:val="20"/>
-        </w:rPr>
-        <w:t xml:space="preserve">  Rate of change in arcsec per minute of Dec, corrected for the observer’s location.</w:t>
+        <w:t>Scout</w:t>
+      </w:r>
+      <w:r>
+        <w:rPr>
+          <w:rFonts w:ascii="Arial" w:hAnsi="Arial" w:cs="Arial"/>
+          <w:bCs/>
+          <w:sz w:val="20"/>
+          <w:szCs w:val="20"/>
+        </w:rPr>
+        <w:t xml:space="preserve">: </w:t>
+      </w:r>
+      <w:r>
+        <w:rPr>
+          <w:rFonts w:ascii="Arial" w:hAnsi="Arial" w:cs="Arial"/>
+          <w:bCs/>
+          <w:sz w:val="20"/>
+          <w:szCs w:val="20"/>
+        </w:rPr>
+        <w:t>Enables</w:t>
+      </w:r>
+      <w:r>
+        <w:rPr>
+          <w:rFonts w:ascii="Arial" w:hAnsi="Arial" w:cs="Arial"/>
+          <w:bCs/>
+          <w:sz w:val="20"/>
+          <w:szCs w:val="20"/>
+        </w:rPr>
+        <w:t xml:space="preserve"> Scout </w:t>
+      </w:r>
+      <w:r>
+        <w:rPr>
+          <w:rFonts w:ascii="Arial" w:hAnsi="Arial" w:cs="Arial"/>
+          <w:bCs/>
+          <w:sz w:val="20"/>
+          <w:szCs w:val="20"/>
+        </w:rPr>
+        <w:t xml:space="preserve">web database </w:t>
+      </w:r>
+      <w:r>
+        <w:rPr>
+          <w:rFonts w:ascii="Arial" w:hAnsi="Arial" w:cs="Arial"/>
+          <w:bCs/>
+          <w:sz w:val="20"/>
+          <w:szCs w:val="20"/>
+        </w:rPr>
+        <w:t xml:space="preserve">query and tracking </w:t>
+      </w:r>
+      <w:r>
+        <w:rPr>
+          <w:rFonts w:ascii="Arial" w:hAnsi="Arial" w:cs="Arial"/>
+          <w:bCs/>
+          <w:sz w:val="20"/>
+          <w:szCs w:val="20"/>
+        </w:rPr>
+        <w:t>for the entered target.</w:t>
       </w:r>
     </w:p>
     <w:p>
       <w:pPr>
+        <w:ind w:left="720"/>
+        <w:rPr>
+          <w:rFonts w:ascii="Arial" w:hAnsi="Arial" w:cs="Arial"/>
+          <w:bCs/>
+          <w:sz w:val="20"/>
+          <w:szCs w:val="20"/>
+        </w:rPr>
+      </w:pPr>
+      <w:r>
         <w:rPr>
           <w:rFonts w:ascii="Arial" w:hAnsi="Arial" w:cs="Arial"/>
           <w:bCs/>
@@ -3052,7 +3521,8 @@
           <w:szCs w:val="20"/>
           <w:u w:val="single"/>
         </w:rPr>
-      </w:pPr>
+        <w:t>Horizons</w:t>
+      </w:r>
       <w:r>
         <w:rPr>
           <w:rFonts w:ascii="Arial" w:hAnsi="Arial" w:cs="Arial"/>
@@ -3061,30 +3531,30 @@
           <w:szCs w:val="20"/>
           <w:u w:val="single"/>
         </w:rPr>
-        <w:t>Range</w:t>
-      </w:r>
-      <w:r>
-        <w:rPr>
-          <w:rFonts w:ascii="Arial" w:hAnsi="Arial" w:cs="Arial"/>
-          <w:bCs/>
-          <w:sz w:val="20"/>
-          <w:szCs w:val="20"/>
-        </w:rPr>
-        <w:t>: Distance to the target in AU.</w:t>
-      </w:r>
-      <w:r>
-        <w:rPr>
-          <w:rFonts w:ascii="Arial" w:hAnsi="Arial" w:cs="Arial"/>
-          <w:bCs/>
-          <w:sz w:val="20"/>
-          <w:szCs w:val="20"/>
-          <w:u w:val="single"/>
+        <w:t>:</w:t>
+      </w:r>
+      <w:r>
+        <w:rPr>
+          <w:rFonts w:ascii="Arial" w:hAnsi="Arial" w:cs="Arial"/>
+          <w:bCs/>
+          <w:sz w:val="20"/>
+          <w:szCs w:val="20"/>
         </w:rPr>
         <w:t xml:space="preserve"> </w:t>
+      </w:r>
+      <w:r>
+        <w:rPr>
+          <w:rFonts w:ascii="Arial" w:hAnsi="Arial" w:cs="Arial"/>
+          <w:bCs/>
+          <w:sz w:val="20"/>
+          <w:szCs w:val="20"/>
+        </w:rPr>
+        <w:t>Enables Horizons web database query and tracking for the entered target.</w:t>
       </w:r>
     </w:p>
     <w:p>
       <w:pPr>
+        <w:ind w:left="720"/>
         <w:rPr>
           <w:rFonts w:ascii="Arial" w:hAnsi="Arial" w:cs="Arial"/>
           <w:bCs/>
@@ -3100,65 +3570,30 @@
           <w:szCs w:val="20"/>
           <w:u w:val="single"/>
         </w:rPr>
-        <w:t>Scout</w:t>
-      </w:r>
-      <w:r>
-        <w:rPr>
-          <w:rFonts w:ascii="Arial" w:hAnsi="Arial" w:cs="Arial"/>
-          <w:bCs/>
-          <w:sz w:val="20"/>
-          <w:szCs w:val="20"/>
-        </w:rPr>
-        <w:t xml:space="preserve">: </w:t>
-      </w:r>
-      <w:r>
-        <w:rPr>
-          <w:rFonts w:ascii="Arial" w:hAnsi="Arial" w:cs="Arial"/>
-          <w:bCs/>
-          <w:sz w:val="20"/>
-          <w:szCs w:val="20"/>
-        </w:rPr>
-        <w:t>Enables</w:t>
-      </w:r>
-      <w:r>
-        <w:rPr>
-          <w:rFonts w:ascii="Arial" w:hAnsi="Arial" w:cs="Arial"/>
-          <w:bCs/>
-          <w:sz w:val="20"/>
-          <w:szCs w:val="20"/>
-        </w:rPr>
-        <w:t xml:space="preserve"> Scout </w:t>
-      </w:r>
-      <w:r>
-        <w:rPr>
-          <w:rFonts w:ascii="Arial" w:hAnsi="Arial" w:cs="Arial"/>
-          <w:bCs/>
-          <w:sz w:val="20"/>
-          <w:szCs w:val="20"/>
-        </w:rPr>
-        <w:t xml:space="preserve">web database </w:t>
-      </w:r>
-      <w:r>
-        <w:rPr>
-          <w:rFonts w:ascii="Arial" w:hAnsi="Arial" w:cs="Arial"/>
-          <w:bCs/>
-          <w:sz w:val="20"/>
-          <w:szCs w:val="20"/>
-        </w:rPr>
-        <w:t xml:space="preserve">query and tracking </w:t>
-      </w:r>
-      <w:r>
-        <w:rPr>
-          <w:rFonts w:ascii="Arial" w:hAnsi="Arial" w:cs="Arial"/>
-          <w:bCs/>
-          <w:sz w:val="20"/>
-          <w:szCs w:val="20"/>
-        </w:rPr>
-        <w:t>for the entered target.</w:t>
+        <w:t>MPC:</w:t>
+      </w:r>
+      <w:r>
+        <w:rPr>
+          <w:rFonts w:ascii="Arial" w:hAnsi="Arial" w:cs="Arial"/>
+          <w:bCs/>
+          <w:sz w:val="20"/>
+          <w:szCs w:val="20"/>
+        </w:rPr>
+        <w:t xml:space="preserve"> </w:t>
+      </w:r>
+      <w:r>
+        <w:rPr>
+          <w:rFonts w:ascii="Arial" w:hAnsi="Arial" w:cs="Arial"/>
+          <w:bCs/>
+          <w:sz w:val="20"/>
+          <w:szCs w:val="20"/>
+        </w:rPr>
+        <w:t>Enables MPC web database query and tracking for the entered target.</w:t>
       </w:r>
     </w:p>
     <w:p>
       <w:pPr>
+        <w:ind w:left="720"/>
         <w:rPr>
           <w:rFonts w:ascii="Arial" w:hAnsi="Arial" w:cs="Arial"/>
           <w:bCs/>
@@ -3174,8 +3609,9 @@
           <w:szCs w:val="20"/>
           <w:u w:val="single"/>
         </w:rPr>
-        <w:t>Horizons</w:t>
-      </w:r>
+        <w:t>Raw</w:t>
+      </w:r>
+      <w:proofErr w:type="gramStart"/>
       <w:r>
         <w:rPr>
           <w:rFonts w:ascii="Arial" w:hAnsi="Arial" w:cs="Arial"/>
@@ -3193,16 +3629,26 @@
           <w:sz w:val="20"/>
           <w:szCs w:val="20"/>
         </w:rPr>
-        <w:t xml:space="preserve"> </w:t>
-      </w:r>
-      <w:r>
-        <w:rPr>
-          <w:rFonts w:ascii="Arial" w:hAnsi="Arial" w:cs="Arial"/>
-          <w:bCs/>
-          <w:sz w:val="20"/>
-          <w:szCs w:val="20"/>
-        </w:rPr>
-        <w:t>Enables Horizons web database query and tracking for the entered target.</w:t>
+        <w:t xml:space="preserve">  </w:t>
+      </w:r>
+      <w:r>
+        <w:rPr>
+          <w:rFonts w:ascii="Arial" w:hAnsi="Arial" w:cs="Arial"/>
+          <w:bCs/>
+          <w:sz w:val="20"/>
+          <w:szCs w:val="20"/>
+        </w:rPr>
+        <w:t>Reserved</w:t>
+      </w:r>
+      <w:proofErr w:type="gramEnd"/>
+      <w:r>
+        <w:rPr>
+          <w:rFonts w:ascii="Arial" w:hAnsi="Arial" w:cs="Arial"/>
+          <w:bCs/>
+          <w:sz w:val="20"/>
+          <w:szCs w:val="20"/>
+        </w:rPr>
+        <w:t xml:space="preserve"> for future use.</w:t>
       </w:r>
     </w:p>
     <w:p>
@@ -3222,25 +3668,66 @@
           <w:szCs w:val="20"/>
           <w:u w:val="single"/>
         </w:rPr>
-        <w:t>MPC:</w:t>
-      </w:r>
-      <w:r>
-        <w:rPr>
-          <w:rFonts w:ascii="Arial" w:hAnsi="Arial" w:cs="Arial"/>
-          <w:bCs/>
-          <w:sz w:val="20"/>
-          <w:szCs w:val="20"/>
-        </w:rPr>
-        <w:t xml:space="preserve"> </w:t>
-      </w:r>
-      <w:r>
-        <w:rPr>
-          <w:rFonts w:ascii="Arial" w:hAnsi="Arial" w:cs="Arial"/>
-          <w:bCs/>
-          <w:sz w:val="20"/>
-          <w:szCs w:val="20"/>
-        </w:rPr>
-        <w:t>Enables MPC web database query and tracking for the entered target.</w:t>
+        <w:t>Plot</w:t>
+      </w:r>
+      <w:proofErr w:type="gramStart"/>
+      <w:r>
+        <w:rPr>
+          <w:rFonts w:ascii="Arial" w:hAnsi="Arial" w:cs="Arial"/>
+          <w:bCs/>
+          <w:sz w:val="20"/>
+          <w:szCs w:val="20"/>
+          <w:u w:val="single"/>
+        </w:rPr>
+        <w:t>:  Days</w:t>
+      </w:r>
+      <w:r>
+        <w:rPr>
+          <w:rFonts w:ascii="Arial" w:hAnsi="Arial" w:cs="Arial"/>
+          <w:bCs/>
+          <w:sz w:val="20"/>
+          <w:szCs w:val="20"/>
+        </w:rPr>
+        <w:t xml:space="preserve">:  </w:t>
+      </w:r>
+      <w:r>
+        <w:rPr>
+          <w:rFonts w:ascii="Arial" w:hAnsi="Arial" w:cs="Arial"/>
+          <w:bCs/>
+          <w:sz w:val="20"/>
+          <w:szCs w:val="20"/>
+        </w:rPr>
+        <w:t>Number</w:t>
+      </w:r>
+      <w:proofErr w:type="gramEnd"/>
+      <w:r>
+        <w:rPr>
+          <w:rFonts w:ascii="Arial" w:hAnsi="Arial" w:cs="Arial"/>
+          <w:bCs/>
+          <w:sz w:val="20"/>
+          <w:szCs w:val="20"/>
+        </w:rPr>
+        <w:t xml:space="preserve"> of days to plot the position of this target on the TSX </w:t>
+      </w:r>
+      <w:proofErr w:type="spellStart"/>
+      <w:r>
+        <w:rPr>
+          <w:rFonts w:ascii="Arial" w:hAnsi="Arial" w:cs="Arial"/>
+          <w:bCs/>
+          <w:sz w:val="20"/>
+          <w:szCs w:val="20"/>
+        </w:rPr>
+        <w:t>StarChart</w:t>
+      </w:r>
+      <w:proofErr w:type="spellEnd"/>
+      <w:r>
+        <w:rPr>
+          <w:rFonts w:ascii="Arial" w:hAnsi="Arial" w:cs="Arial"/>
+          <w:bCs/>
+          <w:sz w:val="20"/>
+          <w:szCs w:val="20"/>
+        </w:rPr>
+        <w:t xml:space="preserve"> (see below).</w:t>
       </w:r>
     </w:p>
     <w:p>
@@ -3260,88 +3747,7 @@
           <w:szCs w:val="20"/>
           <w:u w:val="single"/>
         </w:rPr>
-        <w:t>Sat</w:t>
-      </w:r>
-      <w:r>
-        <w:rPr>
-          <w:rFonts w:ascii="Arial" w:hAnsi="Arial" w:cs="Arial"/>
-          <w:bCs/>
-          <w:sz w:val="20"/>
-          <w:szCs w:val="20"/>
-        </w:rPr>
-        <w:t xml:space="preserve">: Enables </w:t>
-      </w:r>
-      <w:r>
-        <w:rPr>
-          <w:rFonts w:ascii="Arial" w:hAnsi="Arial" w:cs="Arial"/>
-          <w:bCs/>
-          <w:sz w:val="20"/>
-          <w:szCs w:val="20"/>
-        </w:rPr>
-        <w:t>TLE catalog query (see below) and Horizons ephemeris generation.</w:t>
-      </w:r>
-      <w:r>
-        <w:rPr>
-          <w:rFonts w:ascii="Arial" w:hAnsi="Arial" w:cs="Arial"/>
-          <w:bCs/>
-          <w:sz w:val="20"/>
-          <w:szCs w:val="20"/>
-        </w:rPr>
-        <w:t xml:space="preserve">  When </w:t>
-      </w:r>
-      <w:r>
-        <w:rPr>
-          <w:rFonts w:ascii="Arial" w:hAnsi="Arial" w:cs="Arial"/>
-          <w:bCs/>
-          <w:sz w:val="20"/>
-          <w:szCs w:val="20"/>
-        </w:rPr>
-        <w:t>Sat</w:t>
-      </w:r>
-      <w:r>
-        <w:rPr>
-          <w:rFonts w:ascii="Arial" w:hAnsi="Arial" w:cs="Arial"/>
-          <w:bCs/>
-          <w:sz w:val="20"/>
-          <w:szCs w:val="20"/>
-        </w:rPr>
-        <w:t xml:space="preserve"> is selected, </w:t>
-      </w:r>
-      <w:r>
-        <w:rPr>
-          <w:rFonts w:ascii="Arial" w:hAnsi="Arial" w:cs="Arial"/>
-          <w:bCs/>
-          <w:sz w:val="20"/>
-          <w:szCs w:val="20"/>
-        </w:rPr>
-        <w:t xml:space="preserve">the user will be prompted to download a current </w:t>
-      </w:r>
-      <w:r>
-        <w:rPr>
-          <w:rFonts w:ascii="Arial" w:hAnsi="Arial" w:cs="Arial"/>
-          <w:bCs/>
-          <w:sz w:val="20"/>
-          <w:szCs w:val="20"/>
-        </w:rPr>
-        <w:t xml:space="preserve">list of satellite names </w:t>
-      </w:r>
-      <w:r>
-        <w:rPr>
-          <w:rFonts w:ascii="Arial" w:hAnsi="Arial" w:cs="Arial"/>
-          <w:bCs/>
-          <w:sz w:val="20"/>
-          <w:szCs w:val="20"/>
-        </w:rPr>
-        <w:t>from CelesTrak.com</w:t>
-      </w:r>
-      <w:r>
-        <w:rPr>
-          <w:rFonts w:ascii="Arial" w:hAnsi="Arial" w:cs="Arial"/>
-          <w:bCs/>
-          <w:sz w:val="20"/>
-          <w:szCs w:val="20"/>
-        </w:rPr>
-        <w:t xml:space="preserve"> into </w:t>
+        <w:t>Plot: Generate SDB</w:t>
       </w:r>
       <w:proofErr w:type="gramStart"/>
       <w:r>
@@ -3350,26 +3756,18 @@
           <w:bCs/>
           <w:sz w:val="20"/>
           <w:szCs w:val="20"/>
-        </w:rPr>
-        <w:t xml:space="preserve">a </w:t>
-      </w:r>
-      <w:r>
-        <w:rPr>
-          <w:rFonts w:ascii="Arial" w:hAnsi="Arial" w:cs="Arial"/>
-          <w:bCs/>
-          <w:sz w:val="20"/>
-          <w:szCs w:val="20"/>
-        </w:rPr>
-        <w:t xml:space="preserve"> </w:t>
-      </w:r>
-      <w:r>
-        <w:rPr>
-          <w:rFonts w:ascii="Arial" w:hAnsi="Arial" w:cs="Arial"/>
-          <w:bCs/>
-          <w:sz w:val="20"/>
-          <w:szCs w:val="20"/>
-        </w:rPr>
-        <w:t>“</w:t>
+          <w:u w:val="single"/>
+        </w:rPr>
+        <w:t>:</w:t>
+      </w:r>
+      <w:r>
+        <w:rPr>
+          <w:rFonts w:ascii="Arial" w:hAnsi="Arial" w:cs="Arial"/>
+          <w:bCs/>
+          <w:sz w:val="20"/>
+          <w:szCs w:val="20"/>
+        </w:rPr>
+        <w:t xml:space="preserve">  The</w:t>
       </w:r>
       <w:proofErr w:type="gramEnd"/>
       <w:r>
@@ -3379,111 +3777,74 @@
           <w:sz w:val="20"/>
           <w:szCs w:val="20"/>
         </w:rPr>
-        <w:t>SatCat</w:t>
-      </w:r>
-      <w:r>
-        <w:rPr>
-          <w:rFonts w:ascii="Arial" w:hAnsi="Arial" w:cs="Arial"/>
-          <w:bCs/>
-          <w:sz w:val="20"/>
-          <w:szCs w:val="20"/>
-        </w:rPr>
-        <w:t>.txt</w:t>
-      </w:r>
-      <w:r>
-        <w:rPr>
-          <w:rFonts w:ascii="Arial" w:hAnsi="Arial" w:cs="Arial"/>
-          <w:bCs/>
-          <w:sz w:val="20"/>
-          <w:szCs w:val="20"/>
-        </w:rPr>
-        <w:t>”</w:t>
-      </w:r>
-      <w:r>
-        <w:rPr>
-          <w:rFonts w:ascii="Arial" w:hAnsi="Arial" w:cs="Arial"/>
-          <w:bCs/>
-          <w:sz w:val="20"/>
-          <w:szCs w:val="20"/>
-        </w:rPr>
-        <w:t xml:space="preserve"> file in the </w:t>
-      </w:r>
-      <w:proofErr w:type="spellStart"/>
-      <w:r>
-        <w:rPr>
-          <w:rFonts w:ascii="Arial" w:hAnsi="Arial" w:cs="Arial"/>
-          <w:bCs/>
-          <w:sz w:val="20"/>
-          <w:szCs w:val="20"/>
-        </w:rPr>
-        <w:t>HotPursuit</w:t>
-      </w:r>
-      <w:proofErr w:type="spellEnd"/>
-      <w:r>
-        <w:rPr>
-          <w:rFonts w:ascii="Arial" w:hAnsi="Arial" w:cs="Arial"/>
-          <w:bCs/>
-          <w:sz w:val="20"/>
-          <w:szCs w:val="20"/>
-        </w:rPr>
-        <w:t>/</w:t>
-      </w:r>
-      <w:r>
-        <w:rPr>
-          <w:rFonts w:ascii="Arial" w:hAnsi="Arial" w:cs="Arial"/>
-          <w:bCs/>
-          <w:sz w:val="20"/>
-          <w:szCs w:val="20"/>
-        </w:rPr>
-        <w:t>TLE directory</w:t>
-      </w:r>
-      <w:r>
-        <w:rPr>
-          <w:rFonts w:ascii="Arial" w:hAnsi="Arial" w:cs="Arial"/>
-          <w:bCs/>
-          <w:sz w:val="20"/>
-          <w:szCs w:val="20"/>
-        </w:rPr>
-        <w:t>.</w:t>
-      </w:r>
-      <w:r>
-        <w:rPr>
-          <w:rFonts w:ascii="Arial" w:hAnsi="Arial" w:cs="Arial"/>
-          <w:bCs/>
-          <w:sz w:val="20"/>
-          <w:szCs w:val="20"/>
-        </w:rPr>
-        <w:t xml:space="preserve"> </w:t>
-      </w:r>
-      <w:r>
-        <w:rPr>
-          <w:rFonts w:ascii="Arial" w:hAnsi="Arial" w:cs="Arial"/>
-          <w:bCs/>
-          <w:sz w:val="20"/>
-          <w:szCs w:val="20"/>
-        </w:rPr>
-        <w:t xml:space="preserve"> </w:t>
-      </w:r>
-      <w:r>
-        <w:rPr>
-          <w:rFonts w:ascii="Arial" w:hAnsi="Arial" w:cs="Arial"/>
-          <w:bCs/>
-          <w:sz w:val="20"/>
-          <w:szCs w:val="20"/>
-        </w:rPr>
-        <w:t xml:space="preserve">In addition, choosing this option causes Hot Pursuit to change the Refresh </w:t>
-      </w:r>
-      <w:r>
-        <w:rPr>
-          <w:rFonts w:ascii="Arial" w:hAnsi="Arial" w:cs="Arial"/>
-          <w:bCs/>
-          <w:sz w:val="20"/>
-          <w:szCs w:val="20"/>
-        </w:rPr>
-        <w:t>rate to seconds and uncheck CLS, both of which would be more likely to be configured for chasing satellites.</w:t>
+        <w:t xml:space="preserve"> r</w:t>
+      </w:r>
+      <w:r>
+        <w:rPr>
+          <w:rFonts w:ascii="Arial" w:hAnsi="Arial" w:cs="Arial"/>
+          <w:bCs/>
+          <w:sz w:val="20"/>
+          <w:szCs w:val="20"/>
+        </w:rPr>
+        <w:t xml:space="preserve">espective database will be queried for the position of the target over the following </w:t>
+      </w:r>
+      <w:proofErr w:type="gramStart"/>
+      <w:r>
+        <w:rPr>
+          <w:rFonts w:ascii="Arial" w:hAnsi="Arial" w:cs="Arial"/>
+          <w:bCs/>
+          <w:sz w:val="20"/>
+          <w:szCs w:val="20"/>
+        </w:rPr>
+        <w:t>days</w:t>
+      </w:r>
+      <w:proofErr w:type="gramEnd"/>
+      <w:r>
+        <w:rPr>
+          <w:rFonts w:ascii="Arial" w:hAnsi="Arial" w:cs="Arial"/>
+          <w:bCs/>
+          <w:sz w:val="20"/>
+          <w:szCs w:val="20"/>
+        </w:rPr>
+        <w:t xml:space="preserve"> and the returned dataset will be loaded in the clipboard.  Subsequently, applying the Edit-&gt;Paste Photo</w:t>
+      </w:r>
+      <w:r>
+        <w:rPr>
+          <w:rFonts w:ascii="Arial" w:hAnsi="Arial" w:cs="Arial"/>
+          <w:bCs/>
+          <w:sz w:val="20"/>
+          <w:szCs w:val="20"/>
+        </w:rPr>
+        <w:t xml:space="preserve"> database loading function in TSX will </w:t>
+      </w:r>
+      <w:r>
+        <w:rPr>
+          <w:rFonts w:ascii="Arial" w:hAnsi="Arial" w:cs="Arial"/>
+          <w:bCs/>
+          <w:sz w:val="20"/>
+          <w:szCs w:val="20"/>
+        </w:rPr>
+        <w:t xml:space="preserve">load the clipboard to </w:t>
+      </w:r>
+      <w:r>
+        <w:rPr>
+          <w:rFonts w:ascii="Arial" w:hAnsi="Arial" w:cs="Arial"/>
+          <w:bCs/>
+          <w:sz w:val="20"/>
+          <w:szCs w:val="20"/>
+        </w:rPr>
+        <w:t>produce a plot on the Star Chart of the target’s position over that time.</w:t>
       </w:r>
     </w:p>
     <w:p>
+      <w:pPr>
+        <w:rPr>
+          <w:rFonts w:ascii="Arial" w:hAnsi="Arial" w:cs="Arial"/>
+          <w:bCs/>
+          <w:sz w:val="20"/>
+          <w:szCs w:val="20"/>
+        </w:rPr>
+      </w:pPr>
       <w:r>
         <w:rPr>
           <w:rFonts w:ascii="Arial" w:hAnsi="Arial" w:cs="Arial"/>
@@ -3492,34 +3853,25 @@
           <w:szCs w:val="20"/>
           <w:u w:val="single"/>
         </w:rPr>
-        <w:t>Custom TLE</w:t>
-      </w:r>
-      <w:r>
-        <w:rPr>
-          <w:rFonts w:ascii="Arial" w:hAnsi="Arial" w:cs="Arial"/>
-          <w:bCs/>
-          <w:sz w:val="20"/>
-          <w:szCs w:val="20"/>
-        </w:rPr>
-        <w:t xml:space="preserve">: </w:t>
-      </w:r>
-      <w:r>
-        <w:rPr>
-          <w:rFonts w:ascii="Arial" w:hAnsi="Arial" w:cs="Arial"/>
-          <w:bCs/>
-          <w:sz w:val="20"/>
-          <w:szCs w:val="20"/>
-        </w:rPr>
-        <w:t xml:space="preserve">Opens </w:t>
-      </w:r>
-      <w:r>
-        <w:rPr>
-          <w:rFonts w:ascii="Arial" w:hAnsi="Arial" w:cs="Arial"/>
-          <w:bCs/>
-          <w:sz w:val="20"/>
-          <w:szCs w:val="20"/>
-        </w:rPr>
-        <w:t xml:space="preserve">a new window with a tree view listing of a user-created 3TLE text file.  This type of file can be easily generated on the </w:t>
+        <w:t>Refresh</w:t>
+      </w:r>
+      <w:r>
+        <w:rPr>
+          <w:rFonts w:ascii="Arial" w:hAnsi="Arial" w:cs="Arial"/>
+          <w:bCs/>
+          <w:sz w:val="20"/>
+          <w:szCs w:val="20"/>
+        </w:rPr>
+        <w:t xml:space="preserve">: Sets the rate at which the </w:t>
+      </w:r>
+      <w:r>
+        <w:rPr>
+          <w:rFonts w:ascii="Arial" w:hAnsi="Arial" w:cs="Arial"/>
+          <w:bCs/>
+          <w:sz w:val="20"/>
+          <w:szCs w:val="20"/>
+        </w:rPr>
+        <w:t xml:space="preserve">updates </w:t>
       </w:r>
       <w:proofErr w:type="spellStart"/>
       <w:r>
@@ -3529,7 +3881,7 @@
           <w:sz w:val="20"/>
           <w:szCs w:val="20"/>
         </w:rPr>
-        <w:t>CelesTrak</w:t>
+        <w:t>TheSky</w:t>
       </w:r>
       <w:proofErr w:type="spellEnd"/>
       <w:r>
@@ -3539,28 +3891,180 @@
           <w:sz w:val="20"/>
           <w:szCs w:val="20"/>
         </w:rPr>
-        <w:t xml:space="preserve"> website, saved to the clipboard then pasted into a file named “CustomTLE.txt” file using Notepad.  The file must be named “CustomTLE.txt” and saved in the </w:t>
-      </w:r>
-      <w:hyperlink r:id="rId11" w:history="1">
-        <w:r>
-          <w:rPr>
-            <w:rStyle w:val="Hyperlink"/>
-            <w:rFonts w:ascii="Arial" w:hAnsi="Arial" w:cs="Arial"/>
-            <w:bCs/>
-            <w:sz w:val="20"/>
-            <w:szCs w:val="20"/>
-          </w:rPr>
-          <w:t>\\Documents\Hot</w:t>
-        </w:r>
-      </w:hyperlink>
-      <w:r>
-        <w:rPr>
-          <w:rFonts w:ascii="Arial" w:hAnsi="Arial" w:cs="Arial"/>
-          <w:bCs/>
-          <w:sz w:val="20"/>
-          <w:szCs w:val="20"/>
-        </w:rPr>
-        <w:t xml:space="preserve"> Pursuit\TLE folder.  The file may contain one or more three line records.</w:t>
+        <w:t xml:space="preserve"> </w:t>
+      </w:r>
+      <w:r>
+        <w:rPr>
+          <w:rFonts w:ascii="Arial" w:hAnsi="Arial" w:cs="Arial"/>
+          <w:bCs/>
+          <w:sz w:val="20"/>
+          <w:szCs w:val="20"/>
+        </w:rPr>
+        <w:t xml:space="preserve">tracking </w:t>
+      </w:r>
+      <w:r>
+        <w:rPr>
+          <w:rFonts w:ascii="Arial" w:hAnsi="Arial" w:cs="Arial"/>
+          <w:bCs/>
+          <w:sz w:val="20"/>
+          <w:szCs w:val="20"/>
+        </w:rPr>
+        <w:t>with</w:t>
+      </w:r>
+      <w:r>
+        <w:rPr>
+          <w:rFonts w:ascii="Arial" w:hAnsi="Arial" w:cs="Arial"/>
+          <w:bCs/>
+          <w:sz w:val="20"/>
+          <w:szCs w:val="20"/>
+        </w:rPr>
+        <w:t xml:space="preserve"> new ephemeris </w:t>
+      </w:r>
+      <w:r>
+        <w:rPr>
+          <w:rFonts w:ascii="Arial" w:hAnsi="Arial" w:cs="Arial"/>
+          <w:bCs/>
+          <w:sz w:val="20"/>
+          <w:szCs w:val="20"/>
+        </w:rPr>
+        <w:t xml:space="preserve">rate </w:t>
+      </w:r>
+      <w:r>
+        <w:rPr>
+          <w:rFonts w:ascii="Arial" w:hAnsi="Arial" w:cs="Arial"/>
+          <w:bCs/>
+          <w:sz w:val="20"/>
+          <w:szCs w:val="20"/>
+        </w:rPr>
+        <w:t xml:space="preserve">data.  </w:t>
+      </w:r>
+      <w:r>
+        <w:rPr>
+          <w:rFonts w:ascii="Arial" w:hAnsi="Arial" w:cs="Arial"/>
+          <w:bCs/>
+          <w:sz w:val="20"/>
+          <w:szCs w:val="20"/>
+        </w:rPr>
+        <w:t xml:space="preserve">The minimum period for ephemeris from Scout is 1 minute. </w:t>
+      </w:r>
+      <w:r>
+        <w:rPr>
+          <w:rFonts w:ascii="Arial" w:hAnsi="Arial" w:cs="Arial"/>
+          <w:bCs/>
+          <w:sz w:val="20"/>
+          <w:szCs w:val="20"/>
+        </w:rPr>
+        <w:t xml:space="preserve">  If </w:t>
+      </w:r>
+      <w:r>
+        <w:rPr>
+          <w:rFonts w:ascii="Arial" w:hAnsi="Arial" w:cs="Arial"/>
+          <w:bCs/>
+          <w:sz w:val="20"/>
+          <w:szCs w:val="20"/>
+          <w:u w:val="single"/>
+        </w:rPr>
+        <w:t>min</w:t>
+      </w:r>
+      <w:r>
+        <w:rPr>
+          <w:rFonts w:ascii="Arial" w:hAnsi="Arial" w:cs="Arial"/>
+          <w:bCs/>
+          <w:sz w:val="20"/>
+          <w:szCs w:val="20"/>
+        </w:rPr>
+        <w:t xml:space="preserve"> is selected, then the period is in minutes</w:t>
+      </w:r>
+      <w:r>
+        <w:rPr>
+          <w:rFonts w:ascii="Arial" w:hAnsi="Arial" w:cs="Arial"/>
+          <w:bCs/>
+          <w:sz w:val="20"/>
+          <w:szCs w:val="20"/>
+        </w:rPr>
+        <w:t xml:space="preserve">.  </w:t>
+      </w:r>
+      <w:r>
+        <w:rPr>
+          <w:rFonts w:ascii="Arial" w:hAnsi="Arial" w:cs="Arial"/>
+          <w:bCs/>
+          <w:sz w:val="20"/>
+          <w:szCs w:val="20"/>
+        </w:rPr>
+        <w:t xml:space="preserve">If </w:t>
+      </w:r>
+      <w:r>
+        <w:rPr>
+          <w:rFonts w:ascii="Arial" w:hAnsi="Arial" w:cs="Arial"/>
+          <w:bCs/>
+          <w:sz w:val="20"/>
+          <w:szCs w:val="20"/>
+          <w:u w:val="single"/>
+        </w:rPr>
+        <w:t>sec</w:t>
+      </w:r>
+      <w:r>
+        <w:rPr>
+          <w:rFonts w:ascii="Arial" w:hAnsi="Arial" w:cs="Arial"/>
+          <w:bCs/>
+          <w:sz w:val="20"/>
+          <w:szCs w:val="20"/>
+        </w:rPr>
+        <w:t xml:space="preserve"> is selected, then </w:t>
+      </w:r>
+      <w:r>
+        <w:rPr>
+          <w:rFonts w:ascii="Arial" w:hAnsi="Arial" w:cs="Arial"/>
+          <w:bCs/>
+          <w:sz w:val="20"/>
+          <w:szCs w:val="20"/>
+        </w:rPr>
+        <w:t xml:space="preserve">the Refresh period will be in seconds.  If in seconds, </w:t>
+      </w:r>
+      <w:r>
+        <w:rPr>
+          <w:rFonts w:ascii="Arial" w:hAnsi="Arial" w:cs="Arial"/>
+          <w:bCs/>
+          <w:sz w:val="20"/>
+          <w:szCs w:val="20"/>
+        </w:rPr>
+        <w:t xml:space="preserve">Hot Pursuit will </w:t>
+      </w:r>
+      <w:r>
+        <w:rPr>
+          <w:rFonts w:ascii="Arial" w:hAnsi="Arial" w:cs="Arial"/>
+          <w:bCs/>
+          <w:sz w:val="20"/>
+          <w:szCs w:val="20"/>
+        </w:rPr>
+        <w:t xml:space="preserve">interpolate </w:t>
+      </w:r>
+      <w:r>
+        <w:rPr>
+          <w:rFonts w:ascii="Arial" w:hAnsi="Arial" w:cs="Arial"/>
+          <w:bCs/>
+          <w:sz w:val="20"/>
+          <w:szCs w:val="20"/>
+        </w:rPr>
+        <w:t xml:space="preserve">the downloaded target rate data </w:t>
+      </w:r>
+      <w:r>
+        <w:rPr>
+          <w:rFonts w:ascii="Arial" w:hAnsi="Arial" w:cs="Arial"/>
+          <w:bCs/>
+          <w:sz w:val="20"/>
+          <w:szCs w:val="20"/>
+        </w:rPr>
+        <w:t xml:space="preserve">at the period set by the </w:t>
+      </w:r>
+      <w:r>
+        <w:rPr>
+          <w:rFonts w:ascii="Arial" w:hAnsi="Arial" w:cs="Arial"/>
+          <w:bCs/>
+          <w:sz w:val="20"/>
+          <w:szCs w:val="20"/>
+        </w:rPr>
+        <w:t>Refresh period.</w:t>
       </w:r>
     </w:p>
     <w:p>
@@ -3580,25 +4084,74 @@
           <w:szCs w:val="20"/>
           <w:u w:val="single"/>
         </w:rPr>
+        <w:t xml:space="preserve">Next </w:t>
+      </w:r>
+      <w:r>
+        <w:rPr>
+          <w:rFonts w:ascii="Arial" w:hAnsi="Arial" w:cs="Arial"/>
+          <w:bCs/>
+          <w:sz w:val="20"/>
+          <w:szCs w:val="20"/>
+          <w:u w:val="single"/>
+        </w:rPr>
         <w:t>Refresh</w:t>
       </w:r>
-      <w:r>
-        <w:rPr>
-          <w:rFonts w:ascii="Arial" w:hAnsi="Arial" w:cs="Arial"/>
-          <w:bCs/>
-          <w:sz w:val="20"/>
-          <w:szCs w:val="20"/>
-        </w:rPr>
-        <w:t xml:space="preserve">: Sets the rate at which the </w:t>
-      </w:r>
-      <w:r>
-        <w:rPr>
-          <w:rFonts w:ascii="Arial" w:hAnsi="Arial" w:cs="Arial"/>
-          <w:bCs/>
-          <w:sz w:val="20"/>
-          <w:szCs w:val="20"/>
-        </w:rPr>
-        <w:t xml:space="preserve">updates </w:t>
+      <w:proofErr w:type="gramStart"/>
+      <w:r>
+        <w:rPr>
+          <w:rFonts w:ascii="Arial" w:hAnsi="Arial" w:cs="Arial"/>
+          <w:bCs/>
+          <w:sz w:val="20"/>
+          <w:szCs w:val="20"/>
+          <w:u w:val="single"/>
+        </w:rPr>
+        <w:t>:</w:t>
+      </w:r>
+      <w:r>
+        <w:rPr>
+          <w:rFonts w:ascii="Arial" w:hAnsi="Arial" w:cs="Arial"/>
+          <w:bCs/>
+          <w:sz w:val="20"/>
+          <w:szCs w:val="20"/>
+        </w:rPr>
+        <w:t xml:space="preserve">  </w:t>
+      </w:r>
+      <w:r>
+        <w:rPr>
+          <w:rFonts w:ascii="Arial" w:hAnsi="Arial" w:cs="Arial"/>
+          <w:bCs/>
+          <w:sz w:val="20"/>
+          <w:szCs w:val="20"/>
+        </w:rPr>
+        <w:t>Number</w:t>
+      </w:r>
+      <w:proofErr w:type="gramEnd"/>
+      <w:r>
+        <w:rPr>
+          <w:rFonts w:ascii="Arial" w:hAnsi="Arial" w:cs="Arial"/>
+          <w:bCs/>
+          <w:sz w:val="20"/>
+          <w:szCs w:val="20"/>
+        </w:rPr>
+        <w:t xml:space="preserve"> of seconds until the next </w:t>
+      </w:r>
+      <w:r>
+        <w:rPr>
+          <w:rFonts w:ascii="Arial" w:hAnsi="Arial" w:cs="Arial"/>
+          <w:bCs/>
+          <w:sz w:val="20"/>
+          <w:szCs w:val="20"/>
+        </w:rPr>
+        <w:t xml:space="preserve">time Hot Pursuit will update the </w:t>
+      </w:r>
+      <w:r>
+        <w:rPr>
+          <w:rFonts w:ascii="Arial" w:hAnsi="Arial" w:cs="Arial"/>
+          <w:bCs/>
+          <w:sz w:val="20"/>
+          <w:szCs w:val="20"/>
+        </w:rPr>
+        <w:t xml:space="preserve">tracking change to </w:t>
       </w:r>
       <w:proofErr w:type="spellStart"/>
       <w:r>
@@ -3618,180 +4171,7 @@
           <w:sz w:val="20"/>
           <w:szCs w:val="20"/>
         </w:rPr>
-        <w:t xml:space="preserve"> </w:t>
-      </w:r>
-      <w:r>
-        <w:rPr>
-          <w:rFonts w:ascii="Arial" w:hAnsi="Arial" w:cs="Arial"/>
-          <w:bCs/>
-          <w:sz w:val="20"/>
-          <w:szCs w:val="20"/>
-        </w:rPr>
-        <w:t xml:space="preserve">tracking </w:t>
-      </w:r>
-      <w:r>
-        <w:rPr>
-          <w:rFonts w:ascii="Arial" w:hAnsi="Arial" w:cs="Arial"/>
-          <w:bCs/>
-          <w:sz w:val="20"/>
-          <w:szCs w:val="20"/>
-        </w:rPr>
-        <w:t>with</w:t>
-      </w:r>
-      <w:r>
-        <w:rPr>
-          <w:rFonts w:ascii="Arial" w:hAnsi="Arial" w:cs="Arial"/>
-          <w:bCs/>
-          <w:sz w:val="20"/>
-          <w:szCs w:val="20"/>
-        </w:rPr>
-        <w:t xml:space="preserve"> new ephemeris </w:t>
-      </w:r>
-      <w:r>
-        <w:rPr>
-          <w:rFonts w:ascii="Arial" w:hAnsi="Arial" w:cs="Arial"/>
-          <w:bCs/>
-          <w:sz w:val="20"/>
-          <w:szCs w:val="20"/>
-        </w:rPr>
-        <w:t xml:space="preserve">rate </w:t>
-      </w:r>
-      <w:r>
-        <w:rPr>
-          <w:rFonts w:ascii="Arial" w:hAnsi="Arial" w:cs="Arial"/>
-          <w:bCs/>
-          <w:sz w:val="20"/>
-          <w:szCs w:val="20"/>
-        </w:rPr>
-        <w:t xml:space="preserve">data.  </w:t>
-      </w:r>
-      <w:r>
-        <w:rPr>
-          <w:rFonts w:ascii="Arial" w:hAnsi="Arial" w:cs="Arial"/>
-          <w:bCs/>
-          <w:sz w:val="20"/>
-          <w:szCs w:val="20"/>
-        </w:rPr>
-        <w:t xml:space="preserve">The minimum period for ephemeris from Scout is 1 minute. </w:t>
-      </w:r>
-      <w:r>
-        <w:rPr>
-          <w:rFonts w:ascii="Arial" w:hAnsi="Arial" w:cs="Arial"/>
-          <w:bCs/>
-          <w:sz w:val="20"/>
-          <w:szCs w:val="20"/>
-        </w:rPr>
-        <w:t xml:space="preserve">  If </w:t>
-      </w:r>
-      <w:r>
-        <w:rPr>
-          <w:rFonts w:ascii="Arial" w:hAnsi="Arial" w:cs="Arial"/>
-          <w:bCs/>
-          <w:sz w:val="20"/>
-          <w:szCs w:val="20"/>
-          <w:u w:val="single"/>
-        </w:rPr>
-        <w:t>min</w:t>
-      </w:r>
-      <w:r>
-        <w:rPr>
-          <w:rFonts w:ascii="Arial" w:hAnsi="Arial" w:cs="Arial"/>
-          <w:bCs/>
-          <w:sz w:val="20"/>
-          <w:szCs w:val="20"/>
-        </w:rPr>
-        <w:t xml:space="preserve"> is selected, then the period is in minutes</w:t>
-      </w:r>
-      <w:r>
-        <w:rPr>
-          <w:rFonts w:ascii="Arial" w:hAnsi="Arial" w:cs="Arial"/>
-          <w:bCs/>
-          <w:sz w:val="20"/>
-          <w:szCs w:val="20"/>
-        </w:rPr>
-        <w:t xml:space="preserve">.  </w:t>
-      </w:r>
-      <w:r>
-        <w:rPr>
-          <w:rFonts w:ascii="Arial" w:hAnsi="Arial" w:cs="Arial"/>
-          <w:bCs/>
-          <w:sz w:val="20"/>
-          <w:szCs w:val="20"/>
-        </w:rPr>
-        <w:t xml:space="preserve">If </w:t>
-      </w:r>
-      <w:r>
-        <w:rPr>
-          <w:rFonts w:ascii="Arial" w:hAnsi="Arial" w:cs="Arial"/>
-          <w:bCs/>
-          <w:sz w:val="20"/>
-          <w:szCs w:val="20"/>
-          <w:u w:val="single"/>
-        </w:rPr>
-        <w:t>sec</w:t>
-      </w:r>
-      <w:r>
-        <w:rPr>
-          <w:rFonts w:ascii="Arial" w:hAnsi="Arial" w:cs="Arial"/>
-          <w:bCs/>
-          <w:sz w:val="20"/>
-          <w:szCs w:val="20"/>
-        </w:rPr>
-        <w:t xml:space="preserve"> is selected, then </w:t>
-      </w:r>
-      <w:r>
-        <w:rPr>
-          <w:rFonts w:ascii="Arial" w:hAnsi="Arial" w:cs="Arial"/>
-          <w:bCs/>
-          <w:sz w:val="20"/>
-          <w:szCs w:val="20"/>
-        </w:rPr>
-        <w:t xml:space="preserve">the Refresh period will be in seconds.  If in seconds, </w:t>
-      </w:r>
-      <w:r>
-        <w:rPr>
-          <w:rFonts w:ascii="Arial" w:hAnsi="Arial" w:cs="Arial"/>
-          <w:bCs/>
-          <w:sz w:val="20"/>
-          <w:szCs w:val="20"/>
-        </w:rPr>
-        <w:t xml:space="preserve">Hot Pursuit will </w:t>
-      </w:r>
-      <w:r>
-        <w:rPr>
-          <w:rFonts w:ascii="Arial" w:hAnsi="Arial" w:cs="Arial"/>
-          <w:bCs/>
-          <w:sz w:val="20"/>
-          <w:szCs w:val="20"/>
-        </w:rPr>
-        <w:t xml:space="preserve">interpolate </w:t>
-      </w:r>
-      <w:r>
-        <w:rPr>
-          <w:rFonts w:ascii="Arial" w:hAnsi="Arial" w:cs="Arial"/>
-          <w:bCs/>
-          <w:sz w:val="20"/>
-          <w:szCs w:val="20"/>
-        </w:rPr>
-        <w:t xml:space="preserve">the downloaded target rate data </w:t>
-      </w:r>
-      <w:r>
-        <w:rPr>
-          <w:rFonts w:ascii="Arial" w:hAnsi="Arial" w:cs="Arial"/>
-          <w:bCs/>
-          <w:sz w:val="20"/>
-          <w:szCs w:val="20"/>
-        </w:rPr>
-        <w:t xml:space="preserve">at the period set by the </w:t>
-      </w:r>
-      <w:r>
-        <w:rPr>
-          <w:rFonts w:ascii="Arial" w:hAnsi="Arial" w:cs="Arial"/>
-          <w:bCs/>
-          <w:sz w:val="20"/>
-          <w:szCs w:val="20"/>
-        </w:rPr>
-        <w:t>Refresh period.</w:t>
+        <w:t>.</w:t>
       </w:r>
     </w:p>
     <w:p>
@@ -3799,95 +4179,31 @@
         <w:rPr>
           <w:rFonts w:ascii="Arial" w:hAnsi="Arial" w:cs="Arial"/>
           <w:bCs/>
-          <w:sz w:val="20"/>
-          <w:szCs w:val="20"/>
-        </w:rPr>
-      </w:pPr>
-      <w:r>
-        <w:rPr>
-          <w:rFonts w:ascii="Arial" w:hAnsi="Arial" w:cs="Arial"/>
-          <w:bCs/>
+          <w:noProof/>
+          <w:sz w:val="20"/>
+          <w:szCs w:val="20"/>
+        </w:rPr>
+      </w:pPr>
+      <w:r>
+        <w:rPr>
+          <w:rFonts w:ascii="Arial" w:hAnsi="Arial" w:cs="Arial"/>
+          <w:bCs/>
+          <w:noProof/>
           <w:sz w:val="20"/>
           <w:szCs w:val="20"/>
           <w:u w:val="single"/>
         </w:rPr>
-        <w:t xml:space="preserve">Next </w:t>
-      </w:r>
-      <w:r>
-        <w:rPr>
-          <w:rFonts w:ascii="Arial" w:hAnsi="Arial" w:cs="Arial"/>
-          <w:bCs/>
-          <w:sz w:val="20"/>
-          <w:szCs w:val="20"/>
-          <w:u w:val="single"/>
-        </w:rPr>
-        <w:t>Refresh</w:t>
-      </w:r>
-      <w:r>
-        <w:rPr>
-          <w:rFonts w:ascii="Arial" w:hAnsi="Arial" w:cs="Arial"/>
-          <w:bCs/>
-          <w:sz w:val="20"/>
-          <w:szCs w:val="20"/>
-          <w:u w:val="single"/>
-        </w:rPr>
-        <w:t>:</w:t>
-      </w:r>
-      <w:r>
-        <w:rPr>
-          <w:rFonts w:ascii="Arial" w:hAnsi="Arial" w:cs="Arial"/>
-          <w:bCs/>
-          <w:sz w:val="20"/>
-          <w:szCs w:val="20"/>
-        </w:rPr>
-        <w:t xml:space="preserve">  </w:t>
-      </w:r>
-      <w:r>
-        <w:rPr>
-          <w:rFonts w:ascii="Arial" w:hAnsi="Arial" w:cs="Arial"/>
-          <w:bCs/>
-          <w:sz w:val="20"/>
-          <w:szCs w:val="20"/>
-        </w:rPr>
-        <w:t xml:space="preserve">Number of seconds until the next </w:t>
-      </w:r>
-      <w:r>
-        <w:rPr>
-          <w:rFonts w:ascii="Arial" w:hAnsi="Arial" w:cs="Arial"/>
-          <w:bCs/>
-          <w:sz w:val="20"/>
-          <w:szCs w:val="20"/>
-        </w:rPr>
-        <w:t xml:space="preserve">time Hot Pursuit will update the </w:t>
-      </w:r>
-      <w:r>
-        <w:rPr>
-          <w:rFonts w:ascii="Arial" w:hAnsi="Arial" w:cs="Arial"/>
-          <w:bCs/>
-          <w:sz w:val="20"/>
-          <w:szCs w:val="20"/>
-        </w:rPr>
-        <w:t xml:space="preserve">tracking change to </w:t>
-      </w:r>
-      <w:proofErr w:type="spellStart"/>
-      <w:r>
-        <w:rPr>
-          <w:rFonts w:ascii="Arial" w:hAnsi="Arial" w:cs="Arial"/>
-          <w:bCs/>
-          <w:sz w:val="20"/>
-          <w:szCs w:val="20"/>
-        </w:rPr>
-        <w:t>TheSky</w:t>
-      </w:r>
-      <w:proofErr w:type="spellEnd"/>
-      <w:r>
-        <w:rPr>
-          <w:rFonts w:ascii="Arial" w:hAnsi="Arial" w:cs="Arial"/>
-          <w:bCs/>
-          <w:sz w:val="20"/>
-          <w:szCs w:val="20"/>
-        </w:rPr>
-        <w:t>.</w:t>
+        <w:t>CLS</w:t>
+      </w:r>
+      <w:r>
+        <w:rPr>
+          <w:rFonts w:ascii="Arial" w:hAnsi="Arial" w:cs="Arial"/>
+          <w:bCs/>
+          <w:noProof/>
+          <w:sz w:val="20"/>
+          <w:szCs w:val="20"/>
+        </w:rPr>
+        <w:t>: If checked, a Closed Loop Slew will be used to iniitially point to the target.  Otherwise a simple slew will be used.</w:t>
       </w:r>
     </w:p>
     <w:p>
@@ -3895,31 +4211,58 @@
         <w:rPr>
           <w:rFonts w:ascii="Arial" w:hAnsi="Arial" w:cs="Arial"/>
           <w:bCs/>
-          <w:noProof/>
-          <w:sz w:val="20"/>
-          <w:szCs w:val="20"/>
-        </w:rPr>
-      </w:pPr>
-      <w:r>
-        <w:rPr>
-          <w:rFonts w:ascii="Arial" w:hAnsi="Arial" w:cs="Arial"/>
-          <w:bCs/>
-          <w:noProof/>
+          <w:sz w:val="20"/>
+          <w:szCs w:val="20"/>
+        </w:rPr>
+      </w:pPr>
+      <w:r>
+        <w:rPr>
+          <w:rFonts w:ascii="Arial" w:hAnsi="Arial" w:cs="Arial"/>
+          <w:bCs/>
           <w:sz w:val="20"/>
           <w:szCs w:val="20"/>
           <w:u w:val="single"/>
         </w:rPr>
-        <w:t>CLS</w:t>
-      </w:r>
-      <w:r>
-        <w:rPr>
-          <w:rFonts w:ascii="Arial" w:hAnsi="Arial" w:cs="Arial"/>
-          <w:bCs/>
-          <w:noProof/>
-          <w:sz w:val="20"/>
-          <w:szCs w:val="20"/>
-        </w:rPr>
-        <w:t>: If checked, a Closed Loop Slew will be used to iniitially point to the target.  Otherwise a simple slew will be used.</w:t>
+        <w:t>On Top</w:t>
+      </w:r>
+      <w:proofErr w:type="gramStart"/>
+      <w:r>
+        <w:rPr>
+          <w:rFonts w:ascii="Arial" w:hAnsi="Arial" w:cs="Arial"/>
+          <w:bCs/>
+          <w:sz w:val="20"/>
+          <w:szCs w:val="20"/>
+          <w:u w:val="single"/>
+        </w:rPr>
+        <w:t>:</w:t>
+      </w:r>
+      <w:r>
+        <w:rPr>
+          <w:rFonts w:ascii="Arial" w:hAnsi="Arial" w:cs="Arial"/>
+          <w:bCs/>
+          <w:sz w:val="20"/>
+          <w:szCs w:val="20"/>
+        </w:rPr>
+        <w:t xml:space="preserve">  </w:t>
+      </w:r>
+      <w:r>
+        <w:rPr>
+          <w:rFonts w:ascii="Arial" w:hAnsi="Arial" w:cs="Arial"/>
+          <w:bCs/>
+          <w:sz w:val="20"/>
+          <w:szCs w:val="20"/>
+        </w:rPr>
+        <w:t>Causes</w:t>
+      </w:r>
+      <w:proofErr w:type="gramEnd"/>
+      <w:r>
+        <w:rPr>
+          <w:rFonts w:ascii="Arial" w:hAnsi="Arial" w:cs="Arial"/>
+          <w:bCs/>
+          <w:sz w:val="20"/>
+          <w:szCs w:val="20"/>
+        </w:rPr>
+        <w:t xml:space="preserve"> the Hot Pursuit window to stay on top of all other windows.</w:t>
       </w:r>
     </w:p>
     <w:p>
@@ -3939,7 +4282,7 @@
           <w:szCs w:val="20"/>
           <w:u w:val="single"/>
         </w:rPr>
-        <w:t>On Top</w:t>
+        <w:t>Tr</w:t>
       </w:r>
       <w:r>
         <w:rPr>
@@ -3949,25 +4292,73 @@
           <w:szCs w:val="20"/>
           <w:u w:val="single"/>
         </w:rPr>
-        <w:t>:</w:t>
-      </w:r>
-      <w:r>
-        <w:rPr>
-          <w:rFonts w:ascii="Arial" w:hAnsi="Arial" w:cs="Arial"/>
-          <w:bCs/>
-          <w:sz w:val="20"/>
-          <w:szCs w:val="20"/>
-        </w:rPr>
-        <w:t xml:space="preserve">  </w:t>
-      </w:r>
-      <w:r>
-        <w:rPr>
-          <w:rFonts w:ascii="Arial" w:hAnsi="Arial" w:cs="Arial"/>
-          <w:bCs/>
-          <w:sz w:val="20"/>
-          <w:szCs w:val="20"/>
-        </w:rPr>
-        <w:t>Causes the Hot Pursuit window to stay on top of all other windows.</w:t>
+        <w:t>ack</w:t>
+      </w:r>
+      <w:r>
+        <w:rPr>
+          <w:rFonts w:ascii="Arial" w:hAnsi="Arial" w:cs="Arial"/>
+          <w:bCs/>
+          <w:sz w:val="20"/>
+          <w:szCs w:val="20"/>
+        </w:rPr>
+        <w:t>: Initiates ephemeris query</w:t>
+      </w:r>
+      <w:r>
+        <w:rPr>
+          <w:rFonts w:ascii="Arial" w:hAnsi="Arial" w:cs="Arial"/>
+          <w:bCs/>
+          <w:sz w:val="20"/>
+          <w:szCs w:val="20"/>
+        </w:rPr>
+        <w:t xml:space="preserve"> followed by</w:t>
+      </w:r>
+      <w:r>
+        <w:rPr>
+          <w:rFonts w:ascii="Arial" w:hAnsi="Arial" w:cs="Arial"/>
+          <w:bCs/>
+          <w:sz w:val="20"/>
+          <w:szCs w:val="20"/>
+        </w:rPr>
+        <w:t xml:space="preserve"> the non-sidereal tracking</w:t>
+      </w:r>
+      <w:r>
+        <w:rPr>
+          <w:rFonts w:ascii="Arial" w:hAnsi="Arial" w:cs="Arial"/>
+          <w:bCs/>
+          <w:sz w:val="20"/>
+          <w:szCs w:val="20"/>
+        </w:rPr>
+        <w:t xml:space="preserve"> for the entered target.  </w:t>
+      </w:r>
+      <w:r>
+        <w:rPr>
+          <w:rFonts w:ascii="Arial" w:hAnsi="Arial" w:cs="Arial"/>
+          <w:bCs/>
+          <w:sz w:val="20"/>
+          <w:szCs w:val="20"/>
+        </w:rPr>
+        <w:t>Tracking is updated at per the Refresh period.</w:t>
+      </w:r>
+      <w:r>
+        <w:rPr>
+          <w:noProof/>
+        </w:rPr>
+        <w:t xml:space="preserve"> </w:t>
+      </w:r>
+      <w:r>
+        <w:rPr>
+          <w:noProof/>
+        </w:rPr>
+        <w:t xml:space="preserve">Clicking on Track when the background is red </w:t>
+      </w:r>
+      <w:r>
+        <w:rPr>
+          <w:rFonts w:ascii="Arial" w:hAnsi="Arial" w:cs="Arial"/>
+          <w:bCs/>
+          <w:sz w:val="20"/>
+          <w:szCs w:val="20"/>
+        </w:rPr>
+        <w:t>cancels the non-sidereal tracking updates, and aborts imaging (if active), but does not close the program</w:t>
       </w:r>
     </w:p>
     <w:p>
@@ -3987,58 +4378,63 @@
           <w:szCs w:val="20"/>
           <w:u w:val="single"/>
         </w:rPr>
-        <w:t>Start</w:t>
-      </w:r>
-      <w:r>
-        <w:rPr>
-          <w:rFonts w:ascii="Arial" w:hAnsi="Arial" w:cs="Arial"/>
-          <w:bCs/>
-          <w:sz w:val="20"/>
-          <w:szCs w:val="20"/>
-        </w:rPr>
-        <w:t>: Initiates ephemeris query</w:t>
-      </w:r>
-      <w:r>
-        <w:rPr>
-          <w:rFonts w:ascii="Arial" w:hAnsi="Arial" w:cs="Arial"/>
-          <w:bCs/>
-          <w:sz w:val="20"/>
-          <w:szCs w:val="20"/>
-        </w:rPr>
-        <w:t xml:space="preserve"> followed by</w:t>
-      </w:r>
-      <w:r>
-        <w:rPr>
-          <w:rFonts w:ascii="Arial" w:hAnsi="Arial" w:cs="Arial"/>
-          <w:bCs/>
-          <w:sz w:val="20"/>
-          <w:szCs w:val="20"/>
-        </w:rPr>
-        <w:t xml:space="preserve"> the non-sidereal tracking</w:t>
-      </w:r>
-      <w:r>
-        <w:rPr>
-          <w:rFonts w:ascii="Arial" w:hAnsi="Arial" w:cs="Arial"/>
-          <w:bCs/>
-          <w:sz w:val="20"/>
-          <w:szCs w:val="20"/>
-        </w:rPr>
-        <w:t xml:space="preserve"> for the entered target.  </w:t>
-      </w:r>
-      <w:r>
-        <w:rPr>
-          <w:rFonts w:ascii="Arial" w:hAnsi="Arial" w:cs="Arial"/>
-          <w:bCs/>
-          <w:sz w:val="20"/>
-          <w:szCs w:val="20"/>
-        </w:rPr>
-        <w:t>Tracking is updated at per the Refresh period.</w:t>
-      </w:r>
-      <w:r>
-        <w:rPr>
-          <w:noProof/>
-        </w:rPr>
-        <w:t xml:space="preserve"> </w:t>
+        <w:t>Trail</w:t>
+      </w:r>
+      <w:proofErr w:type="gramStart"/>
+      <w:r>
+        <w:rPr>
+          <w:rFonts w:ascii="Arial" w:hAnsi="Arial" w:cs="Arial"/>
+          <w:bCs/>
+          <w:sz w:val="20"/>
+          <w:szCs w:val="20"/>
+        </w:rPr>
+        <w:t>:</w:t>
+      </w:r>
+      <w:r>
+        <w:rPr>
+          <w:rFonts w:ascii="Arial" w:hAnsi="Arial" w:cs="Arial"/>
+          <w:bCs/>
+          <w:sz w:val="20"/>
+          <w:szCs w:val="20"/>
+        </w:rPr>
+        <w:t xml:space="preserve">  Turns</w:t>
+      </w:r>
+      <w:proofErr w:type="gramEnd"/>
+      <w:r>
+        <w:rPr>
+          <w:rFonts w:ascii="Arial" w:hAnsi="Arial" w:cs="Arial"/>
+          <w:bCs/>
+          <w:sz w:val="20"/>
+          <w:szCs w:val="20"/>
+        </w:rPr>
+        <w:t xml:space="preserve"> on the main camera autoguiding using the brightest star found in </w:t>
+      </w:r>
+      <w:r>
+        <w:rPr>
+          <w:rFonts w:ascii="Arial" w:hAnsi="Arial" w:cs="Arial"/>
+          <w:bCs/>
+          <w:sz w:val="20"/>
+          <w:szCs w:val="20"/>
+        </w:rPr>
+        <w:t>the camera image which can keep the target centered during</w:t>
+      </w:r>
+      <w:r>
+        <w:rPr>
+          <w:rFonts w:ascii="Arial" w:hAnsi="Arial" w:cs="Arial"/>
+          <w:bCs/>
+          <w:sz w:val="20"/>
+          <w:szCs w:val="20"/>
+        </w:rPr>
+        <w:t xml:space="preserve"> inaccurate</w:t>
+      </w:r>
+      <w:r>
+        <w:rPr>
+          <w:rFonts w:ascii="Arial" w:hAnsi="Arial" w:cs="Arial"/>
+          <w:bCs/>
+          <w:sz w:val="20"/>
+          <w:szCs w:val="20"/>
+        </w:rPr>
+        <w:t xml:space="preserve"> tracking.</w:t>
       </w:r>
     </w:p>
     <w:p>
@@ -4058,103 +4454,16 @@
           <w:szCs w:val="20"/>
           <w:u w:val="single"/>
         </w:rPr>
-        <w:t>Stop</w:t>
-      </w:r>
-      <w:r>
-        <w:rPr>
-          <w:rFonts w:ascii="Arial" w:hAnsi="Arial" w:cs="Arial"/>
-          <w:bCs/>
-          <w:sz w:val="20"/>
-          <w:szCs w:val="20"/>
-        </w:rPr>
-        <w:t xml:space="preserve">: Cancels the </w:t>
-      </w:r>
-      <w:r>
-        <w:rPr>
-          <w:rFonts w:ascii="Arial" w:hAnsi="Arial" w:cs="Arial"/>
-          <w:bCs/>
-          <w:sz w:val="20"/>
-          <w:szCs w:val="20"/>
-        </w:rPr>
-        <w:t>non-sidereal</w:t>
-      </w:r>
-      <w:r>
-        <w:rPr>
-          <w:rFonts w:ascii="Arial" w:hAnsi="Arial" w:cs="Arial"/>
-          <w:bCs/>
-          <w:sz w:val="20"/>
-          <w:szCs w:val="20"/>
-        </w:rPr>
-        <w:t xml:space="preserve"> </w:t>
-      </w:r>
-      <w:r>
-        <w:rPr>
-          <w:rFonts w:ascii="Arial" w:hAnsi="Arial" w:cs="Arial"/>
-          <w:bCs/>
-          <w:sz w:val="20"/>
-          <w:szCs w:val="20"/>
-        </w:rPr>
-        <w:t xml:space="preserve">tracking </w:t>
-      </w:r>
-      <w:r>
-        <w:rPr>
-          <w:rFonts w:ascii="Arial" w:hAnsi="Arial" w:cs="Arial"/>
-          <w:bCs/>
-          <w:sz w:val="20"/>
-          <w:szCs w:val="20"/>
-        </w:rPr>
-        <w:t>update</w:t>
-      </w:r>
-      <w:r>
-        <w:rPr>
-          <w:rFonts w:ascii="Arial" w:hAnsi="Arial" w:cs="Arial"/>
-          <w:bCs/>
-          <w:sz w:val="20"/>
-          <w:szCs w:val="20"/>
-        </w:rPr>
-        <w:t>s</w:t>
-      </w:r>
-      <w:r>
-        <w:rPr>
-          <w:rFonts w:ascii="Arial" w:hAnsi="Arial" w:cs="Arial"/>
-          <w:bCs/>
-          <w:sz w:val="20"/>
-          <w:szCs w:val="20"/>
-        </w:rPr>
-        <w:t xml:space="preserve">, </w:t>
-      </w:r>
-      <w:r>
-        <w:rPr>
-          <w:rFonts w:ascii="Arial" w:hAnsi="Arial" w:cs="Arial"/>
-          <w:bCs/>
-          <w:sz w:val="20"/>
-          <w:szCs w:val="20"/>
-        </w:rPr>
-        <w:t>and aborts imaging</w:t>
-      </w:r>
-      <w:r>
-        <w:rPr>
-          <w:rFonts w:ascii="Arial" w:hAnsi="Arial" w:cs="Arial"/>
-          <w:bCs/>
-          <w:sz w:val="20"/>
-          <w:szCs w:val="20"/>
-        </w:rPr>
-        <w:t xml:space="preserve"> (if active)</w:t>
-      </w:r>
-      <w:r>
-        <w:rPr>
-          <w:rFonts w:ascii="Arial" w:hAnsi="Arial" w:cs="Arial"/>
-          <w:bCs/>
-          <w:sz w:val="20"/>
-          <w:szCs w:val="20"/>
-        </w:rPr>
-        <w:t>, but does not close the program.</w:t>
-      </w:r>
-      <w:r>
-        <w:rPr>
-          <w:noProof/>
-        </w:rPr>
-        <w:t xml:space="preserve"> </w:t>
+        <w:t>Close</w:t>
+      </w:r>
+      <w:r>
+        <w:rPr>
+          <w:rFonts w:ascii="Arial" w:hAnsi="Arial" w:cs="Arial"/>
+          <w:bCs/>
+          <w:sz w:val="20"/>
+          <w:szCs w:val="20"/>
+        </w:rPr>
+        <w:t>: Closes the program.</w:t>
       </w:r>
     </w:p>
     <w:p>
@@ -4162,28 +4471,42 @@
         <w:rPr>
           <w:rFonts w:ascii="Arial" w:hAnsi="Arial" w:cs="Arial"/>
           <w:bCs/>
-          <w:sz w:val="20"/>
-          <w:szCs w:val="20"/>
-        </w:rPr>
-      </w:pPr>
-      <w:r>
-        <w:rPr>
-          <w:rFonts w:ascii="Arial" w:hAnsi="Arial" w:cs="Arial"/>
-          <w:bCs/>
+          <w:noProof/>
+          <w:sz w:val="20"/>
+          <w:szCs w:val="20"/>
+        </w:rPr>
+      </w:pPr>
+      <w:r>
+        <w:rPr>
+          <w:rFonts w:ascii="Arial" w:hAnsi="Arial" w:cs="Arial"/>
+          <w:bCs/>
+          <w:noProof/>
           <w:sz w:val="20"/>
           <w:szCs w:val="20"/>
           <w:u w:val="single"/>
         </w:rPr>
-        <w:t>Close</w:t>
-      </w:r>
-      <w:r>
-        <w:rPr>
-          <w:rFonts w:ascii="Arial" w:hAnsi="Arial" w:cs="Arial"/>
-          <w:bCs/>
-          <w:sz w:val="20"/>
-          <w:szCs w:val="20"/>
-        </w:rPr>
-        <w:t>: Closes the program.</w:t>
+        <w:t>RA Rate</w:t>
+      </w:r>
+      <w:r>
+        <w:rPr>
+          <w:rFonts w:ascii="Arial" w:hAnsi="Arial" w:cs="Arial"/>
+          <w:bCs/>
+          <w:noProof/>
+          <w:sz w:val="20"/>
+          <w:szCs w:val="20"/>
+          <w:u w:val="single"/>
+        </w:rPr>
+        <w:t>:</w:t>
+      </w:r>
+      <w:r>
+        <w:rPr>
+          <w:rFonts w:ascii="Arial" w:hAnsi="Arial" w:cs="Arial"/>
+          <w:bCs/>
+          <w:noProof/>
+          <w:sz w:val="20"/>
+          <w:szCs w:val="20"/>
+        </w:rPr>
+        <w:t xml:space="preserve">  Rate of change in arcsec per minute of RA, corrected for the observer’s location.</w:t>
       </w:r>
     </w:p>
     <w:p>
@@ -4191,24 +4514,27 @@
         <w:rPr>
           <w:rFonts w:ascii="Arial" w:hAnsi="Arial" w:cs="Arial"/>
           <w:bCs/>
-          <w:sz w:val="20"/>
-          <w:szCs w:val="20"/>
-        </w:rPr>
-      </w:pPr>
-      <w:r>
-        <w:rPr>
-          <w:rFonts w:ascii="Arial" w:hAnsi="Arial" w:cs="Arial"/>
-          <w:bCs/>
+          <w:noProof/>
+          <w:sz w:val="20"/>
+          <w:szCs w:val="20"/>
+        </w:rPr>
+      </w:pPr>
+      <w:r>
+        <w:rPr>
+          <w:rFonts w:ascii="Arial" w:hAnsi="Arial" w:cs="Arial"/>
+          <w:bCs/>
+          <w:noProof/>
           <w:sz w:val="20"/>
           <w:szCs w:val="20"/>
           <w:u w:val="single"/>
         </w:rPr>
-        <w:t>QAD Imaging</w:t>
-      </w:r>
-      <w:r>
-        <w:rPr>
-          <w:rFonts w:ascii="Arial" w:hAnsi="Arial" w:cs="Arial"/>
-          <w:bCs/>
+        <w:t>Dec Rate</w:t>
+      </w:r>
+      <w:r>
+        <w:rPr>
+          <w:rFonts w:ascii="Arial" w:hAnsi="Arial" w:cs="Arial"/>
+          <w:bCs/>
+          <w:noProof/>
           <w:sz w:val="20"/>
           <w:szCs w:val="20"/>
           <w:u w:val="single"/>
@@ -4219,48 +4545,11 @@
         <w:rPr>
           <w:rFonts w:ascii="Arial" w:hAnsi="Arial" w:cs="Arial"/>
           <w:bCs/>
-          <w:sz w:val="20"/>
-          <w:szCs w:val="20"/>
-        </w:rPr>
-        <w:t xml:space="preserve">  </w:t>
-      </w:r>
-      <w:r>
-        <w:rPr>
-          <w:rFonts w:ascii="Arial" w:hAnsi="Arial" w:cs="Arial"/>
-          <w:bCs/>
-          <w:sz w:val="20"/>
-          <w:szCs w:val="20"/>
-        </w:rPr>
-        <w:t xml:space="preserve">These fields and commands are provided for simple one-shot imaging </w:t>
-      </w:r>
-      <w:r>
-        <w:rPr>
-          <w:rFonts w:ascii="Arial" w:hAnsi="Arial" w:cs="Arial"/>
-          <w:bCs/>
-          <w:sz w:val="20"/>
-          <w:szCs w:val="20"/>
-        </w:rPr>
-        <w:t xml:space="preserve">using automation of </w:t>
-      </w:r>
-      <w:proofErr w:type="spellStart"/>
-      <w:r>
-        <w:rPr>
-          <w:rFonts w:ascii="Arial" w:hAnsi="Arial" w:cs="Arial"/>
-          <w:bCs/>
-          <w:sz w:val="20"/>
-          <w:szCs w:val="20"/>
-        </w:rPr>
-        <w:t>TheSky</w:t>
-      </w:r>
-      <w:proofErr w:type="spellEnd"/>
-      <w:r>
-        <w:rPr>
-          <w:rFonts w:ascii="Arial" w:hAnsi="Arial" w:cs="Arial"/>
-          <w:bCs/>
-          <w:sz w:val="20"/>
-          <w:szCs w:val="20"/>
-        </w:rPr>
-        <w:t>.</w:t>
+          <w:noProof/>
+          <w:sz w:val="20"/>
+          <w:szCs w:val="20"/>
+        </w:rPr>
+        <w:t xml:space="preserve">  Rate of change in arcsec per minute of Dec, corrected for the observer’s location.</w:t>
       </w:r>
     </w:p>
     <w:p>
@@ -4270,18 +4559,9 @@
           <w:bCs/>
           <w:sz w:val="20"/>
           <w:szCs w:val="20"/>
-        </w:rPr>
-      </w:pPr>
-      <w:r>
-        <w:rPr>
-          <w:rFonts w:ascii="Arial" w:hAnsi="Arial" w:cs="Arial"/>
-          <w:bCs/>
-          <w:sz w:val="20"/>
-          <w:szCs w:val="20"/>
           <w:u w:val="single"/>
         </w:rPr>
-        <w:t>Exposure</w:t>
-      </w:r>
+      </w:pPr>
       <w:r>
         <w:rPr>
           <w:rFonts w:ascii="Arial" w:hAnsi="Arial" w:cs="Arial"/>
@@ -4290,25 +4570,26 @@
           <w:szCs w:val="20"/>
           <w:u w:val="single"/>
         </w:rPr>
-        <w:t>:</w:t>
-      </w:r>
-      <w:r>
-        <w:rPr>
-          <w:rFonts w:ascii="Arial" w:hAnsi="Arial" w:cs="Arial"/>
-          <w:bCs/>
-          <w:sz w:val="20"/>
-          <w:szCs w:val="20"/>
+        <w:t>Range</w:t>
+      </w:r>
+      <w:r>
+        <w:rPr>
+          <w:rFonts w:ascii="Arial" w:hAnsi="Arial" w:cs="Arial"/>
+          <w:bCs/>
+          <w:sz w:val="20"/>
+          <w:szCs w:val="20"/>
+        </w:rPr>
+        <w:t>: Distance to the target in AU.</w:t>
+      </w:r>
+      <w:r>
+        <w:rPr>
+          <w:rFonts w:ascii="Arial" w:hAnsi="Arial" w:cs="Arial"/>
+          <w:bCs/>
+          <w:sz w:val="20"/>
+          <w:szCs w:val="20"/>
+          <w:u w:val="single"/>
         </w:rPr>
         <w:t xml:space="preserve"> </w:t>
-      </w:r>
-      <w:r>
-        <w:rPr>
-          <w:rFonts w:ascii="Arial" w:hAnsi="Arial" w:cs="Arial"/>
-          <w:bCs/>
-          <w:sz w:val="20"/>
-          <w:szCs w:val="20"/>
-        </w:rPr>
-        <w:t xml:space="preserve"> Length in seconds of image to be taken.</w:t>
       </w:r>
     </w:p>
     <w:p>
@@ -4328,8 +4609,9 @@
           <w:szCs w:val="20"/>
           <w:u w:val="single"/>
         </w:rPr>
-        <w:t>Filter</w:t>
-      </w:r>
+        <w:t>QAD Imaging</w:t>
+      </w:r>
+      <w:proofErr w:type="gramStart"/>
       <w:r>
         <w:rPr>
           <w:rFonts w:ascii="Arial" w:hAnsi="Arial" w:cs="Arial"/>
@@ -4356,25 +4638,46 @@
           <w:sz w:val="20"/>
           <w:szCs w:val="20"/>
         </w:rPr>
-        <w:t>Drop down box for choosing the f</w:t>
-      </w:r>
-      <w:r>
-        <w:rPr>
-          <w:rFonts w:ascii="Arial" w:hAnsi="Arial" w:cs="Arial"/>
-          <w:bCs/>
-          <w:sz w:val="20"/>
-          <w:szCs w:val="20"/>
-        </w:rPr>
-        <w:t>ilter to be used for imag</w:t>
-      </w:r>
-      <w:r>
-        <w:rPr>
-          <w:rFonts w:ascii="Arial" w:hAnsi="Arial" w:cs="Arial"/>
-          <w:bCs/>
-          <w:sz w:val="20"/>
-          <w:szCs w:val="20"/>
-        </w:rPr>
-        <w:t>ing from the list of filter wheel filter names.</w:t>
+        <w:t>These</w:t>
+      </w:r>
+      <w:proofErr w:type="gramEnd"/>
+      <w:r>
+        <w:rPr>
+          <w:rFonts w:ascii="Arial" w:hAnsi="Arial" w:cs="Arial"/>
+          <w:bCs/>
+          <w:sz w:val="20"/>
+          <w:szCs w:val="20"/>
+        </w:rPr>
+        <w:t xml:space="preserve"> fields and commands are provided for simple one-shot imaging </w:t>
+      </w:r>
+      <w:r>
+        <w:rPr>
+          <w:rFonts w:ascii="Arial" w:hAnsi="Arial" w:cs="Arial"/>
+          <w:bCs/>
+          <w:sz w:val="20"/>
+          <w:szCs w:val="20"/>
+        </w:rPr>
+        <w:t xml:space="preserve">using automation of </w:t>
+      </w:r>
+      <w:proofErr w:type="spellStart"/>
+      <w:r>
+        <w:rPr>
+          <w:rFonts w:ascii="Arial" w:hAnsi="Arial" w:cs="Arial"/>
+          <w:bCs/>
+          <w:sz w:val="20"/>
+          <w:szCs w:val="20"/>
+        </w:rPr>
+        <w:t>TheSky</w:t>
+      </w:r>
+      <w:proofErr w:type="spellEnd"/>
+      <w:r>
+        <w:rPr>
+          <w:rFonts w:ascii="Arial" w:hAnsi="Arial" w:cs="Arial"/>
+          <w:bCs/>
+          <w:sz w:val="20"/>
+          <w:szCs w:val="20"/>
+        </w:rPr>
+        <w:t>.</w:t>
       </w:r>
     </w:p>
     <w:p>
@@ -4394,25 +4697,46 @@
           <w:szCs w:val="20"/>
           <w:u w:val="single"/>
         </w:rPr>
-        <w:t>Reps:</w:t>
-      </w:r>
-      <w:r>
-        <w:rPr>
-          <w:rFonts w:ascii="Arial" w:hAnsi="Arial" w:cs="Arial"/>
-          <w:bCs/>
-          <w:sz w:val="20"/>
-          <w:szCs w:val="20"/>
-        </w:rPr>
-        <w:t xml:space="preserve">  </w:t>
-      </w:r>
-      <w:r>
-        <w:rPr>
-          <w:rFonts w:ascii="Arial" w:hAnsi="Arial" w:cs="Arial"/>
-          <w:bCs/>
-          <w:sz w:val="20"/>
-          <w:szCs w:val="20"/>
-        </w:rPr>
-        <w:t>Number of images to take sequentially.</w:t>
+        <w:t>Exposure</w:t>
+      </w:r>
+      <w:proofErr w:type="gramStart"/>
+      <w:r>
+        <w:rPr>
+          <w:rFonts w:ascii="Arial" w:hAnsi="Arial" w:cs="Arial"/>
+          <w:bCs/>
+          <w:sz w:val="20"/>
+          <w:szCs w:val="20"/>
+          <w:u w:val="single"/>
+        </w:rPr>
+        <w:t>:</w:t>
+      </w:r>
+      <w:r>
+        <w:rPr>
+          <w:rFonts w:ascii="Arial" w:hAnsi="Arial" w:cs="Arial"/>
+          <w:bCs/>
+          <w:sz w:val="20"/>
+          <w:szCs w:val="20"/>
+        </w:rPr>
+        <w:t xml:space="preserve"> </w:t>
+      </w:r>
+      <w:r>
+        <w:rPr>
+          <w:rFonts w:ascii="Arial" w:hAnsi="Arial" w:cs="Arial"/>
+          <w:bCs/>
+          <w:sz w:val="20"/>
+          <w:szCs w:val="20"/>
+        </w:rPr>
+        <w:t xml:space="preserve"> Length</w:t>
+      </w:r>
+      <w:proofErr w:type="gramEnd"/>
+      <w:r>
+        <w:rPr>
+          <w:rFonts w:ascii="Arial" w:hAnsi="Arial" w:cs="Arial"/>
+          <w:bCs/>
+          <w:sz w:val="20"/>
+          <w:szCs w:val="20"/>
+        </w:rPr>
+        <w:t xml:space="preserve"> in seconds of image to be taken.</w:t>
       </w:r>
     </w:p>
     <w:p>
@@ -4432,8 +4756,9 @@
           <w:szCs w:val="20"/>
           <w:u w:val="single"/>
         </w:rPr>
-        <w:t>Settle</w:t>
-      </w:r>
+        <w:t>Filter</w:t>
+      </w:r>
+      <w:proofErr w:type="gramStart"/>
       <w:r>
         <w:rPr>
           <w:rFonts w:ascii="Arial" w:hAnsi="Arial" w:cs="Arial"/>
@@ -4460,107 +4785,7 @@
           <w:sz w:val="20"/>
           <w:szCs w:val="20"/>
         </w:rPr>
-        <w:t xml:space="preserve">The number of seconds to delay the start of image capture after </w:t>
-      </w:r>
-      <w:r>
-        <w:rPr>
-          <w:rFonts w:ascii="Arial" w:hAnsi="Arial" w:cs="Arial"/>
-          <w:bCs/>
-          <w:sz w:val="20"/>
-          <w:szCs w:val="20"/>
-        </w:rPr>
-        <w:t>a</w:t>
-      </w:r>
-      <w:r>
-        <w:rPr>
-          <w:rFonts w:ascii="Arial" w:hAnsi="Arial" w:cs="Arial"/>
-          <w:bCs/>
-          <w:sz w:val="20"/>
-          <w:szCs w:val="20"/>
-        </w:rPr>
-        <w:t xml:space="preserve"> Slew or</w:t>
-      </w:r>
-      <w:r>
-        <w:rPr>
-          <w:rFonts w:ascii="Arial" w:hAnsi="Arial" w:cs="Arial"/>
-          <w:bCs/>
-          <w:sz w:val="20"/>
-          <w:szCs w:val="20"/>
-        </w:rPr>
-        <w:t xml:space="preserve"> </w:t>
-      </w:r>
-      <w:r>
-        <w:rPr>
-          <w:rFonts w:ascii="Arial" w:hAnsi="Arial" w:cs="Arial"/>
-          <w:bCs/>
-          <w:sz w:val="20"/>
-          <w:szCs w:val="20"/>
-        </w:rPr>
-        <w:t>C</w:t>
-      </w:r>
-      <w:r>
-        <w:rPr>
-          <w:rFonts w:ascii="Arial" w:hAnsi="Arial" w:cs="Arial"/>
-          <w:bCs/>
-          <w:sz w:val="20"/>
-          <w:szCs w:val="20"/>
-        </w:rPr>
-        <w:t xml:space="preserve">losed </w:t>
-      </w:r>
-      <w:r>
-        <w:rPr>
-          <w:rFonts w:ascii="Arial" w:hAnsi="Arial" w:cs="Arial"/>
-          <w:bCs/>
-          <w:sz w:val="20"/>
-          <w:szCs w:val="20"/>
-        </w:rPr>
-        <w:t>L</w:t>
-      </w:r>
-      <w:r>
-        <w:rPr>
-          <w:rFonts w:ascii="Arial" w:hAnsi="Arial" w:cs="Arial"/>
-          <w:bCs/>
-          <w:sz w:val="20"/>
-          <w:szCs w:val="20"/>
-        </w:rPr>
-        <w:t xml:space="preserve">oop </w:t>
-      </w:r>
-      <w:r>
-        <w:rPr>
-          <w:rFonts w:ascii="Arial" w:hAnsi="Arial" w:cs="Arial"/>
-          <w:bCs/>
-          <w:sz w:val="20"/>
-          <w:szCs w:val="20"/>
-        </w:rPr>
-        <w:t>S</w:t>
-      </w:r>
-      <w:r>
-        <w:rPr>
-          <w:rFonts w:ascii="Arial" w:hAnsi="Arial" w:cs="Arial"/>
-          <w:bCs/>
-          <w:sz w:val="20"/>
-          <w:szCs w:val="20"/>
-        </w:rPr>
-        <w:t>lew</w:t>
-      </w:r>
-      <w:r>
-        <w:rPr>
-          <w:rFonts w:ascii="Arial" w:hAnsi="Arial" w:cs="Arial"/>
-          <w:bCs/>
-          <w:sz w:val="20"/>
-          <w:szCs w:val="20"/>
-        </w:rPr>
-        <w:t xml:space="preserve"> </w:t>
-      </w:r>
-      <w:proofErr w:type="gramStart"/>
-      <w:r>
-        <w:rPr>
-          <w:rFonts w:ascii="Arial" w:hAnsi="Arial" w:cs="Arial"/>
-          <w:bCs/>
-          <w:sz w:val="20"/>
-          <w:szCs w:val="20"/>
-        </w:rPr>
-        <w:t>in order for</w:t>
+        <w:t>Drop</w:t>
       </w:r>
       <w:proofErr w:type="gramEnd"/>
       <w:r>
@@ -4570,7 +4795,25 @@
           <w:sz w:val="20"/>
           <w:szCs w:val="20"/>
         </w:rPr>
-        <w:t xml:space="preserve"> the mount to settle.</w:t>
+        <w:t xml:space="preserve"> down box for choosing the f</w:t>
+      </w:r>
+      <w:r>
+        <w:rPr>
+          <w:rFonts w:ascii="Arial" w:hAnsi="Arial" w:cs="Arial"/>
+          <w:bCs/>
+          <w:sz w:val="20"/>
+          <w:szCs w:val="20"/>
+        </w:rPr>
+        <w:t>ilter to be used for imag</w:t>
+      </w:r>
+      <w:r>
+        <w:rPr>
+          <w:rFonts w:ascii="Arial" w:hAnsi="Arial" w:cs="Arial"/>
+          <w:bCs/>
+          <w:sz w:val="20"/>
+          <w:szCs w:val="20"/>
+        </w:rPr>
+        <w:t>ing from the list of filter wheel filter names.</w:t>
       </w:r>
     </w:p>
     <w:p>
@@ -4590,8 +4833,9 @@
           <w:szCs w:val="20"/>
           <w:u w:val="single"/>
         </w:rPr>
-        <w:t>Recenter</w:t>
-      </w:r>
+        <w:t>Reps</w:t>
+      </w:r>
+      <w:proofErr w:type="gramStart"/>
       <w:r>
         <w:rPr>
           <w:rFonts w:ascii="Arial" w:hAnsi="Arial" w:cs="Arial"/>
@@ -4609,52 +4853,26 @@
           <w:sz w:val="20"/>
           <w:szCs w:val="20"/>
         </w:rPr>
-        <w:t xml:space="preserve">  If checked, Hot Pursuits will perfo</w:t>
-      </w:r>
-      <w:r>
-        <w:rPr>
-          <w:rFonts w:ascii="Arial" w:hAnsi="Arial" w:cs="Arial"/>
-          <w:bCs/>
-          <w:sz w:val="20"/>
-          <w:szCs w:val="20"/>
-        </w:rPr>
-        <w:t>rm a Closed Loop Slew to the current target coordinates</w:t>
-      </w:r>
-      <w:r>
-        <w:rPr>
-          <w:rFonts w:ascii="Arial" w:hAnsi="Arial" w:cs="Arial"/>
-          <w:bCs/>
-          <w:sz w:val="20"/>
-          <w:szCs w:val="20"/>
-        </w:rPr>
-        <w:t xml:space="preserve"> before each image exposure.  This feature ensures the </w:t>
-      </w:r>
-      <w:r>
-        <w:rPr>
-          <w:rFonts w:ascii="Arial" w:hAnsi="Arial" w:cs="Arial"/>
-          <w:bCs/>
-          <w:sz w:val="20"/>
-          <w:szCs w:val="20"/>
-        </w:rPr>
-        <w:t xml:space="preserve">target remains locked to the center of every image </w:t>
-      </w:r>
-      <w:r>
-        <w:rPr>
-          <w:rFonts w:ascii="Arial" w:hAnsi="Arial" w:cs="Arial"/>
-          <w:bCs/>
-          <w:sz w:val="20"/>
-          <w:szCs w:val="20"/>
-        </w:rPr>
-        <w:t xml:space="preserve">identically for every shot.  </w:t>
-      </w:r>
-      <w:r>
-        <w:rPr>
-          <w:rFonts w:ascii="Arial" w:hAnsi="Arial" w:cs="Arial"/>
-          <w:bCs/>
-          <w:sz w:val="20"/>
-          <w:szCs w:val="20"/>
-        </w:rPr>
-        <w:t>This feature is especially useful for unregistered image stacking.</w:t>
+        <w:t xml:space="preserve">  </w:t>
+      </w:r>
+      <w:r>
+        <w:rPr>
+          <w:rFonts w:ascii="Arial" w:hAnsi="Arial" w:cs="Arial"/>
+          <w:bCs/>
+          <w:sz w:val="20"/>
+          <w:szCs w:val="20"/>
+        </w:rPr>
+        <w:t>Number</w:t>
+      </w:r>
+      <w:proofErr w:type="gramEnd"/>
+      <w:r>
+        <w:rPr>
+          <w:rFonts w:ascii="Arial" w:hAnsi="Arial" w:cs="Arial"/>
+          <w:bCs/>
+          <w:sz w:val="20"/>
+          <w:szCs w:val="20"/>
+        </w:rPr>
+        <w:t xml:space="preserve"> of images to take sequentially.</w:t>
       </w:r>
     </w:p>
     <w:p>
@@ -4674,8 +4892,9 @@
           <w:szCs w:val="20"/>
           <w:u w:val="single"/>
         </w:rPr>
-        <w:t>Reduce</w:t>
-      </w:r>
+        <w:t>Recenter</w:t>
+      </w:r>
+      <w:proofErr w:type="gramStart"/>
       <w:r>
         <w:rPr>
           <w:rFonts w:ascii="Arial" w:hAnsi="Arial" w:cs="Arial"/>
@@ -4693,7 +4912,62 @@
           <w:sz w:val="20"/>
           <w:szCs w:val="20"/>
         </w:rPr>
-        <w:t xml:space="preserve">  Turns on full image reduction.  See below for details of preparation.</w:t>
+        <w:t xml:space="preserve">  If</w:t>
+      </w:r>
+      <w:proofErr w:type="gramEnd"/>
+      <w:r>
+        <w:rPr>
+          <w:rFonts w:ascii="Arial" w:hAnsi="Arial" w:cs="Arial"/>
+          <w:bCs/>
+          <w:sz w:val="20"/>
+          <w:szCs w:val="20"/>
+        </w:rPr>
+        <w:t xml:space="preserve"> checked, Hot Pursuits will perfo</w:t>
+      </w:r>
+      <w:r>
+        <w:rPr>
+          <w:rFonts w:ascii="Arial" w:hAnsi="Arial" w:cs="Arial"/>
+          <w:bCs/>
+          <w:sz w:val="20"/>
+          <w:szCs w:val="20"/>
+        </w:rPr>
+        <w:t>rm a Closed Loop Slew to the current target coordinates</w:t>
+      </w:r>
+      <w:r>
+        <w:rPr>
+          <w:rFonts w:ascii="Arial" w:hAnsi="Arial" w:cs="Arial"/>
+          <w:bCs/>
+          <w:sz w:val="20"/>
+          <w:szCs w:val="20"/>
+        </w:rPr>
+        <w:t xml:space="preserve"> before each image exposure.  This feature ensures the </w:t>
+      </w:r>
+      <w:r>
+        <w:rPr>
+          <w:rFonts w:ascii="Arial" w:hAnsi="Arial" w:cs="Arial"/>
+          <w:bCs/>
+          <w:sz w:val="20"/>
+          <w:szCs w:val="20"/>
+        </w:rPr>
+        <w:t xml:space="preserve">target remains locked to the center of every image </w:t>
+      </w:r>
+      <w:r>
+        <w:rPr>
+          <w:rFonts w:ascii="Arial" w:hAnsi="Arial" w:cs="Arial"/>
+          <w:bCs/>
+          <w:sz w:val="20"/>
+          <w:szCs w:val="20"/>
+        </w:rPr>
+        <w:t xml:space="preserve">identically for every shot.  </w:t>
+      </w:r>
+      <w:r>
+        <w:rPr>
+          <w:rFonts w:ascii="Arial" w:hAnsi="Arial" w:cs="Arial"/>
+          <w:bCs/>
+          <w:sz w:val="20"/>
+          <w:szCs w:val="20"/>
+        </w:rPr>
+        <w:t>This feature is especially useful for unregistered image stacking.</w:t>
       </w:r>
     </w:p>
     <w:p>
@@ -4713,54 +4987,37 @@
           <w:szCs w:val="20"/>
           <w:u w:val="single"/>
         </w:rPr>
-        <w:t>Image:</w:t>
-      </w:r>
-      <w:r>
-        <w:rPr>
-          <w:rFonts w:ascii="Arial" w:hAnsi="Arial" w:cs="Arial"/>
-          <w:bCs/>
-          <w:sz w:val="20"/>
-          <w:szCs w:val="20"/>
-        </w:rPr>
-        <w:t xml:space="preserve">  Initiates imaging </w:t>
-      </w:r>
-      <w:r>
-        <w:rPr>
-          <w:rFonts w:ascii="Arial" w:hAnsi="Arial" w:cs="Arial"/>
-          <w:bCs/>
-          <w:sz w:val="20"/>
-          <w:szCs w:val="20"/>
-        </w:rPr>
-        <w:t>using</w:t>
-      </w:r>
-      <w:r>
-        <w:rPr>
-          <w:rFonts w:ascii="Arial" w:hAnsi="Arial" w:cs="Arial"/>
-          <w:bCs/>
-          <w:sz w:val="20"/>
-          <w:szCs w:val="20"/>
-        </w:rPr>
-        <w:t xml:space="preserve"> </w:t>
-      </w:r>
-      <w:proofErr w:type="spellStart"/>
-      <w:r>
-        <w:rPr>
-          <w:rFonts w:ascii="Arial" w:hAnsi="Arial" w:cs="Arial"/>
-          <w:bCs/>
-          <w:sz w:val="20"/>
-          <w:szCs w:val="20"/>
-        </w:rPr>
-        <w:t>TheSky</w:t>
-      </w:r>
-      <w:proofErr w:type="spellEnd"/>
-      <w:r>
-        <w:rPr>
-          <w:rFonts w:ascii="Arial" w:hAnsi="Arial" w:cs="Arial"/>
-          <w:bCs/>
-          <w:sz w:val="20"/>
-          <w:szCs w:val="20"/>
-        </w:rPr>
-        <w:t>.</w:t>
+        <w:t>Reduce</w:t>
+      </w:r>
+      <w:proofErr w:type="gramStart"/>
+      <w:r>
+        <w:rPr>
+          <w:rFonts w:ascii="Arial" w:hAnsi="Arial" w:cs="Arial"/>
+          <w:bCs/>
+          <w:sz w:val="20"/>
+          <w:szCs w:val="20"/>
+          <w:u w:val="single"/>
+        </w:rPr>
+        <w:t>:</w:t>
+      </w:r>
+      <w:r>
+        <w:rPr>
+          <w:rFonts w:ascii="Arial" w:hAnsi="Arial" w:cs="Arial"/>
+          <w:bCs/>
+          <w:sz w:val="20"/>
+          <w:szCs w:val="20"/>
+        </w:rPr>
+        <w:t xml:space="preserve">  Turns</w:t>
+      </w:r>
+      <w:proofErr w:type="gramEnd"/>
+      <w:r>
+        <w:rPr>
+          <w:rFonts w:ascii="Arial" w:hAnsi="Arial" w:cs="Arial"/>
+          <w:bCs/>
+          <w:sz w:val="20"/>
+          <w:szCs w:val="20"/>
+        </w:rPr>
+        <w:t xml:space="preserve"> on full image reduction.  See below for details of preparation.</w:t>
       </w:r>
     </w:p>
     <w:p>
@@ -4780,61 +5037,75 @@
           <w:szCs w:val="20"/>
           <w:u w:val="single"/>
         </w:rPr>
-        <w:t>Status Box</w:t>
-      </w:r>
-      <w:r>
-        <w:rPr>
-          <w:rFonts w:ascii="Arial" w:hAnsi="Arial" w:cs="Arial"/>
-          <w:bCs/>
-          <w:sz w:val="20"/>
-          <w:szCs w:val="20"/>
-        </w:rPr>
-        <w:t xml:space="preserve">: This area contains </w:t>
-      </w:r>
-      <w:r>
-        <w:rPr>
-          <w:rFonts w:ascii="Arial" w:hAnsi="Arial" w:cs="Arial"/>
-          <w:bCs/>
-          <w:sz w:val="20"/>
-          <w:szCs w:val="20"/>
-        </w:rPr>
-        <w:t>log information about what’s going on under the covers.  This info</w:t>
-      </w:r>
-      <w:r>
-        <w:rPr>
-          <w:rFonts w:ascii="Arial" w:hAnsi="Arial" w:cs="Arial"/>
-          <w:bCs/>
-          <w:sz w:val="20"/>
-          <w:szCs w:val="20"/>
-        </w:rPr>
-        <w:t xml:space="preserve">rmation is also stored in a text file found in the user’s Documents directory </w:t>
-      </w:r>
-      <w:r>
-        <w:rPr>
-          <w:rFonts w:ascii="Arial" w:hAnsi="Arial" w:cs="Arial"/>
-          <w:bCs/>
-          <w:sz w:val="20"/>
-          <w:szCs w:val="20"/>
-        </w:rPr>
-        <w:t>folder “Hot Pursuit”</w:t>
-      </w:r>
-      <w:r>
-        <w:rPr>
-          <w:rFonts w:ascii="Arial" w:hAnsi="Arial" w:cs="Arial"/>
-          <w:bCs/>
-          <w:sz w:val="20"/>
-          <w:szCs w:val="20"/>
-        </w:rPr>
-        <w:t xml:space="preserve"> in the “Log” directory under a filename “&lt;date&gt;</w:t>
-      </w:r>
-      <w:r>
-        <w:rPr>
-          <w:rFonts w:ascii="Arial" w:hAnsi="Arial" w:cs="Arial"/>
-          <w:bCs/>
-          <w:sz w:val="20"/>
-          <w:szCs w:val="20"/>
-        </w:rPr>
-        <w:t>.txt”.</w:t>
+        <w:t>Image</w:t>
+      </w:r>
+      <w:proofErr w:type="gramStart"/>
+      <w:r>
+        <w:rPr>
+          <w:rFonts w:ascii="Arial" w:hAnsi="Arial" w:cs="Arial"/>
+          <w:bCs/>
+          <w:sz w:val="20"/>
+          <w:szCs w:val="20"/>
+          <w:u w:val="single"/>
+        </w:rPr>
+        <w:t>:</w:t>
+      </w:r>
+      <w:r>
+        <w:rPr>
+          <w:rFonts w:ascii="Arial" w:hAnsi="Arial" w:cs="Arial"/>
+          <w:bCs/>
+          <w:sz w:val="20"/>
+          <w:szCs w:val="20"/>
+        </w:rPr>
+        <w:t xml:space="preserve">  Initiates</w:t>
+      </w:r>
+      <w:proofErr w:type="gramEnd"/>
+      <w:r>
+        <w:rPr>
+          <w:rFonts w:ascii="Arial" w:hAnsi="Arial" w:cs="Arial"/>
+          <w:bCs/>
+          <w:sz w:val="20"/>
+          <w:szCs w:val="20"/>
+        </w:rPr>
+        <w:t xml:space="preserve"> imaging </w:t>
+      </w:r>
+      <w:r>
+        <w:rPr>
+          <w:rFonts w:ascii="Arial" w:hAnsi="Arial" w:cs="Arial"/>
+          <w:bCs/>
+          <w:sz w:val="20"/>
+          <w:szCs w:val="20"/>
+        </w:rPr>
+        <w:t>using</w:t>
+      </w:r>
+      <w:r>
+        <w:rPr>
+          <w:rFonts w:ascii="Arial" w:hAnsi="Arial" w:cs="Arial"/>
+          <w:bCs/>
+          <w:sz w:val="20"/>
+          <w:szCs w:val="20"/>
+        </w:rPr>
+        <w:t xml:space="preserve"> </w:t>
+      </w:r>
+      <w:proofErr w:type="spellStart"/>
+      <w:r>
+        <w:rPr>
+          <w:rFonts w:ascii="Arial" w:hAnsi="Arial" w:cs="Arial"/>
+          <w:bCs/>
+          <w:sz w:val="20"/>
+          <w:szCs w:val="20"/>
+        </w:rPr>
+        <w:t>TheSky</w:t>
+      </w:r>
+      <w:proofErr w:type="spellEnd"/>
+      <w:r>
+        <w:rPr>
+          <w:rFonts w:ascii="Arial" w:hAnsi="Arial" w:cs="Arial"/>
+          <w:bCs/>
+          <w:sz w:val="20"/>
+          <w:szCs w:val="20"/>
+        </w:rPr>
+        <w:t>.</w:t>
       </w:r>
     </w:p>
     <w:p>
@@ -4844,12 +5115,76 @@
           <w:bCs/>
           <w:sz w:val="20"/>
           <w:szCs w:val="20"/>
+        </w:rPr>
+      </w:pPr>
+      <w:r>
+        <w:rPr>
+          <w:rFonts w:ascii="Arial" w:hAnsi="Arial" w:cs="Arial"/>
+          <w:bCs/>
+          <w:sz w:val="20"/>
+          <w:szCs w:val="20"/>
           <w:u w:val="single"/>
         </w:rPr>
-      </w:pPr>
+        <w:t>Status Box</w:t>
+      </w:r>
+      <w:r>
+        <w:rPr>
+          <w:rFonts w:ascii="Arial" w:hAnsi="Arial" w:cs="Arial"/>
+          <w:bCs/>
+          <w:sz w:val="20"/>
+          <w:szCs w:val="20"/>
+        </w:rPr>
+        <w:t xml:space="preserve">: This area contains </w:t>
+      </w:r>
+      <w:r>
+        <w:rPr>
+          <w:rFonts w:ascii="Arial" w:hAnsi="Arial" w:cs="Arial"/>
+          <w:bCs/>
+          <w:sz w:val="20"/>
+          <w:szCs w:val="20"/>
+        </w:rPr>
+        <w:t>log information about what’s going on under the covers.  This info</w:t>
+      </w:r>
+      <w:r>
+        <w:rPr>
+          <w:rFonts w:ascii="Arial" w:hAnsi="Arial" w:cs="Arial"/>
+          <w:bCs/>
+          <w:sz w:val="20"/>
+          <w:szCs w:val="20"/>
+        </w:rPr>
+        <w:t xml:space="preserve">rmation is also stored in a text file found in the user’s Documents directory </w:t>
+      </w:r>
+      <w:r>
+        <w:rPr>
+          <w:rFonts w:ascii="Arial" w:hAnsi="Arial" w:cs="Arial"/>
+          <w:bCs/>
+          <w:sz w:val="20"/>
+          <w:szCs w:val="20"/>
+        </w:rPr>
+        <w:t>folder “Hot Pursuit”</w:t>
+      </w:r>
+      <w:r>
+        <w:rPr>
+          <w:rFonts w:ascii="Arial" w:hAnsi="Arial" w:cs="Arial"/>
+          <w:bCs/>
+          <w:sz w:val="20"/>
+          <w:szCs w:val="20"/>
+        </w:rPr>
+        <w:t xml:space="preserve"> in the “Log” directory under a filename “&lt;date&gt;</w:t>
+      </w:r>
+      <w:r>
+        <w:rPr>
+          <w:rFonts w:ascii="Arial" w:hAnsi="Arial" w:cs="Arial"/>
+          <w:bCs/>
+          <w:sz w:val="20"/>
+          <w:szCs w:val="20"/>
+        </w:rPr>
+        <w:t>.txt”.</w:t>
+      </w:r>
     </w:p>
     <w:p>
       <w:pPr>
+        <w:keepNext/>
         <w:rPr>
           <w:rFonts w:ascii="Arial" w:hAnsi="Arial" w:cs="Arial"/>
           <w:b/>
@@ -4866,12 +5201,12 @@
           <w:szCs w:val="24"/>
           <w:u w:val="single"/>
         </w:rPr>
-        <w:lastRenderedPageBreak/>
         <w:t xml:space="preserve">Structure </w:t>
       </w:r>
     </w:p>
     <w:p>
       <w:pPr>
+        <w:keepNext/>
         <w:rPr>
           <w:rFonts w:ascii="Arial" w:hAnsi="Arial" w:cs="Arial"/>
           <w:b/>
@@ -4883,6 +5218,7 @@
     </w:p>
     <w:p>
       <w:pPr>
+        <w:keepNext/>
         <w:jc w:val="center"/>
         <w:rPr>
           <w:rFonts w:ascii="Arial" w:hAnsi="Arial" w:cs="Arial"/>
@@ -4912,10 +5248,10 @@
                     <pic:cNvPicPr/>
                   </pic:nvPicPr>
                   <pic:blipFill>
-                    <a:blip r:embed="rId12">
+                    <a:blip r:embed="rId10">
                       <a:extLst>
                         <a:ext uri="{96DAC541-7B7A-43D3-8B79-37D633B846F1}">
-                          <asvg:svgBlip xmlns:asvg="http://schemas.microsoft.com/office/drawing/2016/SVG/main" r:embed="rId13"/>
+                          <asvg:svgBlip xmlns:asvg="http://schemas.microsoft.com/office/drawing/2016/SVG/main" r:embed="rId11"/>
                         </a:ext>
                       </a:extLst>
                     </a:blip>
@@ -4980,7 +5316,6 @@
           <w:szCs w:val="24"/>
           <w:u w:val="single"/>
         </w:rPr>
-        <w:lastRenderedPageBreak/>
         <w:drawing>
           <wp:inline distT="0" distB="0" distL="0" distR="0" wp14:anchorId="2B13E41B" wp14:editId="6E081F32">
             <wp:extent cx="6858000" cy="4236085"/>
@@ -4997,7 +5332,7 @@
                     <pic:cNvPicPr/>
                   </pic:nvPicPr>
                   <pic:blipFill>
-                    <a:blip r:embed="rId14"/>
+                    <a:blip r:embed="rId12"/>
                     <a:stretch>
                       <a:fillRect/>
                     </a:stretch>
@@ -5263,7 +5598,27 @@
           <w:sz w:val="20"/>
           <w:szCs w:val="20"/>
         </w:rPr>
-        <w:t xml:space="preserve">is acquired from Horizons, then the translation is unnecessary as Horizons will compute ephemeris based on </w:t>
+        <w:t xml:space="preserve">is </w:t>
+      </w:r>
+      <w:proofErr w:type="gramStart"/>
+      <w:r>
+        <w:rPr>
+          <w:rFonts w:ascii="Arial" w:hAnsi="Arial" w:cs="Arial"/>
+          <w:bCs/>
+          <w:sz w:val="20"/>
+          <w:szCs w:val="20"/>
+        </w:rPr>
+        <w:t>acquired</w:t>
+      </w:r>
+      <w:proofErr w:type="gramEnd"/>
+      <w:r>
+        <w:rPr>
+          <w:rFonts w:ascii="Arial" w:hAnsi="Arial" w:cs="Arial"/>
+          <w:bCs/>
+          <w:sz w:val="20"/>
+          <w:szCs w:val="20"/>
+        </w:rPr>
+        <w:t xml:space="preserve"> from Horizons, then the translation is unnecessary as Horizons will compute ephemeris based on </w:t>
       </w:r>
       <w:r>
         <w:rPr>
@@ -5808,7 +6163,6 @@
           <w:szCs w:val="24"/>
           <w:u w:val="single"/>
         </w:rPr>
-        <w:lastRenderedPageBreak/>
         <w:t>Support</w:t>
       </w:r>
     </w:p>
@@ -5826,15 +6180,51 @@
           <w:sz w:val="20"/>
           <w:szCs w:val="20"/>
         </w:rPr>
-        <w:t xml:space="preserve">This application was written for the public domain and as such is unsupported. </w:t>
-      </w:r>
-      <w:r>
-        <w:rPr>
-          <w:rFonts w:ascii="Arial" w:hAnsi="Arial" w:cs="Arial"/>
-          <w:sz w:val="20"/>
-          <w:szCs w:val="20"/>
-        </w:rPr>
-        <w:t>The developer would happily entertain questions or suggestion and may update the application occasionally as time permits.  Otherwise, t</w:t>
+        <w:t xml:space="preserve">This application was written for the </w:t>
+      </w:r>
+      <w:proofErr w:type="gramStart"/>
+      <w:r>
+        <w:rPr>
+          <w:rFonts w:ascii="Arial" w:hAnsi="Arial" w:cs="Arial"/>
+          <w:sz w:val="20"/>
+          <w:szCs w:val="20"/>
+        </w:rPr>
+        <w:t>public domain</w:t>
+      </w:r>
+      <w:proofErr w:type="gramEnd"/>
+      <w:r>
+        <w:rPr>
+          <w:rFonts w:ascii="Arial" w:hAnsi="Arial" w:cs="Arial"/>
+          <w:sz w:val="20"/>
+          <w:szCs w:val="20"/>
+        </w:rPr>
+        <w:t xml:space="preserve"> and as such is unsupported. </w:t>
+      </w:r>
+      <w:r>
+        <w:rPr>
+          <w:rFonts w:ascii="Arial" w:hAnsi="Arial" w:cs="Arial"/>
+          <w:sz w:val="20"/>
+          <w:szCs w:val="20"/>
+        </w:rPr>
+        <w:t xml:space="preserve">The developer would happily entertain questions or </w:t>
+      </w:r>
+      <w:proofErr w:type="gramStart"/>
+      <w:r>
+        <w:rPr>
+          <w:rFonts w:ascii="Arial" w:hAnsi="Arial" w:cs="Arial"/>
+          <w:sz w:val="20"/>
+          <w:szCs w:val="20"/>
+        </w:rPr>
+        <w:t>suggestion</w:t>
+      </w:r>
+      <w:proofErr w:type="gramEnd"/>
+      <w:r>
+        <w:rPr>
+          <w:rFonts w:ascii="Arial" w:hAnsi="Arial" w:cs="Arial"/>
+          <w:sz w:val="20"/>
+          <w:szCs w:val="20"/>
+        </w:rPr>
+        <w:t xml:space="preserve"> and may update the application occasionally as time permits.  Otherwise, t</w:t>
       </w:r>
       <w:r>
         <w:rPr>
@@ -5919,8 +6309,9 @@
           <w:szCs w:val="24"/>
           <w:u w:val="single"/>
         </w:rPr>
-        <w:t xml:space="preserve">Appendix 1:  </w:t>
-      </w:r>
+        <w:t>Appendix 1</w:t>
+      </w:r>
+      <w:proofErr w:type="gramStart"/>
       <w:r>
         <w:rPr>
           <w:rFonts w:ascii="Arial" w:hAnsi="Arial" w:cs="Arial"/>
@@ -5929,7 +6320,28 @@
           <w:szCs w:val="24"/>
           <w:u w:val="single"/>
         </w:rPr>
-        <w:t>Image Calibration Library Set Up</w:t>
+        <w:t xml:space="preserve">:  </w:t>
+      </w:r>
+      <w:r>
+        <w:rPr>
+          <w:rFonts w:ascii="Arial" w:hAnsi="Arial" w:cs="Arial"/>
+          <w:b/>
+          <w:sz w:val="24"/>
+          <w:szCs w:val="24"/>
+          <w:u w:val="single"/>
+        </w:rPr>
+        <w:t>Image</w:t>
+      </w:r>
+      <w:proofErr w:type="gramEnd"/>
+      <w:r>
+        <w:rPr>
+          <w:rFonts w:ascii="Arial" w:hAnsi="Arial" w:cs="Arial"/>
+          <w:b/>
+          <w:sz w:val="24"/>
+          <w:szCs w:val="24"/>
+          <w:u w:val="single"/>
+        </w:rPr>
+        <w:t xml:space="preserve"> Calibration Library Set Up</w:t>
       </w:r>
     </w:p>
     <w:p>
@@ -6026,13 +6438,15 @@
           <w:rFonts w:ascii="Arial" w:hAnsi="Arial" w:cs="Arial"/>
           <w:sz w:val="20"/>
           <w:szCs w:val="20"/>
-        </w:rPr>
-      </w:pPr>
-      <w:r>
-        <w:rPr>
-          <w:rFonts w:ascii="Arial" w:hAnsi="Arial" w:cs="Arial"/>
-          <w:sz w:val="20"/>
-          <w:szCs w:val="20"/>
+          <w:lang w:val="fr-FR"/>
+        </w:rPr>
+      </w:pPr>
+      <w:r>
+        <w:rPr>
+          <w:rFonts w:ascii="Arial" w:hAnsi="Arial" w:cs="Arial"/>
+          <w:sz w:val="20"/>
+          <w:szCs w:val="20"/>
+          <w:lang w:val="fr-FR"/>
         </w:rPr>
         <w:t>B&lt;b&gt;_T&lt;t&gt;_E&lt;e&gt;_F&lt;f&gt;</w:t>
       </w:r>
@@ -6048,6 +6462,7 @@
           <w:rFonts w:ascii="Arial" w:hAnsi="Arial" w:cs="Arial"/>
           <w:sz w:val="20"/>
           <w:szCs w:val="20"/>
+          <w:lang w:val="fr-FR"/>
         </w:rPr>
       </w:pPr>
     </w:p>
@@ -6070,26 +6485,17 @@
           <w:color w:val="008000"/>
           <w:sz w:val="20"/>
           <w:szCs w:val="20"/>
+          <w:lang w:val="fr-FR"/>
         </w:rPr>
         <w:t xml:space="preserve"> </w:t>
       </w:r>
-      <w:proofErr w:type="gramStart"/>
-      <w:r>
-        <w:rPr>
-          <w:rFonts w:ascii="Arial" w:hAnsi="Arial" w:cs="Arial"/>
-          <w:sz w:val="20"/>
-          <w:szCs w:val="20"/>
-        </w:rPr>
-        <w:t>where</w:t>
-      </w:r>
-      <w:proofErr w:type="gramEnd"/>
-      <w:r>
-        <w:rPr>
-          <w:rFonts w:ascii="Arial" w:hAnsi="Arial" w:cs="Arial"/>
-          <w:sz w:val="20"/>
-          <w:szCs w:val="20"/>
-        </w:rPr>
-        <w:t xml:space="preserve"> </w:t>
+      <w:r>
+        <w:rPr>
+          <w:rFonts w:ascii="Arial" w:hAnsi="Arial" w:cs="Arial"/>
+          <w:sz w:val="20"/>
+          <w:szCs w:val="20"/>
+        </w:rPr>
+        <w:t xml:space="preserve">where </w:t>
       </w:r>
     </w:p>
     <w:p>
@@ -6153,18 +6559,8 @@
           <w:sz w:val="20"/>
           <w:szCs w:val="20"/>
         </w:rPr>
-        <w:t xml:space="preserve">1x1”, “2x2”, </w:t>
-      </w:r>
-      <w:proofErr w:type="spellStart"/>
-      <w:r>
-        <w:rPr>
-          <w:rFonts w:ascii="Arial" w:hAnsi="Arial" w:cs="Arial"/>
-          <w:sz w:val="20"/>
-          <w:szCs w:val="20"/>
-        </w:rPr>
-        <w:t>etc</w:t>
-      </w:r>
-      <w:proofErr w:type="spellEnd"/>
+        <w:t>1x1”, “2x2”, etc</w:t>
+      </w:r>
     </w:p>
     <w:p>
       <w:pPr>
@@ -6177,6 +6573,7 @@
           <w:rFonts w:ascii="Arial" w:hAnsi="Arial" w:cs="Arial"/>
           <w:sz w:val="20"/>
           <w:szCs w:val="20"/>
+          <w:lang w:val="fr-FR"/>
         </w:rPr>
       </w:pPr>
       <w:r>
@@ -6186,34 +6583,42 @@
           <w:iCs/>
           <w:sz w:val="20"/>
           <w:szCs w:val="20"/>
-        </w:rPr>
-        <w:t>&lt;t&gt;</w:t>
-      </w:r>
-      <w:r>
-        <w:rPr>
-          <w:rFonts w:ascii="Arial" w:hAnsi="Arial" w:cs="Arial"/>
-          <w:sz w:val="20"/>
-          <w:szCs w:val="20"/>
-        </w:rPr>
-        <w:t xml:space="preserve"> = temperature in Centigrade</w:t>
+          <w:lang w:val="fr-FR"/>
+        </w:rPr>
+        <w:t>&lt;</w:t>
       </w:r>
       <w:proofErr w:type="gramStart"/>
       <w:r>
         <w:rPr>
           <w:rFonts w:ascii="Arial" w:hAnsi="Arial" w:cs="Arial"/>
-          <w:sz w:val="20"/>
-          <w:szCs w:val="20"/>
-        </w:rPr>
-        <w:t>:  “</w:t>
+          <w:i/>
+          <w:iCs/>
+          <w:sz w:val="20"/>
+          <w:szCs w:val="20"/>
+          <w:lang w:val="fr-FR"/>
+        </w:rPr>
+        <w:t>t</w:t>
       </w:r>
       <w:proofErr w:type="gramEnd"/>
       <w:r>
         <w:rPr>
           <w:rFonts w:ascii="Arial" w:hAnsi="Arial" w:cs="Arial"/>
-          <w:sz w:val="20"/>
-          <w:szCs w:val="20"/>
-        </w:rPr>
-        <w:t>-</w:t>
+          <w:i/>
+          <w:iCs/>
+          <w:sz w:val="20"/>
+          <w:szCs w:val="20"/>
+          <w:lang w:val="fr-FR"/>
+        </w:rPr>
+        <w:t>&gt;</w:t>
+      </w:r>
+      <w:r>
+        <w:rPr>
+          <w:rFonts w:ascii="Arial" w:hAnsi="Arial" w:cs="Arial"/>
+          <w:sz w:val="20"/>
+          <w:szCs w:val="20"/>
+          <w:lang w:val="fr-FR"/>
+        </w:rPr>
+        <w:t xml:space="preserve"> = </w:t>
       </w:r>
       <w:proofErr w:type="spellStart"/>
       <w:r>
@@ -6221,6 +6626,47 @@
           <w:rFonts w:ascii="Arial" w:hAnsi="Arial" w:cs="Arial"/>
           <w:sz w:val="20"/>
           <w:szCs w:val="20"/>
+          <w:lang w:val="fr-FR"/>
+        </w:rPr>
+        <w:t>temperature</w:t>
+      </w:r>
+      <w:proofErr w:type="spellEnd"/>
+      <w:r>
+        <w:rPr>
+          <w:rFonts w:ascii="Arial" w:hAnsi="Arial" w:cs="Arial"/>
+          <w:sz w:val="20"/>
+          <w:szCs w:val="20"/>
+          <w:lang w:val="fr-FR"/>
+        </w:rPr>
+        <w:t xml:space="preserve"> in </w:t>
+      </w:r>
+      <w:proofErr w:type="gramStart"/>
+      <w:r>
+        <w:rPr>
+          <w:rFonts w:ascii="Arial" w:hAnsi="Arial" w:cs="Arial"/>
+          <w:sz w:val="20"/>
+          <w:szCs w:val="20"/>
+          <w:lang w:val="fr-FR"/>
+        </w:rPr>
+        <w:t>Centigrade:</w:t>
+      </w:r>
+      <w:proofErr w:type="gramEnd"/>
+      <w:r>
+        <w:rPr>
+          <w:rFonts w:ascii="Arial" w:hAnsi="Arial" w:cs="Arial"/>
+          <w:sz w:val="20"/>
+          <w:szCs w:val="20"/>
+          <w:lang w:val="fr-FR"/>
+        </w:rPr>
+        <w:t xml:space="preserve">  “-</w:t>
+      </w:r>
+      <w:proofErr w:type="spellStart"/>
+      <w:r>
+        <w:rPr>
+          <w:rFonts w:ascii="Arial" w:hAnsi="Arial" w:cs="Arial"/>
+          <w:sz w:val="20"/>
+          <w:szCs w:val="20"/>
+          <w:lang w:val="fr-FR"/>
         </w:rPr>
         <w:t>x.x</w:t>
       </w:r>
@@ -6230,6 +6676,7 @@
           <w:rFonts w:ascii="Arial" w:hAnsi="Arial" w:cs="Arial"/>
           <w:sz w:val="20"/>
           <w:szCs w:val="20"/>
+          <w:lang w:val="fr-FR"/>
         </w:rPr>
         <w:t>”</w:t>
       </w:r>
@@ -6245,6 +6692,7 @@
           <w:rFonts w:ascii="Arial" w:hAnsi="Arial" w:cs="Arial"/>
           <w:sz w:val="20"/>
           <w:szCs w:val="20"/>
+          <w:lang w:val="fr-FR"/>
         </w:rPr>
       </w:pPr>
       <w:r>
@@ -6254,16 +6702,82 @@
           <w:iCs/>
           <w:sz w:val="20"/>
           <w:szCs w:val="20"/>
-        </w:rPr>
-        <w:t>&lt;e&gt;</w:t>
-      </w:r>
-      <w:r>
-        <w:rPr>
-          <w:rFonts w:ascii="Arial" w:hAnsi="Arial" w:cs="Arial"/>
-          <w:sz w:val="20"/>
-          <w:szCs w:val="20"/>
-        </w:rPr>
-        <w:t xml:space="preserve"> = exposure in seconds: “e.ee”</w:t>
+          <w:lang w:val="fr-FR"/>
+        </w:rPr>
+        <w:t>&lt;</w:t>
+      </w:r>
+      <w:proofErr w:type="gramStart"/>
+      <w:r>
+        <w:rPr>
+          <w:rFonts w:ascii="Arial" w:hAnsi="Arial" w:cs="Arial"/>
+          <w:i/>
+          <w:iCs/>
+          <w:sz w:val="20"/>
+          <w:szCs w:val="20"/>
+          <w:lang w:val="fr-FR"/>
+        </w:rPr>
+        <w:t>e</w:t>
+      </w:r>
+      <w:proofErr w:type="gramEnd"/>
+      <w:r>
+        <w:rPr>
+          <w:rFonts w:ascii="Arial" w:hAnsi="Arial" w:cs="Arial"/>
+          <w:i/>
+          <w:iCs/>
+          <w:sz w:val="20"/>
+          <w:szCs w:val="20"/>
+          <w:lang w:val="fr-FR"/>
+        </w:rPr>
+        <w:t>&gt;</w:t>
+      </w:r>
+      <w:r>
+        <w:rPr>
+          <w:rFonts w:ascii="Arial" w:hAnsi="Arial" w:cs="Arial"/>
+          <w:sz w:val="20"/>
+          <w:szCs w:val="20"/>
+          <w:lang w:val="fr-FR"/>
+        </w:rPr>
+        <w:t xml:space="preserve"> = </w:t>
+      </w:r>
+      <w:proofErr w:type="spellStart"/>
+      <w:r>
+        <w:rPr>
+          <w:rFonts w:ascii="Arial" w:hAnsi="Arial" w:cs="Arial"/>
+          <w:sz w:val="20"/>
+          <w:szCs w:val="20"/>
+          <w:lang w:val="fr-FR"/>
+        </w:rPr>
+        <w:t>exposure</w:t>
+      </w:r>
+      <w:proofErr w:type="spellEnd"/>
+      <w:r>
+        <w:rPr>
+          <w:rFonts w:ascii="Arial" w:hAnsi="Arial" w:cs="Arial"/>
+          <w:sz w:val="20"/>
+          <w:szCs w:val="20"/>
+          <w:lang w:val="fr-FR"/>
+        </w:rPr>
+        <w:t xml:space="preserve"> in </w:t>
+      </w:r>
+      <w:proofErr w:type="gramStart"/>
+      <w:r>
+        <w:rPr>
+          <w:rFonts w:ascii="Arial" w:hAnsi="Arial" w:cs="Arial"/>
+          <w:sz w:val="20"/>
+          <w:szCs w:val="20"/>
+          <w:lang w:val="fr-FR"/>
+        </w:rPr>
+        <w:t>seconds:</w:t>
+      </w:r>
+      <w:proofErr w:type="gramEnd"/>
+      <w:r>
+        <w:rPr>
+          <w:rFonts w:ascii="Arial" w:hAnsi="Arial" w:cs="Arial"/>
+          <w:sz w:val="20"/>
+          <w:szCs w:val="20"/>
+          <w:lang w:val="fr-FR"/>
+        </w:rPr>
+        <w:t xml:space="preserve"> “e.ee”</w:t>
       </w:r>
     </w:p>
     <w:p>
@@ -6277,6 +6791,7 @@
           <w:rFonts w:ascii="Arial" w:hAnsi="Arial" w:cs="Arial"/>
           <w:sz w:val="20"/>
           <w:szCs w:val="20"/>
+          <w:lang w:val="fr-FR"/>
         </w:rPr>
       </w:pPr>
       <w:r>
@@ -6286,16 +6801,42 @@
           <w:iCs/>
           <w:sz w:val="20"/>
           <w:szCs w:val="20"/>
-        </w:rPr>
-        <w:t>&lt;f&gt;</w:t>
-      </w:r>
-      <w:r>
-        <w:rPr>
-          <w:rFonts w:ascii="Arial" w:hAnsi="Arial" w:cs="Arial"/>
-          <w:sz w:val="20"/>
-          <w:szCs w:val="20"/>
-        </w:rPr>
-        <w:t xml:space="preserve"> = filter name: “C”, “R”, “B”, “V”, </w:t>
+          <w:lang w:val="fr-FR"/>
+        </w:rPr>
+        <w:t>&lt;</w:t>
+      </w:r>
+      <w:proofErr w:type="gramStart"/>
+      <w:r>
+        <w:rPr>
+          <w:rFonts w:ascii="Arial" w:hAnsi="Arial" w:cs="Arial"/>
+          <w:i/>
+          <w:iCs/>
+          <w:sz w:val="20"/>
+          <w:szCs w:val="20"/>
+          <w:lang w:val="fr-FR"/>
+        </w:rPr>
+        <w:t>f</w:t>
+      </w:r>
+      <w:proofErr w:type="gramEnd"/>
+      <w:r>
+        <w:rPr>
+          <w:rFonts w:ascii="Arial" w:hAnsi="Arial" w:cs="Arial"/>
+          <w:i/>
+          <w:iCs/>
+          <w:sz w:val="20"/>
+          <w:szCs w:val="20"/>
+          <w:lang w:val="fr-FR"/>
+        </w:rPr>
+        <w:t>&gt;</w:t>
+      </w:r>
+      <w:r>
+        <w:rPr>
+          <w:rFonts w:ascii="Arial" w:hAnsi="Arial" w:cs="Arial"/>
+          <w:sz w:val="20"/>
+          <w:szCs w:val="20"/>
+          <w:lang w:val="fr-FR"/>
+        </w:rPr>
+        <w:t xml:space="preserve"> = </w:t>
       </w:r>
       <w:proofErr w:type="spellStart"/>
       <w:r>
@@ -6303,6 +6844,58 @@
           <w:rFonts w:ascii="Arial" w:hAnsi="Arial" w:cs="Arial"/>
           <w:sz w:val="20"/>
           <w:szCs w:val="20"/>
+          <w:lang w:val="fr-FR"/>
+        </w:rPr>
+        <w:t>filter</w:t>
+      </w:r>
+      <w:proofErr w:type="spellEnd"/>
+      <w:r>
+        <w:rPr>
+          <w:rFonts w:ascii="Arial" w:hAnsi="Arial" w:cs="Arial"/>
+          <w:sz w:val="20"/>
+          <w:szCs w:val="20"/>
+          <w:lang w:val="fr-FR"/>
+        </w:rPr>
+        <w:t xml:space="preserve"> </w:t>
+      </w:r>
+      <w:proofErr w:type="spellStart"/>
+      <w:proofErr w:type="gramStart"/>
+      <w:r>
+        <w:rPr>
+          <w:rFonts w:ascii="Arial" w:hAnsi="Arial" w:cs="Arial"/>
+          <w:sz w:val="20"/>
+          <w:szCs w:val="20"/>
+          <w:lang w:val="fr-FR"/>
+        </w:rPr>
+        <w:t>name</w:t>
+      </w:r>
+      <w:proofErr w:type="spellEnd"/>
+      <w:r>
+        <w:rPr>
+          <w:rFonts w:ascii="Arial" w:hAnsi="Arial" w:cs="Arial"/>
+          <w:sz w:val="20"/>
+          <w:szCs w:val="20"/>
+          <w:lang w:val="fr-FR"/>
+        </w:rPr>
+        <w:t>:</w:t>
+      </w:r>
+      <w:proofErr w:type="gramEnd"/>
+      <w:r>
+        <w:rPr>
+          <w:rFonts w:ascii="Arial" w:hAnsi="Arial" w:cs="Arial"/>
+          <w:sz w:val="20"/>
+          <w:szCs w:val="20"/>
+          <w:lang w:val="fr-FR"/>
+        </w:rPr>
+        <w:t xml:space="preserve"> “C”, “R”, “B”, “V”, </w:t>
+      </w:r>
+      <w:proofErr w:type="spellStart"/>
+      <w:r>
+        <w:rPr>
+          <w:rFonts w:ascii="Arial" w:hAnsi="Arial" w:cs="Arial"/>
+          <w:sz w:val="20"/>
+          <w:szCs w:val="20"/>
+          <w:lang w:val="fr-FR"/>
         </w:rPr>
         <w:t>etc</w:t>
       </w:r>
@@ -6319,6 +6912,7 @@
           <w:rFonts w:ascii="Arial" w:hAnsi="Arial" w:cs="Arial"/>
           <w:sz w:val="20"/>
           <w:szCs w:val="20"/>
+          <w:lang w:val="fr-FR"/>
         </w:rPr>
       </w:pPr>
     </w:p>
@@ -6333,16 +6927,20 @@
           <w:rFonts w:ascii="Arial" w:hAnsi="Arial" w:cs="Arial"/>
           <w:sz w:val="20"/>
           <w:szCs w:val="20"/>
-        </w:rPr>
-      </w:pPr>
-      <w:r>
-        <w:rPr>
-          <w:rFonts w:ascii="Arial" w:hAnsi="Arial" w:cs="Arial"/>
-          <w:sz w:val="20"/>
-          <w:szCs w:val="20"/>
+          <w:lang w:val="fr-FR"/>
+        </w:rPr>
+      </w:pPr>
+      <w:proofErr w:type="spellStart"/>
+      <w:r>
+        <w:rPr>
+          <w:rFonts w:ascii="Arial" w:hAnsi="Arial" w:cs="Arial"/>
+          <w:sz w:val="20"/>
+          <w:szCs w:val="20"/>
+          <w:lang w:val="fr-FR"/>
         </w:rPr>
         <w:t>Examples</w:t>
       </w:r>
+      <w:proofErr w:type="spellEnd"/>
     </w:p>
     <w:p>
       <w:pPr>
@@ -6355,6 +6953,7 @@
           <w:rFonts w:ascii="Arial" w:hAnsi="Arial" w:cs="Arial"/>
           <w:sz w:val="20"/>
           <w:szCs w:val="20"/>
+          <w:lang w:val="fr-FR"/>
         </w:rPr>
       </w:pPr>
     </w:p>
@@ -6369,13 +6968,15 @@
           <w:rFonts w:ascii="Arial" w:hAnsi="Arial" w:cs="Arial"/>
           <w:sz w:val="20"/>
           <w:szCs w:val="20"/>
-        </w:rPr>
-      </w:pPr>
-      <w:r>
-        <w:rPr>
-          <w:rFonts w:ascii="Arial" w:hAnsi="Arial" w:cs="Arial"/>
-          <w:sz w:val="20"/>
-          <w:szCs w:val="20"/>
+          <w:lang w:val="fr-FR"/>
+        </w:rPr>
+      </w:pPr>
+      <w:r>
+        <w:rPr>
+          <w:rFonts w:ascii="Arial" w:hAnsi="Arial" w:cs="Arial"/>
+          <w:sz w:val="20"/>
+          <w:szCs w:val="20"/>
+          <w:lang w:val="fr-FR"/>
         </w:rPr>
         <w:t>“B1x1_T-20.2_E35.00_FC”</w:t>
       </w:r>
@@ -6520,7 +7121,7 @@
                     <pic:cNvPicPr/>
                   </pic:nvPicPr>
                   <pic:blipFill>
-                    <a:blip r:embed="rId15">
+                    <a:blip r:embed="rId13">
                       <a:extLst>
                         <a:ext uri="{28A0092B-C50C-407E-A947-70E740481C1C}">
                           <a14:useLocalDpi xmlns:a14="http://schemas.microsoft.com/office/drawing/2010/main" val="0"/>
@@ -6643,6 +7244,7 @@
         <w:t xml:space="preserve"> configuration file to accept the libraries.  </w:t>
       </w:r>
       <w:proofErr w:type="spellStart"/>
+      <w:proofErr w:type="gramStart"/>
       <w:r>
         <w:rPr>
           <w:rFonts w:ascii="Arial" w:hAnsi="Arial" w:cs="Arial"/>
@@ -6652,6 +7254,7 @@
         <w:t>TheSky</w:t>
       </w:r>
       <w:proofErr w:type="spellEnd"/>
+      <w:proofErr w:type="gramEnd"/>
       <w:r>
         <w:rPr>
           <w:rFonts w:ascii="Arial" w:hAnsi="Arial" w:cs="Arial"/>
@@ -6703,8 +7306,8 @@
       </w:pPr>
     </w:p>
     <w:sectPr>
-      <w:headerReference w:type="default" r:id="rId16"/>
-      <w:footerReference w:type="default" r:id="rId17"/>
+      <w:headerReference w:type="default" r:id="rId14"/>
+      <w:footerReference w:type="default" r:id="rId15"/>
       <w:pgSz w:w="12240" w:h="15840" w:code="1"/>
       <w:pgMar w:top="1440" w:right="720" w:bottom="720" w:left="720" w:header="720" w:footer="720" w:gutter="0"/>
       <w:cols w:space="720"/>
@@ -6715,7 +7318,7 @@
 </file>
 
 <file path=word/endnotes.xml><?xml version="1.0" encoding="utf-8"?>
-<w:endnotes xmlns:wpc="http://schemas.microsoft.com/office/word/2010/wordprocessingCanvas" xmlns:cx="http://schemas.microsoft.com/office/drawing/2014/chartex" xmlns:cx1="http://schemas.microsoft.com/office/drawing/2015/9/8/chartex" xmlns:cx2="http://schemas.microsoft.com/office/drawing/2015/10/21/chartex" xmlns:cx3="http://schemas.microsoft.com/office/drawing/2016/5/9/chartex" xmlns:cx4="http://schemas.microsoft.com/office/drawing/2016/5/10/chartex" xmlns:cx5="http://schemas.microsoft.com/office/drawing/2016/5/11/chartex" xmlns:cx6="http://schemas.microsoft.com/office/drawing/2016/5/12/chartex" xmlns:cx7="http://schemas.microsoft.com/office/drawing/2016/5/13/chartex" xmlns:cx8="http://schemas.microsoft.com/office/drawing/2016/5/14/chartex" xmlns:mc="http://schemas.openxmlformats.org/markup-compatibility/2006" xmlns:aink="http://schemas.microsoft.com/office/drawing/2016/ink" xmlns:am3d="http://schemas.microsoft.com/office/drawing/2017/model3d" xmlns:o="urn:schemas-microsoft-com:office:office" xmlns:r="http://schemas.openxmlformats.org/officeDocument/2006/relationships" xmlns:m="http://schemas.openxmlformats.org/officeDocument/2006/math" xmlns:v="urn:schemas-microsoft-com:vml" xmlns:wp14="http://schemas.microsoft.com/office/word/2010/wordprocessingDrawing" xmlns:wp="http://schemas.openxmlformats.org/drawingml/2006/wordprocessingDrawing" xmlns:w10="urn:schemas-microsoft-com:office:word" xmlns:w="http://schemas.openxmlformats.org/wordprocessingml/2006/main" xmlns:w14="http://schemas.microsoft.com/office/word/2010/wordml" xmlns:w15="http://schemas.microsoft.com/office/word/2012/wordml" xmlns:w16cex="http://schemas.microsoft.com/office/word/2018/wordml/cex" xmlns:w16cid="http://schemas.microsoft.com/office/word/2016/wordml/cid" xmlns:w16="http://schemas.microsoft.com/office/word/2018/wordml" xmlns:w16sdtdh="http://schemas.microsoft.com/office/word/2020/wordml/sdtdatahash" xmlns:w16se="http://schemas.microsoft.com/office/word/2015/wordml/symex" xmlns:wpg="http://schemas.microsoft.com/office/word/2010/wordprocessingGroup" xmlns:wpi="http://schemas.microsoft.com/office/word/2010/wordprocessingInk" xmlns:wne="http://schemas.microsoft.com/office/word/2006/wordml" xmlns:wps="http://schemas.microsoft.com/office/word/2010/wordprocessingShape" mc:Ignorable="w14 w15 w16se w16cid w16 w16cex w16sdtdh wp14">
+<w:endnotes xmlns:wpc="http://schemas.microsoft.com/office/word/2010/wordprocessingCanvas" xmlns:cx="http://schemas.microsoft.com/office/drawing/2014/chartex" xmlns:cx1="http://schemas.microsoft.com/office/drawing/2015/9/8/chartex" xmlns:cx2="http://schemas.microsoft.com/office/drawing/2015/10/21/chartex" xmlns:cx3="http://schemas.microsoft.com/office/drawing/2016/5/9/chartex" xmlns:cx4="http://schemas.microsoft.com/office/drawing/2016/5/10/chartex" xmlns:cx5="http://schemas.microsoft.com/office/drawing/2016/5/11/chartex" xmlns:cx6="http://schemas.microsoft.com/office/drawing/2016/5/12/chartex" xmlns:cx7="http://schemas.microsoft.com/office/drawing/2016/5/13/chartex" xmlns:cx8="http://schemas.microsoft.com/office/drawing/2016/5/14/chartex" xmlns:mc="http://schemas.openxmlformats.org/markup-compatibility/2006" xmlns:aink="http://schemas.microsoft.com/office/drawing/2016/ink" xmlns:am3d="http://schemas.microsoft.com/office/drawing/2017/model3d" xmlns:o="urn:schemas-microsoft-com:office:office" xmlns:oel="http://schemas.microsoft.com/office/2019/extlst" xmlns:r="http://schemas.openxmlformats.org/officeDocument/2006/relationships" xmlns:m="http://schemas.openxmlformats.org/officeDocument/2006/math" xmlns:v="urn:schemas-microsoft-com:vml" xmlns:wp14="http://schemas.microsoft.com/office/word/2010/wordprocessingDrawing" xmlns:wp="http://schemas.openxmlformats.org/drawingml/2006/wordprocessingDrawing" xmlns:w10="urn:schemas-microsoft-com:office:word" xmlns:w="http://schemas.openxmlformats.org/wordprocessingml/2006/main" xmlns:w14="http://schemas.microsoft.com/office/word/2010/wordml" xmlns:w15="http://schemas.microsoft.com/office/word/2012/wordml" xmlns:w16cex="http://schemas.microsoft.com/office/word/2018/wordml/cex" xmlns:w16cid="http://schemas.microsoft.com/office/word/2016/wordml/cid" xmlns:w16="http://schemas.microsoft.com/office/word/2018/wordml" xmlns:w16du="http://schemas.microsoft.com/office/word/2023/wordml/word16du" xmlns:w16sdtdh="http://schemas.microsoft.com/office/word/2020/wordml/sdtdatahash" xmlns:w16sdtfl="http://schemas.microsoft.com/office/word/2024/wordml/sdtformatlock" xmlns:w16se="http://schemas.microsoft.com/office/word/2015/wordml/symex" xmlns:wpg="http://schemas.microsoft.com/office/word/2010/wordprocessingGroup" xmlns:wpi="http://schemas.microsoft.com/office/word/2010/wordprocessingInk" xmlns:wne="http://schemas.microsoft.com/office/word/2006/wordml" xmlns:wps="http://schemas.microsoft.com/office/word/2010/wordprocessingShape" mc:Ignorable="w14 w15 w16se w16cid w16 w16cex w16sdtdh w16sdtfl w16du wp14">
   <w:endnote w:type="separator" w:id="-1">
     <w:p>
       <w:pPr>
@@ -6747,7 +7350,7 @@
 </file>
 
 <file path=word/footer1.xml><?xml version="1.0" encoding="utf-8"?>
-<w:ftr xmlns:wpc="http://schemas.microsoft.com/office/word/2010/wordprocessingCanvas" xmlns:cx="http://schemas.microsoft.com/office/drawing/2014/chartex" xmlns:cx1="http://schemas.microsoft.com/office/drawing/2015/9/8/chartex" xmlns:cx2="http://schemas.microsoft.com/office/drawing/2015/10/21/chartex" xmlns:cx3="http://schemas.microsoft.com/office/drawing/2016/5/9/chartex" xmlns:cx4="http://schemas.microsoft.com/office/drawing/2016/5/10/chartex" xmlns:cx5="http://schemas.microsoft.com/office/drawing/2016/5/11/chartex" xmlns:cx6="http://schemas.microsoft.com/office/drawing/2016/5/12/chartex" xmlns:cx7="http://schemas.microsoft.com/office/drawing/2016/5/13/chartex" xmlns:cx8="http://schemas.microsoft.com/office/drawing/2016/5/14/chartex" xmlns:mc="http://schemas.openxmlformats.org/markup-compatibility/2006" xmlns:aink="http://schemas.microsoft.com/office/drawing/2016/ink" xmlns:am3d="http://schemas.microsoft.com/office/drawing/2017/model3d" xmlns:o="urn:schemas-microsoft-com:office:office" xmlns:r="http://schemas.openxmlformats.org/officeDocument/2006/relationships" xmlns:m="http://schemas.openxmlformats.org/officeDocument/2006/math" xmlns:v="urn:schemas-microsoft-com:vml" xmlns:wp14="http://schemas.microsoft.com/office/word/2010/wordprocessingDrawing" xmlns:wp="http://schemas.openxmlformats.org/drawingml/2006/wordprocessingDrawing" xmlns:w10="urn:schemas-microsoft-com:office:word" xmlns:w="http://schemas.openxmlformats.org/wordprocessingml/2006/main" xmlns:w14="http://schemas.microsoft.com/office/word/2010/wordml" xmlns:w15="http://schemas.microsoft.com/office/word/2012/wordml" xmlns:w16cex="http://schemas.microsoft.com/office/word/2018/wordml/cex" xmlns:w16cid="http://schemas.microsoft.com/office/word/2016/wordml/cid" xmlns:w16="http://schemas.microsoft.com/office/word/2018/wordml" xmlns:w16sdtdh="http://schemas.microsoft.com/office/word/2020/wordml/sdtdatahash" xmlns:w16se="http://schemas.microsoft.com/office/word/2015/wordml/symex" xmlns:wpg="http://schemas.microsoft.com/office/word/2010/wordprocessingGroup" xmlns:wpi="http://schemas.microsoft.com/office/word/2010/wordprocessingInk" xmlns:wne="http://schemas.microsoft.com/office/word/2006/wordml" xmlns:wps="http://schemas.microsoft.com/office/word/2010/wordprocessingShape" mc:Ignorable="w14 w15 w16se w16cid w16 w16cex w16sdtdh wp14">
+<w:ftr xmlns:wpc="http://schemas.microsoft.com/office/word/2010/wordprocessingCanvas" xmlns:cx="http://schemas.microsoft.com/office/drawing/2014/chartex" xmlns:cx1="http://schemas.microsoft.com/office/drawing/2015/9/8/chartex" xmlns:cx2="http://schemas.microsoft.com/office/drawing/2015/10/21/chartex" xmlns:cx3="http://schemas.microsoft.com/office/drawing/2016/5/9/chartex" xmlns:cx4="http://schemas.microsoft.com/office/drawing/2016/5/10/chartex" xmlns:cx5="http://schemas.microsoft.com/office/drawing/2016/5/11/chartex" xmlns:cx6="http://schemas.microsoft.com/office/drawing/2016/5/12/chartex" xmlns:cx7="http://schemas.microsoft.com/office/drawing/2016/5/13/chartex" xmlns:cx8="http://schemas.microsoft.com/office/drawing/2016/5/14/chartex" xmlns:mc="http://schemas.openxmlformats.org/markup-compatibility/2006" xmlns:aink="http://schemas.microsoft.com/office/drawing/2016/ink" xmlns:am3d="http://schemas.microsoft.com/office/drawing/2017/model3d" xmlns:o="urn:schemas-microsoft-com:office:office" xmlns:oel="http://schemas.microsoft.com/office/2019/extlst" xmlns:r="http://schemas.openxmlformats.org/officeDocument/2006/relationships" xmlns:m="http://schemas.openxmlformats.org/officeDocument/2006/math" xmlns:v="urn:schemas-microsoft-com:vml" xmlns:wp14="http://schemas.microsoft.com/office/word/2010/wordprocessingDrawing" xmlns:wp="http://schemas.openxmlformats.org/drawingml/2006/wordprocessingDrawing" xmlns:w10="urn:schemas-microsoft-com:office:word" xmlns:w="http://schemas.openxmlformats.org/wordprocessingml/2006/main" xmlns:w14="http://schemas.microsoft.com/office/word/2010/wordml" xmlns:w15="http://schemas.microsoft.com/office/word/2012/wordml" xmlns:w16cex="http://schemas.microsoft.com/office/word/2018/wordml/cex" xmlns:w16cid="http://schemas.microsoft.com/office/word/2016/wordml/cid" xmlns:w16="http://schemas.microsoft.com/office/word/2018/wordml" xmlns:w16du="http://schemas.microsoft.com/office/word/2023/wordml/word16du" xmlns:w16sdtdh="http://schemas.microsoft.com/office/word/2020/wordml/sdtdatahash" xmlns:w16sdtfl="http://schemas.microsoft.com/office/word/2024/wordml/sdtformatlock" xmlns:w16se="http://schemas.microsoft.com/office/word/2015/wordml/symex" xmlns:wpg="http://schemas.microsoft.com/office/word/2010/wordprocessingGroup" xmlns:wpi="http://schemas.microsoft.com/office/word/2010/wordprocessingInk" xmlns:wne="http://schemas.microsoft.com/office/word/2006/wordml" xmlns:wps="http://schemas.microsoft.com/office/word/2010/wordprocessingShape" mc:Ignorable="w14 w15 w16se w16cid w16 w16cex w16sdtdh w16sdtfl w16du wp14">
   <w:p>
     <w:pPr>
       <w:pStyle w:val="Footer"/>
@@ -6810,7 +7413,7 @@
 </file>
 
 <file path=word/footnotes.xml><?xml version="1.0" encoding="utf-8"?>
-<w:footnotes xmlns:wpc="http://schemas.microsoft.com/office/word/2010/wordprocessingCanvas" xmlns:cx="http://schemas.microsoft.com/office/drawing/2014/chartex" xmlns:cx1="http://schemas.microsoft.com/office/drawing/2015/9/8/chartex" xmlns:cx2="http://schemas.microsoft.com/office/drawing/2015/10/21/chartex" xmlns:cx3="http://schemas.microsoft.com/office/drawing/2016/5/9/chartex" xmlns:cx4="http://schemas.microsoft.com/office/drawing/2016/5/10/chartex" xmlns:cx5="http://schemas.microsoft.com/office/drawing/2016/5/11/chartex" xmlns:cx6="http://schemas.microsoft.com/office/drawing/2016/5/12/chartex" xmlns:cx7="http://schemas.microsoft.com/office/drawing/2016/5/13/chartex" xmlns:cx8="http://schemas.microsoft.com/office/drawing/2016/5/14/chartex" xmlns:mc="http://schemas.openxmlformats.org/markup-compatibility/2006" xmlns:aink="http://schemas.microsoft.com/office/drawing/2016/ink" xmlns:am3d="http://schemas.microsoft.com/office/drawing/2017/model3d" xmlns:o="urn:schemas-microsoft-com:office:office" xmlns:r="http://schemas.openxmlformats.org/officeDocument/2006/relationships" xmlns:m="http://schemas.openxmlformats.org/officeDocument/2006/math" xmlns:v="urn:schemas-microsoft-com:vml" xmlns:wp14="http://schemas.microsoft.com/office/word/2010/wordprocessingDrawing" xmlns:wp="http://schemas.openxmlformats.org/drawingml/2006/wordprocessingDrawing" xmlns:w10="urn:schemas-microsoft-com:office:word" xmlns:w="http://schemas.openxmlformats.org/wordprocessingml/2006/main" xmlns:w14="http://schemas.microsoft.com/office/word/2010/wordml" xmlns:w15="http://schemas.microsoft.com/office/word/2012/wordml" xmlns:w16cex="http://schemas.microsoft.com/office/word/2018/wordml/cex" xmlns:w16cid="http://schemas.microsoft.com/office/word/2016/wordml/cid" xmlns:w16="http://schemas.microsoft.com/office/word/2018/wordml" xmlns:w16sdtdh="http://schemas.microsoft.com/office/word/2020/wordml/sdtdatahash" xmlns:w16se="http://schemas.microsoft.com/office/word/2015/wordml/symex" xmlns:wpg="http://schemas.microsoft.com/office/word/2010/wordprocessingGroup" xmlns:wpi="http://schemas.microsoft.com/office/word/2010/wordprocessingInk" xmlns:wne="http://schemas.microsoft.com/office/word/2006/wordml" xmlns:wps="http://schemas.microsoft.com/office/word/2010/wordprocessingShape" mc:Ignorable="w14 w15 w16se w16cid w16 w16cex w16sdtdh wp14">
+<w:footnotes xmlns:wpc="http://schemas.microsoft.com/office/word/2010/wordprocessingCanvas" xmlns:cx="http://schemas.microsoft.com/office/drawing/2014/chartex" xmlns:cx1="http://schemas.microsoft.com/office/drawing/2015/9/8/chartex" xmlns:cx2="http://schemas.microsoft.com/office/drawing/2015/10/21/chartex" xmlns:cx3="http://schemas.microsoft.com/office/drawing/2016/5/9/chartex" xmlns:cx4="http://schemas.microsoft.com/office/drawing/2016/5/10/chartex" xmlns:cx5="http://schemas.microsoft.com/office/drawing/2016/5/11/chartex" xmlns:cx6="http://schemas.microsoft.com/office/drawing/2016/5/12/chartex" xmlns:cx7="http://schemas.microsoft.com/office/drawing/2016/5/13/chartex" xmlns:cx8="http://schemas.microsoft.com/office/drawing/2016/5/14/chartex" xmlns:mc="http://schemas.openxmlformats.org/markup-compatibility/2006" xmlns:aink="http://schemas.microsoft.com/office/drawing/2016/ink" xmlns:am3d="http://schemas.microsoft.com/office/drawing/2017/model3d" xmlns:o="urn:schemas-microsoft-com:office:office" xmlns:oel="http://schemas.microsoft.com/office/2019/extlst" xmlns:r="http://schemas.openxmlformats.org/officeDocument/2006/relationships" xmlns:m="http://schemas.openxmlformats.org/officeDocument/2006/math" xmlns:v="urn:schemas-microsoft-com:vml" xmlns:wp14="http://schemas.microsoft.com/office/word/2010/wordprocessingDrawing" xmlns:wp="http://schemas.openxmlformats.org/drawingml/2006/wordprocessingDrawing" xmlns:w10="urn:schemas-microsoft-com:office:word" xmlns:w="http://schemas.openxmlformats.org/wordprocessingml/2006/main" xmlns:w14="http://schemas.microsoft.com/office/word/2010/wordml" xmlns:w15="http://schemas.microsoft.com/office/word/2012/wordml" xmlns:w16cex="http://schemas.microsoft.com/office/word/2018/wordml/cex" xmlns:w16cid="http://schemas.microsoft.com/office/word/2016/wordml/cid" xmlns:w16="http://schemas.microsoft.com/office/word/2018/wordml" xmlns:w16du="http://schemas.microsoft.com/office/word/2023/wordml/word16du" xmlns:w16sdtdh="http://schemas.microsoft.com/office/word/2020/wordml/sdtdatahash" xmlns:w16sdtfl="http://schemas.microsoft.com/office/word/2024/wordml/sdtformatlock" xmlns:w16se="http://schemas.microsoft.com/office/word/2015/wordml/symex" xmlns:wpg="http://schemas.microsoft.com/office/word/2010/wordprocessingGroup" xmlns:wpi="http://schemas.microsoft.com/office/word/2010/wordprocessingInk" xmlns:wne="http://schemas.microsoft.com/office/word/2006/wordml" xmlns:wps="http://schemas.microsoft.com/office/word/2010/wordprocessingShape" mc:Ignorable="w14 w15 w16se w16cid w16 w16cex w16sdtdh w16sdtfl w16du wp14">
   <w:footnote w:type="separator" w:id="-1">
     <w:p>
       <w:pPr>
@@ -6842,42 +7445,78 @@
 </file>
 
 <file path=word/header1.xml><?xml version="1.0" encoding="utf-8"?>
-<w:hdr xmlns:wpc="http://schemas.microsoft.com/office/word/2010/wordprocessingCanvas" xmlns:cx="http://schemas.microsoft.com/office/drawing/2014/chartex" xmlns:cx1="http://schemas.microsoft.com/office/drawing/2015/9/8/chartex" xmlns:cx2="http://schemas.microsoft.com/office/drawing/2015/10/21/chartex" xmlns:cx3="http://schemas.microsoft.com/office/drawing/2016/5/9/chartex" xmlns:cx4="http://schemas.microsoft.com/office/drawing/2016/5/10/chartex" xmlns:cx5="http://schemas.microsoft.com/office/drawing/2016/5/11/chartex" xmlns:cx6="http://schemas.microsoft.com/office/drawing/2016/5/12/chartex" xmlns:cx7="http://schemas.microsoft.com/office/drawing/2016/5/13/chartex" xmlns:cx8="http://schemas.microsoft.com/office/drawing/2016/5/14/chartex" xmlns:mc="http://schemas.openxmlformats.org/markup-compatibility/2006" xmlns:aink="http://schemas.microsoft.com/office/drawing/2016/ink" xmlns:am3d="http://schemas.microsoft.com/office/drawing/2017/model3d" xmlns:o="urn:schemas-microsoft-com:office:office" xmlns:r="http://schemas.openxmlformats.org/officeDocument/2006/relationships" xmlns:m="http://schemas.openxmlformats.org/officeDocument/2006/math" xmlns:v="urn:schemas-microsoft-com:vml" xmlns:wp14="http://schemas.microsoft.com/office/word/2010/wordprocessingDrawing" xmlns:wp="http://schemas.openxmlformats.org/drawingml/2006/wordprocessingDrawing" xmlns:w10="urn:schemas-microsoft-com:office:word" xmlns:w="http://schemas.openxmlformats.org/wordprocessingml/2006/main" xmlns:w14="http://schemas.microsoft.com/office/word/2010/wordml" xmlns:w15="http://schemas.microsoft.com/office/word/2012/wordml" xmlns:w16cex="http://schemas.microsoft.com/office/word/2018/wordml/cex" xmlns:w16cid="http://schemas.microsoft.com/office/word/2016/wordml/cid" xmlns:w16="http://schemas.microsoft.com/office/word/2018/wordml" xmlns:w16sdtdh="http://schemas.microsoft.com/office/word/2020/wordml/sdtdatahash" xmlns:w16se="http://schemas.microsoft.com/office/word/2015/wordml/symex" xmlns:wpg="http://schemas.microsoft.com/office/word/2010/wordprocessingGroup" xmlns:wpi="http://schemas.microsoft.com/office/word/2010/wordprocessingInk" xmlns:wne="http://schemas.microsoft.com/office/word/2006/wordml" xmlns:wps="http://schemas.microsoft.com/office/word/2010/wordprocessingShape" mc:Ignorable="w14 w15 w16se w16cid w16 w16cex w16sdtdh wp14">
+<w:hdr xmlns:wpc="http://schemas.microsoft.com/office/word/2010/wordprocessingCanvas" xmlns:cx="http://schemas.microsoft.com/office/drawing/2014/chartex" xmlns:cx1="http://schemas.microsoft.com/office/drawing/2015/9/8/chartex" xmlns:cx2="http://schemas.microsoft.com/office/drawing/2015/10/21/chartex" xmlns:cx3="http://schemas.microsoft.com/office/drawing/2016/5/9/chartex" xmlns:cx4="http://schemas.microsoft.com/office/drawing/2016/5/10/chartex" xmlns:cx5="http://schemas.microsoft.com/office/drawing/2016/5/11/chartex" xmlns:cx6="http://schemas.microsoft.com/office/drawing/2016/5/12/chartex" xmlns:cx7="http://schemas.microsoft.com/office/drawing/2016/5/13/chartex" xmlns:cx8="http://schemas.microsoft.com/office/drawing/2016/5/14/chartex" xmlns:mc="http://schemas.openxmlformats.org/markup-compatibility/2006" xmlns:aink="http://schemas.microsoft.com/office/drawing/2016/ink" xmlns:am3d="http://schemas.microsoft.com/office/drawing/2017/model3d" xmlns:o="urn:schemas-microsoft-com:office:office" xmlns:oel="http://schemas.microsoft.com/office/2019/extlst" xmlns:r="http://schemas.openxmlformats.org/officeDocument/2006/relationships" xmlns:m="http://schemas.openxmlformats.org/officeDocument/2006/math" xmlns:v="urn:schemas-microsoft-com:vml" xmlns:wp14="http://schemas.microsoft.com/office/word/2010/wordprocessingDrawing" xmlns:wp="http://schemas.openxmlformats.org/drawingml/2006/wordprocessingDrawing" xmlns:w10="urn:schemas-microsoft-com:office:word" xmlns:w="http://schemas.openxmlformats.org/wordprocessingml/2006/main" xmlns:w14="http://schemas.microsoft.com/office/word/2010/wordml" xmlns:w15="http://schemas.microsoft.com/office/word/2012/wordml" xmlns:w16cex="http://schemas.microsoft.com/office/word/2018/wordml/cex" xmlns:w16cid="http://schemas.microsoft.com/office/word/2016/wordml/cid" xmlns:w16="http://schemas.microsoft.com/office/word/2018/wordml" xmlns:w16du="http://schemas.microsoft.com/office/word/2023/wordml/word16du" xmlns:w16sdtdh="http://schemas.microsoft.com/office/word/2020/wordml/sdtdatahash" xmlns:w16sdtfl="http://schemas.microsoft.com/office/word/2024/wordml/sdtformatlock" xmlns:w16se="http://schemas.microsoft.com/office/word/2015/wordml/symex" xmlns:wpg="http://schemas.microsoft.com/office/word/2010/wordprocessingGroup" xmlns:wpi="http://schemas.microsoft.com/office/word/2010/wordprocessingInk" xmlns:wne="http://schemas.microsoft.com/office/word/2006/wordml" xmlns:wps="http://schemas.microsoft.com/office/word/2010/wordprocessingShape" mc:Ignorable="w14 w15 w16se w16cid w16 w16cex w16sdtdh w16sdtfl w16du wp14">
   <w:p>
     <w:pPr>
       <w:pStyle w:val="Header"/>
+      <w:rPr>
+        <w:lang w:val="fr-FR"/>
+      </w:rPr>
     </w:pPr>
     <w:r>
+      <w:rPr>
+        <w:lang w:val="fr-FR"/>
+      </w:rPr>
       <w:t>Hot Pursuit</w:t>
     </w:r>
     <w:r>
+      <w:rPr>
+        <w:lang w:val="fr-FR"/>
+      </w:rPr>
       <w:t xml:space="preserve"> </w:t>
     </w:r>
     <w:r>
+      <w:rPr>
+        <w:lang w:val="fr-FR"/>
+      </w:rPr>
       <w:t xml:space="preserve">Ver </w:t>
     </w:r>
     <w:r>
+      <w:rPr>
+        <w:lang w:val="fr-FR"/>
+      </w:rPr>
       <w:t>1.0</w:t>
     </w:r>
     <w:r>
+      <w:rPr>
+        <w:lang w:val="fr-FR"/>
+      </w:rPr>
       <w:t>.0</w:t>
     </w:r>
     <w:r>
+      <w:rPr>
+        <w:lang w:val="fr-FR"/>
+      </w:rPr>
       <w:tab/>
     </w:r>
     <w:r>
+      <w:rPr>
+        <w:lang w:val="fr-FR"/>
+      </w:rPr>
       <w:tab/>
     </w:r>
     <w:r>
+      <w:rPr>
+        <w:lang w:val="fr-FR"/>
+      </w:rPr>
       <w:t xml:space="preserve">R. </w:t>
     </w:r>
     <w:r>
+      <w:rPr>
+        <w:lang w:val="fr-FR"/>
+      </w:rPr>
       <w:t xml:space="preserve">McAlister </w:t>
     </w:r>
     <w:r>
+      <w:rPr>
+        <w:lang w:val="fr-FR"/>
+      </w:rPr>
       <w:t>5/12</w:t>
     </w:r>
     <w:r>
+      <w:rPr>
+        <w:lang w:val="fr-FR"/>
+      </w:rPr>
       <w:t>/2021</w:t>
     </w:r>
   </w:p>
@@ -6885,7 +7524,7 @@
 </file>
 
 <file path=word/numbering.xml><?xml version="1.0" encoding="utf-8"?>
-<w:numbering xmlns:wpc="http://schemas.microsoft.com/office/word/2010/wordprocessingCanvas" xmlns:cx="http://schemas.microsoft.com/office/drawing/2014/chartex" xmlns:cx1="http://schemas.microsoft.com/office/drawing/2015/9/8/chartex" xmlns:cx2="http://schemas.microsoft.com/office/drawing/2015/10/21/chartex" xmlns:cx3="http://schemas.microsoft.com/office/drawing/2016/5/9/chartex" xmlns:cx4="http://schemas.microsoft.com/office/drawing/2016/5/10/chartex" xmlns:cx5="http://schemas.microsoft.com/office/drawing/2016/5/11/chartex" xmlns:cx6="http://schemas.microsoft.com/office/drawing/2016/5/12/chartex" xmlns:cx7="http://schemas.microsoft.com/office/drawing/2016/5/13/chartex" xmlns:cx8="http://schemas.microsoft.com/office/drawing/2016/5/14/chartex" xmlns:mc="http://schemas.openxmlformats.org/markup-compatibility/2006" xmlns:aink="http://schemas.microsoft.com/office/drawing/2016/ink" xmlns:am3d="http://schemas.microsoft.com/office/drawing/2017/model3d" xmlns:o="urn:schemas-microsoft-com:office:office" xmlns:r="http://schemas.openxmlformats.org/officeDocument/2006/relationships" xmlns:m="http://schemas.openxmlformats.org/officeDocument/2006/math" xmlns:v="urn:schemas-microsoft-com:vml" xmlns:wp14="http://schemas.microsoft.com/office/word/2010/wordprocessingDrawing" xmlns:wp="http://schemas.openxmlformats.org/drawingml/2006/wordprocessingDrawing" xmlns:w10="urn:schemas-microsoft-com:office:word" xmlns:w="http://schemas.openxmlformats.org/wordprocessingml/2006/main" xmlns:w14="http://schemas.microsoft.com/office/word/2010/wordml" xmlns:w15="http://schemas.microsoft.com/office/word/2012/wordml" xmlns:w16cex="http://schemas.microsoft.com/office/word/2018/wordml/cex" xmlns:w16cid="http://schemas.microsoft.com/office/word/2016/wordml/cid" xmlns:w16="http://schemas.microsoft.com/office/word/2018/wordml" xmlns:w16sdtdh="http://schemas.microsoft.com/office/word/2020/wordml/sdtdatahash" xmlns:w16se="http://schemas.microsoft.com/office/word/2015/wordml/symex" xmlns:wpg="http://schemas.microsoft.com/office/word/2010/wordprocessingGroup" xmlns:wpi="http://schemas.microsoft.com/office/word/2010/wordprocessingInk" xmlns:wne="http://schemas.microsoft.com/office/word/2006/wordml" xmlns:wps="http://schemas.microsoft.com/office/word/2010/wordprocessingShape" mc:Ignorable="w14 w15 w16se w16cid w16 w16cex w16sdtdh wp14">
+<w:numbering xmlns:wpc="http://schemas.microsoft.com/office/word/2010/wordprocessingCanvas" xmlns:cx="http://schemas.microsoft.com/office/drawing/2014/chartex" xmlns:cx1="http://schemas.microsoft.com/office/drawing/2015/9/8/chartex" xmlns:cx2="http://schemas.microsoft.com/office/drawing/2015/10/21/chartex" xmlns:cx3="http://schemas.microsoft.com/office/drawing/2016/5/9/chartex" xmlns:cx4="http://schemas.microsoft.com/office/drawing/2016/5/10/chartex" xmlns:cx5="http://schemas.microsoft.com/office/drawing/2016/5/11/chartex" xmlns:cx6="http://schemas.microsoft.com/office/drawing/2016/5/12/chartex" xmlns:cx7="http://schemas.microsoft.com/office/drawing/2016/5/13/chartex" xmlns:cx8="http://schemas.microsoft.com/office/drawing/2016/5/14/chartex" xmlns:mc="http://schemas.openxmlformats.org/markup-compatibility/2006" xmlns:aink="http://schemas.microsoft.com/office/drawing/2016/ink" xmlns:am3d="http://schemas.microsoft.com/office/drawing/2017/model3d" xmlns:o="urn:schemas-microsoft-com:office:office" xmlns:oel="http://schemas.microsoft.com/office/2019/extlst" xmlns:r="http://schemas.openxmlformats.org/officeDocument/2006/relationships" xmlns:m="http://schemas.openxmlformats.org/officeDocument/2006/math" xmlns:v="urn:schemas-microsoft-com:vml" xmlns:wp14="http://schemas.microsoft.com/office/word/2010/wordprocessingDrawing" xmlns:wp="http://schemas.openxmlformats.org/drawingml/2006/wordprocessingDrawing" xmlns:w10="urn:schemas-microsoft-com:office:word" xmlns:w="http://schemas.openxmlformats.org/wordprocessingml/2006/main" xmlns:w14="http://schemas.microsoft.com/office/word/2010/wordml" xmlns:w15="http://schemas.microsoft.com/office/word/2012/wordml" xmlns:w16cex="http://schemas.microsoft.com/office/word/2018/wordml/cex" xmlns:w16cid="http://schemas.microsoft.com/office/word/2016/wordml/cid" xmlns:w16="http://schemas.microsoft.com/office/word/2018/wordml" xmlns:w16du="http://schemas.microsoft.com/office/word/2023/wordml/word16du" xmlns:w16sdtdh="http://schemas.microsoft.com/office/word/2020/wordml/sdtdatahash" xmlns:w16sdtfl="http://schemas.microsoft.com/office/word/2024/wordml/sdtformatlock" xmlns:w16se="http://schemas.microsoft.com/office/word/2015/wordml/symex" xmlns:wpg="http://schemas.microsoft.com/office/word/2010/wordprocessingGroup" xmlns:wpi="http://schemas.microsoft.com/office/word/2010/wordprocessingInk" xmlns:wne="http://schemas.microsoft.com/office/word/2006/wordml" xmlns:wps="http://schemas.microsoft.com/office/word/2010/wordprocessingShape" mc:Ignorable="w14 w15 w16se w16cid w16 w16cex w16sdtdh w16sdtfl w16du wp14">
   <w:abstractNum w:abstractNumId="0" w15:restartNumberingAfterBreak="0">
     <w:nsid w:val="00A14B62"/>
     <w:multiLevelType w:val="hybridMultilevel"/>
@@ -10807,7 +11446,7 @@
 </file>
 
 <file path=word/styles.xml><?xml version="1.0" encoding="utf-8"?>
-<w:styles xmlns:mc="http://schemas.openxmlformats.org/markup-compatibility/2006" xmlns:r="http://schemas.openxmlformats.org/officeDocument/2006/relationships" xmlns:w="http://schemas.openxmlformats.org/wordprocessingml/2006/main" xmlns:w14="http://schemas.microsoft.com/office/word/2010/wordml" xmlns:w15="http://schemas.microsoft.com/office/word/2012/wordml" xmlns:w16cex="http://schemas.microsoft.com/office/word/2018/wordml/cex" xmlns:w16cid="http://schemas.microsoft.com/office/word/2016/wordml/cid" xmlns:w16="http://schemas.microsoft.com/office/word/2018/wordml" xmlns:w16sdtdh="http://schemas.microsoft.com/office/word/2020/wordml/sdtdatahash" xmlns:w16se="http://schemas.microsoft.com/office/word/2015/wordml/symex" mc:Ignorable="w14 w15 w16se w16cid w16 w16cex w16sdtdh">
+<w:styles xmlns:mc="http://schemas.openxmlformats.org/markup-compatibility/2006" xmlns:r="http://schemas.openxmlformats.org/officeDocument/2006/relationships" xmlns:w="http://schemas.openxmlformats.org/wordprocessingml/2006/main" xmlns:w14="http://schemas.microsoft.com/office/word/2010/wordml" xmlns:w15="http://schemas.microsoft.com/office/word/2012/wordml" xmlns:w16cex="http://schemas.microsoft.com/office/word/2018/wordml/cex" xmlns:w16cid="http://schemas.microsoft.com/office/word/2016/wordml/cid" xmlns:w16="http://schemas.microsoft.com/office/word/2018/wordml" xmlns:w16du="http://schemas.microsoft.com/office/word/2023/wordml/word16du" xmlns:w16sdtdh="http://schemas.microsoft.com/office/word/2020/wordml/sdtdatahash" xmlns:w16sdtfl="http://schemas.microsoft.com/office/word/2024/wordml/sdtformatlock" xmlns:w16se="http://schemas.microsoft.com/office/word/2015/wordml/symex" mc:Ignorable="w14 w15 w16se w16cid w16 w16cex w16sdtdh w16sdtfl w16du">
   <w:docDefaults>
     <w:rPrDefault>
       <w:rPr>

</xml_diff>